<commit_message>
created the buckets for dataflow,stsging
</commit_message>
<xml_diff>
--- a/steps.docx
+++ b/steps.docx
@@ -41,23 +41,13 @@
           <w:bCs/>
         </w:rPr>
       </w:pPr>
-      <w:proofErr w:type="spellStart"/>
-      <w:r>
-        <w:rPr>
-          <w:rFonts w:ascii="Times New Roman" w:hAnsi="Times New Roman" w:cs="Times New Roman"/>
-          <w:b/>
-          <w:bCs/>
-        </w:rPr>
-        <w:t>gcloud</w:t>
-      </w:r>
-      <w:proofErr w:type="spellEnd"/>
-      <w:r>
-        <w:rPr>
-          <w:rFonts w:ascii="Times New Roman" w:hAnsi="Times New Roman" w:cs="Times New Roman"/>
-          <w:b/>
-          <w:bCs/>
-        </w:rPr>
-        <w:t xml:space="preserve"> version</w:t>
+      <w:r>
+        <w:rPr>
+          <w:rFonts w:ascii="Times New Roman" w:hAnsi="Times New Roman" w:cs="Times New Roman"/>
+          <w:b/>
+          <w:bCs/>
+        </w:rPr>
+        <w:t>gcloud version</w:t>
       </w:r>
     </w:p>
     <w:p>
@@ -121,23 +111,13 @@
           <w:bCs/>
         </w:rPr>
       </w:pPr>
-      <w:proofErr w:type="spellStart"/>
-      <w:r>
-        <w:rPr>
-          <w:rFonts w:ascii="Times New Roman" w:hAnsi="Times New Roman" w:cs="Times New Roman"/>
-          <w:b/>
-          <w:bCs/>
-        </w:rPr>
-        <w:t>gcloud</w:t>
-      </w:r>
-      <w:proofErr w:type="spellEnd"/>
-      <w:r>
-        <w:rPr>
-          <w:rFonts w:ascii="Times New Roman" w:hAnsi="Times New Roman" w:cs="Times New Roman"/>
-          <w:b/>
-          <w:bCs/>
-        </w:rPr>
-        <w:t xml:space="preserve"> auth login</w:t>
+      <w:r>
+        <w:rPr>
+          <w:rFonts w:ascii="Times New Roman" w:hAnsi="Times New Roman" w:cs="Times New Roman"/>
+          <w:b/>
+          <w:bCs/>
+        </w:rPr>
+        <w:t>gcloud auth login</w:t>
       </w:r>
     </w:p>
     <w:p>
@@ -163,23 +143,13 @@
           <w:bCs/>
         </w:rPr>
       </w:pPr>
-      <w:proofErr w:type="spellStart"/>
-      <w:r>
-        <w:rPr>
-          <w:rFonts w:ascii="Times New Roman" w:hAnsi="Times New Roman" w:cs="Times New Roman"/>
-          <w:b/>
-          <w:bCs/>
-        </w:rPr>
-        <w:t>gcloud</w:t>
-      </w:r>
-      <w:proofErr w:type="spellEnd"/>
-      <w:r>
-        <w:rPr>
-          <w:rFonts w:ascii="Times New Roman" w:hAnsi="Times New Roman" w:cs="Times New Roman"/>
-          <w:b/>
-          <w:bCs/>
-        </w:rPr>
-        <w:t xml:space="preserve"> auth list</w:t>
+      <w:r>
+        <w:rPr>
+          <w:rFonts w:ascii="Times New Roman" w:hAnsi="Times New Roman" w:cs="Times New Roman"/>
+          <w:b/>
+          <w:bCs/>
+        </w:rPr>
+        <w:t>gcloud auth list</w:t>
       </w:r>
     </w:p>
     <w:p>
@@ -257,23 +227,13 @@
           <w:bCs/>
         </w:rPr>
       </w:pPr>
-      <w:proofErr w:type="spellStart"/>
-      <w:r>
-        <w:rPr>
-          <w:rFonts w:ascii="Times New Roman" w:hAnsi="Times New Roman" w:cs="Times New Roman"/>
-          <w:b/>
-          <w:bCs/>
-        </w:rPr>
-        <w:t>gcloud</w:t>
-      </w:r>
-      <w:proofErr w:type="spellEnd"/>
-      <w:r>
-        <w:rPr>
-          <w:rFonts w:ascii="Times New Roman" w:hAnsi="Times New Roman" w:cs="Times New Roman"/>
-          <w:b/>
-          <w:bCs/>
-        </w:rPr>
-        <w:t xml:space="preserve"> projects create $PROJECT_ID --name="Brazilian Ecommerce Pipeline"</w:t>
+      <w:r>
+        <w:rPr>
+          <w:rFonts w:ascii="Times New Roman" w:hAnsi="Times New Roman" w:cs="Times New Roman"/>
+          <w:b/>
+          <w:bCs/>
+        </w:rPr>
+        <w:t>gcloud projects create $PROJECT_ID --name="Brazilian Ecommerce Pipeline"</w:t>
       </w:r>
     </w:p>
     <w:p>
@@ -307,23 +267,13 @@
           <w:bCs/>
         </w:rPr>
       </w:pPr>
-      <w:proofErr w:type="spellStart"/>
-      <w:r>
-        <w:rPr>
-          <w:rFonts w:ascii="Times New Roman" w:hAnsi="Times New Roman" w:cs="Times New Roman"/>
-          <w:b/>
-          <w:bCs/>
-        </w:rPr>
-        <w:t>gcloud</w:t>
-      </w:r>
-      <w:proofErr w:type="spellEnd"/>
-      <w:r>
-        <w:rPr>
-          <w:rFonts w:ascii="Times New Roman" w:hAnsi="Times New Roman" w:cs="Times New Roman"/>
-          <w:b/>
-          <w:bCs/>
-        </w:rPr>
-        <w:t xml:space="preserve"> config set project $PROJECT_ID</w:t>
+      <w:r>
+        <w:rPr>
+          <w:rFonts w:ascii="Times New Roman" w:hAnsi="Times New Roman" w:cs="Times New Roman"/>
+          <w:b/>
+          <w:bCs/>
+        </w:rPr>
+        <w:t>gcloud config set project $PROJECT_ID</w:t>
       </w:r>
     </w:p>
     <w:p>
@@ -357,23 +307,13 @@
           <w:bCs/>
         </w:rPr>
       </w:pPr>
-      <w:proofErr w:type="spellStart"/>
-      <w:r>
-        <w:rPr>
-          <w:rFonts w:ascii="Times New Roman" w:hAnsi="Times New Roman" w:cs="Times New Roman"/>
-          <w:b/>
-          <w:bCs/>
-        </w:rPr>
-        <w:t>gcloud</w:t>
-      </w:r>
-      <w:proofErr w:type="spellEnd"/>
-      <w:r>
-        <w:rPr>
-          <w:rFonts w:ascii="Times New Roman" w:hAnsi="Times New Roman" w:cs="Times New Roman"/>
-          <w:b/>
-          <w:bCs/>
-        </w:rPr>
-        <w:t xml:space="preserve"> config get-value project</w:t>
+      <w:r>
+        <w:rPr>
+          <w:rFonts w:ascii="Times New Roman" w:hAnsi="Times New Roman" w:cs="Times New Roman"/>
+          <w:b/>
+          <w:bCs/>
+        </w:rPr>
+        <w:t>gcloud config get-value project</w:t>
       </w:r>
     </w:p>
     <w:p>
@@ -421,81 +361,53 @@
           <w:bCs/>
         </w:rPr>
       </w:pPr>
-      <w:proofErr w:type="spellStart"/>
-      <w:r>
-        <w:rPr>
-          <w:rFonts w:ascii="Times New Roman" w:hAnsi="Times New Roman" w:cs="Times New Roman"/>
-          <w:b/>
-          <w:bCs/>
-        </w:rPr>
-        <w:t>gcloud</w:t>
-      </w:r>
-      <w:proofErr w:type="spellEnd"/>
-      <w:r>
-        <w:rPr>
-          <w:rFonts w:ascii="Times New Roman" w:hAnsi="Times New Roman" w:cs="Times New Roman"/>
-          <w:b/>
-          <w:bCs/>
-        </w:rPr>
-        <w:t xml:space="preserve"> billing accounts list</w:t>
-      </w:r>
-    </w:p>
-    <w:p>
-      <w:pPr>
-        <w:spacing w:line="240" w:lineRule="auto"/>
-        <w:rPr>
-          <w:rFonts w:ascii="Times New Roman" w:hAnsi="Times New Roman" w:cs="Times New Roman"/>
-        </w:rPr>
-      </w:pPr>
-    </w:p>
-    <w:p>
-      <w:pPr>
-        <w:spacing w:line="240" w:lineRule="auto"/>
-        <w:rPr>
-          <w:rFonts w:ascii="Times New Roman" w:hAnsi="Times New Roman" w:cs="Times New Roman"/>
-        </w:rPr>
-      </w:pPr>
-      <w:r>
-        <w:rPr>
-          <w:rFonts w:ascii="Times New Roman" w:hAnsi="Times New Roman" w:cs="Times New Roman"/>
-        </w:rPr>
-        <w:t xml:space="preserve"># Link billing (replace BILLING_ACCOUNT_ID with your actual </w:t>
-      </w:r>
-      <w:proofErr w:type="gramStart"/>
-      <w:r>
-        <w:rPr>
-          <w:rFonts w:ascii="Times New Roman" w:hAnsi="Times New Roman" w:cs="Times New Roman"/>
-        </w:rPr>
-        <w:t>ID )</w:t>
-      </w:r>
-      <w:proofErr w:type="gramEnd"/>
-    </w:p>
-    <w:p>
-      <w:pPr>
-        <w:spacing w:line="240" w:lineRule="auto"/>
-        <w:rPr>
-          <w:rFonts w:ascii="Times New Roman" w:hAnsi="Times New Roman" w:cs="Times New Roman"/>
-          <w:b/>
-          <w:bCs/>
-        </w:rPr>
-      </w:pPr>
-      <w:proofErr w:type="spellStart"/>
-      <w:r>
-        <w:rPr>
-          <w:rFonts w:ascii="Times New Roman" w:hAnsi="Times New Roman" w:cs="Times New Roman"/>
-          <w:b/>
-          <w:bCs/>
-        </w:rPr>
-        <w:t>gcloud</w:t>
-      </w:r>
-      <w:proofErr w:type="spellEnd"/>
-      <w:r>
-        <w:rPr>
-          <w:rFonts w:ascii="Times New Roman" w:hAnsi="Times New Roman" w:cs="Times New Roman"/>
-          <w:b/>
-          <w:bCs/>
-        </w:rPr>
-        <w:t xml:space="preserve"> billing projects link $PROJECT_ID --billing-account=BILLING_ACCOUNT_ID</w:t>
+      <w:r>
+        <w:rPr>
+          <w:rFonts w:ascii="Times New Roman" w:hAnsi="Times New Roman" w:cs="Times New Roman"/>
+          <w:b/>
+          <w:bCs/>
+        </w:rPr>
+        <w:t>gcloud billing accounts list</w:t>
+      </w:r>
+    </w:p>
+    <w:p>
+      <w:pPr>
+        <w:spacing w:line="240" w:lineRule="auto"/>
+        <w:rPr>
+          <w:rFonts w:ascii="Times New Roman" w:hAnsi="Times New Roman" w:cs="Times New Roman"/>
+        </w:rPr>
+      </w:pPr>
+    </w:p>
+    <w:p>
+      <w:pPr>
+        <w:spacing w:line="240" w:lineRule="auto"/>
+        <w:rPr>
+          <w:rFonts w:ascii="Times New Roman" w:hAnsi="Times New Roman" w:cs="Times New Roman"/>
+        </w:rPr>
+      </w:pPr>
+      <w:r>
+        <w:rPr>
+          <w:rFonts w:ascii="Times New Roman" w:hAnsi="Times New Roman" w:cs="Times New Roman"/>
+        </w:rPr>
+        <w:t># Link billing (replace BILLING_ACCOUNT_ID with your actual ID )</w:t>
+      </w:r>
+    </w:p>
+    <w:p>
+      <w:pPr>
+        <w:spacing w:line="240" w:lineRule="auto"/>
+        <w:rPr>
+          <w:rFonts w:ascii="Times New Roman" w:hAnsi="Times New Roman" w:cs="Times New Roman"/>
+          <w:b/>
+          <w:bCs/>
+        </w:rPr>
+      </w:pPr>
+      <w:r>
+        <w:rPr>
+          <w:rFonts w:ascii="Times New Roman" w:hAnsi="Times New Roman" w:cs="Times New Roman"/>
+          <w:b/>
+          <w:bCs/>
+        </w:rPr>
+        <w:t>gcloud billing projects link $PROJECT_ID --billing-account=BILLING_ACCOUNT_ID</w:t>
       </w:r>
     </w:p>
     <w:p>
@@ -570,23 +482,13 @@
           <w:bCs/>
         </w:rPr>
       </w:pPr>
-      <w:proofErr w:type="spellStart"/>
-      <w:r>
-        <w:rPr>
-          <w:rFonts w:ascii="Times New Roman" w:hAnsi="Times New Roman" w:cs="Times New Roman"/>
-          <w:b/>
-          <w:bCs/>
-        </w:rPr>
-        <w:t>gcloud</w:t>
-      </w:r>
-      <w:proofErr w:type="spellEnd"/>
-      <w:r>
-        <w:rPr>
-          <w:rFonts w:ascii="Times New Roman" w:hAnsi="Times New Roman" w:cs="Times New Roman"/>
-          <w:b/>
-          <w:bCs/>
-        </w:rPr>
-        <w:t xml:space="preserve"> services enable \</w:t>
+      <w:r>
+        <w:rPr>
+          <w:rFonts w:ascii="Times New Roman" w:hAnsi="Times New Roman" w:cs="Times New Roman"/>
+          <w:b/>
+          <w:bCs/>
+        </w:rPr>
+        <w:t>gcloud services enable \</w:t>
       </w:r>
     </w:p>
     <w:p>
@@ -964,7 +866,7 @@
           <w:rFonts w:ascii="Times New Roman" w:hAnsi="Times New Roman" w:cs="Times New Roman"/>
         </w:rPr>
         <w:pict w14:anchorId="4E7A7475">
-          <v:rect id="_x0000_i1031" style="width:0;height:1.5pt" o:hralign="center" o:hrstd="t" o:hr="t" fillcolor="#a0a0a0" stroked="f"/>
+          <v:rect id="_x0000_i1025" style="width:0;height:1.5pt" o:hralign="center" o:hrstd="t" o:hr="t" fillcolor="#a0a0a0" stroked="f"/>
         </w:pict>
       </w:r>
     </w:p>
@@ -1143,19 +1045,11 @@
                 <w:rFonts w:ascii="Times New Roman" w:hAnsi="Times New Roman" w:cs="Times New Roman"/>
               </w:rPr>
             </w:pPr>
-            <w:proofErr w:type="spellStart"/>
             <w:r>
               <w:rPr>
                 <w:rFonts w:ascii="Times New Roman" w:hAnsi="Times New Roman" w:cs="Times New Roman"/>
               </w:rPr>
-              <w:t>BigQuery</w:t>
-            </w:r>
-            <w:proofErr w:type="spellEnd"/>
-            <w:r>
-              <w:rPr>
-                <w:rFonts w:ascii="Times New Roman" w:hAnsi="Times New Roman" w:cs="Times New Roman"/>
-              </w:rPr>
-              <w:t xml:space="preserve"> API</w:t>
+              <w:t>BigQuery API</w:t>
             </w:r>
           </w:p>
         </w:tc>
@@ -1569,59 +1463,13 @@
           <w:bCs/>
         </w:rPr>
       </w:pPr>
-      <w:proofErr w:type="spellStart"/>
-      <w:r>
-        <w:rPr>
-          <w:rFonts w:ascii="Times New Roman" w:hAnsi="Times New Roman" w:cs="Times New Roman"/>
-          <w:b/>
-          <w:bCs/>
-        </w:rPr>
-        <w:t>gcloud</w:t>
-      </w:r>
-      <w:proofErr w:type="spellEnd"/>
-      <w:r>
-        <w:rPr>
-          <w:rFonts w:ascii="Times New Roman" w:hAnsi="Times New Roman" w:cs="Times New Roman"/>
-          <w:b/>
-          <w:bCs/>
-        </w:rPr>
-        <w:t xml:space="preserve"> services list --enabled --filter="name:(storage OR </w:t>
-      </w:r>
-      <w:proofErr w:type="spellStart"/>
-      <w:r>
-        <w:rPr>
-          <w:rFonts w:ascii="Times New Roman" w:hAnsi="Times New Roman" w:cs="Times New Roman"/>
-          <w:b/>
-          <w:bCs/>
-        </w:rPr>
-        <w:t>bigquery</w:t>
-      </w:r>
-      <w:proofErr w:type="spellEnd"/>
-      <w:r>
-        <w:rPr>
-          <w:rFonts w:ascii="Times New Roman" w:hAnsi="Times New Roman" w:cs="Times New Roman"/>
-          <w:b/>
-          <w:bCs/>
-        </w:rPr>
-        <w:t xml:space="preserve"> OR dataflow OR </w:t>
-      </w:r>
-      <w:proofErr w:type="spellStart"/>
-      <w:r>
-        <w:rPr>
-          <w:rFonts w:ascii="Times New Roman" w:hAnsi="Times New Roman" w:cs="Times New Roman"/>
-          <w:b/>
-          <w:bCs/>
-        </w:rPr>
-        <w:t>pubsub</w:t>
-      </w:r>
-      <w:proofErr w:type="spellEnd"/>
-      <w:r>
-        <w:rPr>
-          <w:rFonts w:ascii="Times New Roman" w:hAnsi="Times New Roman" w:cs="Times New Roman"/>
-          <w:b/>
-          <w:bCs/>
-        </w:rPr>
-        <w:t xml:space="preserve"> OR composer)"</w:t>
+      <w:r>
+        <w:rPr>
+          <w:rFonts w:ascii="Times New Roman" w:hAnsi="Times New Roman" w:cs="Times New Roman"/>
+          <w:b/>
+          <w:bCs/>
+        </w:rPr>
+        <w:t>gcloud services list --enabled --filter="name:(storage OR bigquery OR dataflow OR pubsub OR composer)"</w:t>
       </w:r>
     </w:p>
     <w:p>
@@ -1705,33 +1553,11 @@
           <w:rFonts w:ascii="Times New Roman" w:hAnsi="Times New Roman" w:cs="Times New Roman"/>
         </w:rPr>
       </w:pPr>
-      <w:proofErr w:type="spellStart"/>
-      <w:r>
-        <w:rPr>
-          <w:rFonts w:ascii="Times New Roman" w:hAnsi="Times New Roman" w:cs="Times New Roman"/>
-        </w:rPr>
-        <w:t>gcloud</w:t>
-      </w:r>
-      <w:proofErr w:type="spellEnd"/>
-      <w:r>
-        <w:rPr>
-          <w:rFonts w:ascii="Times New Roman" w:hAnsi="Times New Roman" w:cs="Times New Roman"/>
-        </w:rPr>
-        <w:t xml:space="preserve"> </w:t>
-      </w:r>
-      <w:proofErr w:type="spellStart"/>
-      <w:r>
-        <w:rPr>
-          <w:rFonts w:ascii="Times New Roman" w:hAnsi="Times New Roman" w:cs="Times New Roman"/>
-        </w:rPr>
-        <w:t>iam</w:t>
-      </w:r>
-      <w:proofErr w:type="spellEnd"/>
-      <w:r>
-        <w:rPr>
-          <w:rFonts w:ascii="Times New Roman" w:hAnsi="Times New Roman" w:cs="Times New Roman"/>
-        </w:rPr>
-        <w:t xml:space="preserve"> service-accounts create $SA_NAME \</w:t>
+      <w:r>
+        <w:rPr>
+          <w:rFonts w:ascii="Times New Roman" w:hAnsi="Times New Roman" w:cs="Times New Roman"/>
+        </w:rPr>
+        <w:t>gcloud iam service-accounts create $SA_NAME \</w:t>
       </w:r>
     </w:p>
     <w:p>
@@ -1759,99 +1585,43 @@
         <w:rPr>
           <w:rFonts w:ascii="Times New Roman" w:hAnsi="Times New Roman" w:cs="Times New Roman"/>
         </w:rPr>
-        <w:t xml:space="preserve">  --description="Used by Dataflow, Composer, and </w:t>
-      </w:r>
-      <w:proofErr w:type="spellStart"/>
-      <w:r>
-        <w:rPr>
-          <w:rFonts w:ascii="Times New Roman" w:hAnsi="Times New Roman" w:cs="Times New Roman"/>
-        </w:rPr>
-        <w:t>dbt</w:t>
-      </w:r>
-      <w:proofErr w:type="spellEnd"/>
-      <w:r>
-        <w:rPr>
-          <w:rFonts w:ascii="Times New Roman" w:hAnsi="Times New Roman" w:cs="Times New Roman"/>
-        </w:rPr>
-        <w:t>"</w:t>
-      </w:r>
-    </w:p>
-    <w:p>
-      <w:pPr>
-        <w:spacing w:line="240" w:lineRule="auto"/>
-        <w:rPr>
-          <w:rFonts w:ascii="Times New Roman" w:hAnsi="Times New Roman" w:cs="Times New Roman"/>
-        </w:rPr>
-      </w:pPr>
-    </w:p>
-    <w:p>
-      <w:pPr>
-        <w:spacing w:line="240" w:lineRule="auto"/>
-        <w:rPr>
-          <w:rFonts w:ascii="Times New Roman" w:hAnsi="Times New Roman" w:cs="Times New Roman"/>
-        </w:rPr>
-      </w:pPr>
-      <w:r>
-        <w:rPr>
-          <w:rFonts w:ascii="Times New Roman" w:hAnsi="Times New Roman" w:cs="Times New Roman"/>
-        </w:rPr>
-        <w:t xml:space="preserve"># Store </w:t>
-      </w:r>
-      <w:proofErr w:type="gramStart"/>
-      <w:r>
-        <w:rPr>
-          <w:rFonts w:ascii="Times New Roman" w:hAnsi="Times New Roman" w:cs="Times New Roman"/>
-        </w:rPr>
-        <w:t>full service</w:t>
-      </w:r>
-      <w:proofErr w:type="gramEnd"/>
-      <w:r>
-        <w:rPr>
-          <w:rFonts w:ascii="Times New Roman" w:hAnsi="Times New Roman" w:cs="Times New Roman"/>
-        </w:rPr>
-        <w:t xml:space="preserve"> account email</w:t>
-      </w:r>
-    </w:p>
-    <w:p>
-      <w:pPr>
-        <w:spacing w:line="240" w:lineRule="auto"/>
-        <w:rPr>
-          <w:rFonts w:ascii="Times New Roman" w:hAnsi="Times New Roman" w:cs="Times New Roman"/>
-        </w:rPr>
-      </w:pPr>
-      <w:r>
-        <w:rPr>
-          <w:rFonts w:ascii="Times New Roman" w:hAnsi="Times New Roman" w:cs="Times New Roman"/>
-        </w:rPr>
-        <w:t>export SA_EMAIL="${SA_</w:t>
-      </w:r>
-      <w:proofErr w:type="gramStart"/>
-      <w:r>
-        <w:rPr>
-          <w:rFonts w:ascii="Times New Roman" w:hAnsi="Times New Roman" w:cs="Times New Roman"/>
-        </w:rPr>
-        <w:t>NAME}@</w:t>
-      </w:r>
-      <w:proofErr w:type="gramEnd"/>
-      <w:r>
-        <w:rPr>
-          <w:rFonts w:ascii="Times New Roman" w:hAnsi="Times New Roman" w:cs="Times New Roman"/>
-        </w:rPr>
-        <w:t>${PROJECT_ID</w:t>
-      </w:r>
-      <w:proofErr w:type="gramStart"/>
-      <w:r>
-        <w:rPr>
-          <w:rFonts w:ascii="Times New Roman" w:hAnsi="Times New Roman" w:cs="Times New Roman"/>
-        </w:rPr>
-        <w:t>}.iam.gserviceaccount.com</w:t>
-      </w:r>
-      <w:proofErr w:type="gramEnd"/>
-      <w:r>
-        <w:rPr>
-          <w:rFonts w:ascii="Times New Roman" w:hAnsi="Times New Roman" w:cs="Times New Roman"/>
-        </w:rPr>
-        <w:t>"</w:t>
+        <w:t>  --description="Used by Dataflow, Composer, and dbt"</w:t>
+      </w:r>
+    </w:p>
+    <w:p>
+      <w:pPr>
+        <w:spacing w:line="240" w:lineRule="auto"/>
+        <w:rPr>
+          <w:rFonts w:ascii="Times New Roman" w:hAnsi="Times New Roman" w:cs="Times New Roman"/>
+        </w:rPr>
+      </w:pPr>
+    </w:p>
+    <w:p>
+      <w:pPr>
+        <w:spacing w:line="240" w:lineRule="auto"/>
+        <w:rPr>
+          <w:rFonts w:ascii="Times New Roman" w:hAnsi="Times New Roman" w:cs="Times New Roman"/>
+        </w:rPr>
+      </w:pPr>
+      <w:r>
+        <w:rPr>
+          <w:rFonts w:ascii="Times New Roman" w:hAnsi="Times New Roman" w:cs="Times New Roman"/>
+        </w:rPr>
+        <w:t># Store full service account email</w:t>
+      </w:r>
+    </w:p>
+    <w:p>
+      <w:pPr>
+        <w:spacing w:line="240" w:lineRule="auto"/>
+        <w:rPr>
+          <w:rFonts w:ascii="Times New Roman" w:hAnsi="Times New Roman" w:cs="Times New Roman"/>
+        </w:rPr>
+      </w:pPr>
+      <w:r>
+        <w:rPr>
+          <w:rFonts w:ascii="Times New Roman" w:hAnsi="Times New Roman" w:cs="Times New Roman"/>
+        </w:rPr>
+        <w:t>export SA_EMAIL="${SA_NAME}@${PROJECT_ID}.iam.gserviceaccount.com"</w:t>
       </w:r>
     </w:p>
     <w:p>
@@ -1883,589 +1653,283 @@
           <w:rFonts w:ascii="Times New Roman" w:hAnsi="Times New Roman" w:cs="Times New Roman"/>
         </w:rPr>
       </w:pPr>
-      <w:proofErr w:type="spellStart"/>
-      <w:r>
-        <w:rPr>
-          <w:rFonts w:ascii="Times New Roman" w:hAnsi="Times New Roman" w:cs="Times New Roman"/>
-        </w:rPr>
-        <w:t>gcloud</w:t>
-      </w:r>
-      <w:proofErr w:type="spellEnd"/>
-      <w:r>
-        <w:rPr>
-          <w:rFonts w:ascii="Times New Roman" w:hAnsi="Times New Roman" w:cs="Times New Roman"/>
-        </w:rPr>
-        <w:t xml:space="preserve"> projects add-</w:t>
-      </w:r>
-      <w:proofErr w:type="spellStart"/>
-      <w:r>
-        <w:rPr>
-          <w:rFonts w:ascii="Times New Roman" w:hAnsi="Times New Roman" w:cs="Times New Roman"/>
-        </w:rPr>
-        <w:t>iam</w:t>
-      </w:r>
-      <w:proofErr w:type="spellEnd"/>
-      <w:r>
-        <w:rPr>
-          <w:rFonts w:ascii="Times New Roman" w:hAnsi="Times New Roman" w:cs="Times New Roman"/>
-        </w:rPr>
-        <w:t>-policy-binding $PROJECT_ID \</w:t>
-      </w:r>
-    </w:p>
-    <w:p>
-      <w:pPr>
-        <w:spacing w:line="240" w:lineRule="auto"/>
-        <w:rPr>
-          <w:rFonts w:ascii="Times New Roman" w:hAnsi="Times New Roman" w:cs="Times New Roman"/>
-        </w:rPr>
-      </w:pPr>
-      <w:r>
-        <w:rPr>
-          <w:rFonts w:ascii="Times New Roman" w:hAnsi="Times New Roman" w:cs="Times New Roman"/>
-        </w:rPr>
-        <w:t>  --member="</w:t>
-      </w:r>
-      <w:proofErr w:type="spellStart"/>
-      <w:proofErr w:type="gramStart"/>
-      <w:r>
-        <w:rPr>
-          <w:rFonts w:ascii="Times New Roman" w:hAnsi="Times New Roman" w:cs="Times New Roman"/>
-        </w:rPr>
-        <w:t>serviceAccount</w:t>
-      </w:r>
-      <w:proofErr w:type="spellEnd"/>
-      <w:r>
-        <w:rPr>
-          <w:rFonts w:ascii="Times New Roman" w:hAnsi="Times New Roman" w:cs="Times New Roman"/>
-        </w:rPr>
-        <w:t>:$</w:t>
-      </w:r>
-      <w:proofErr w:type="gramEnd"/>
-      <w:r>
-        <w:rPr>
-          <w:rFonts w:ascii="Times New Roman" w:hAnsi="Times New Roman" w:cs="Times New Roman"/>
-        </w:rPr>
-        <w:t>{SA_EMAIL}" \</w:t>
-      </w:r>
-    </w:p>
-    <w:p>
-      <w:pPr>
-        <w:spacing w:line="240" w:lineRule="auto"/>
-        <w:rPr>
-          <w:rFonts w:ascii="Times New Roman" w:hAnsi="Times New Roman" w:cs="Times New Roman"/>
-        </w:rPr>
-      </w:pPr>
-      <w:r>
-        <w:rPr>
-          <w:rFonts w:ascii="Times New Roman" w:hAnsi="Times New Roman" w:cs="Times New Roman"/>
-        </w:rPr>
-        <w:t>  --role="roles/</w:t>
-      </w:r>
-      <w:proofErr w:type="spellStart"/>
-      <w:r>
-        <w:rPr>
-          <w:rFonts w:ascii="Times New Roman" w:hAnsi="Times New Roman" w:cs="Times New Roman"/>
-        </w:rPr>
-        <w:t>bigquery.dataEditor</w:t>
-      </w:r>
-      <w:proofErr w:type="spellEnd"/>
-      <w:r>
-        <w:rPr>
-          <w:rFonts w:ascii="Times New Roman" w:hAnsi="Times New Roman" w:cs="Times New Roman"/>
-        </w:rPr>
-        <w:t>"</w:t>
-      </w:r>
-    </w:p>
-    <w:p>
-      <w:pPr>
-        <w:spacing w:line="240" w:lineRule="auto"/>
-        <w:rPr>
-          <w:rFonts w:ascii="Times New Roman" w:hAnsi="Times New Roman" w:cs="Times New Roman"/>
-        </w:rPr>
-      </w:pPr>
-    </w:p>
-    <w:p>
-      <w:pPr>
-        <w:spacing w:line="240" w:lineRule="auto"/>
-        <w:rPr>
-          <w:rFonts w:ascii="Times New Roman" w:hAnsi="Times New Roman" w:cs="Times New Roman"/>
-        </w:rPr>
-      </w:pPr>
-      <w:proofErr w:type="spellStart"/>
-      <w:r>
-        <w:rPr>
-          <w:rFonts w:ascii="Times New Roman" w:hAnsi="Times New Roman" w:cs="Times New Roman"/>
-        </w:rPr>
-        <w:t>gcloud</w:t>
-      </w:r>
-      <w:proofErr w:type="spellEnd"/>
-      <w:r>
-        <w:rPr>
-          <w:rFonts w:ascii="Times New Roman" w:hAnsi="Times New Roman" w:cs="Times New Roman"/>
-        </w:rPr>
-        <w:t xml:space="preserve"> projects add-</w:t>
-      </w:r>
-      <w:proofErr w:type="spellStart"/>
-      <w:r>
-        <w:rPr>
-          <w:rFonts w:ascii="Times New Roman" w:hAnsi="Times New Roman" w:cs="Times New Roman"/>
-        </w:rPr>
-        <w:t>iam</w:t>
-      </w:r>
-      <w:proofErr w:type="spellEnd"/>
-      <w:r>
-        <w:rPr>
-          <w:rFonts w:ascii="Times New Roman" w:hAnsi="Times New Roman" w:cs="Times New Roman"/>
-        </w:rPr>
-        <w:t>-policy-binding $PROJECT_ID \</w:t>
-      </w:r>
-    </w:p>
-    <w:p>
-      <w:pPr>
-        <w:spacing w:line="240" w:lineRule="auto"/>
-        <w:rPr>
-          <w:rFonts w:ascii="Times New Roman" w:hAnsi="Times New Roman" w:cs="Times New Roman"/>
-        </w:rPr>
-      </w:pPr>
-      <w:r>
-        <w:rPr>
-          <w:rFonts w:ascii="Times New Roman" w:hAnsi="Times New Roman" w:cs="Times New Roman"/>
-        </w:rPr>
-        <w:t>  --member="</w:t>
-      </w:r>
-      <w:proofErr w:type="spellStart"/>
-      <w:proofErr w:type="gramStart"/>
-      <w:r>
-        <w:rPr>
-          <w:rFonts w:ascii="Times New Roman" w:hAnsi="Times New Roman" w:cs="Times New Roman"/>
-        </w:rPr>
-        <w:t>serviceAccount</w:t>
-      </w:r>
-      <w:proofErr w:type="spellEnd"/>
-      <w:r>
-        <w:rPr>
-          <w:rFonts w:ascii="Times New Roman" w:hAnsi="Times New Roman" w:cs="Times New Roman"/>
-        </w:rPr>
-        <w:t>:$</w:t>
-      </w:r>
-      <w:proofErr w:type="gramEnd"/>
-      <w:r>
-        <w:rPr>
-          <w:rFonts w:ascii="Times New Roman" w:hAnsi="Times New Roman" w:cs="Times New Roman"/>
-        </w:rPr>
-        <w:t>{SA_EMAIL}" \</w:t>
-      </w:r>
-    </w:p>
-    <w:p>
-      <w:pPr>
-        <w:spacing w:line="240" w:lineRule="auto"/>
-        <w:rPr>
-          <w:rFonts w:ascii="Times New Roman" w:hAnsi="Times New Roman" w:cs="Times New Roman"/>
-        </w:rPr>
-      </w:pPr>
-      <w:r>
-        <w:rPr>
-          <w:rFonts w:ascii="Times New Roman" w:hAnsi="Times New Roman" w:cs="Times New Roman"/>
-        </w:rPr>
-        <w:t>  --role="roles/</w:t>
-      </w:r>
-      <w:proofErr w:type="spellStart"/>
-      <w:r>
-        <w:rPr>
-          <w:rFonts w:ascii="Times New Roman" w:hAnsi="Times New Roman" w:cs="Times New Roman"/>
-        </w:rPr>
-        <w:t>bigquery.jobUser</w:t>
-      </w:r>
-      <w:proofErr w:type="spellEnd"/>
-      <w:r>
-        <w:rPr>
-          <w:rFonts w:ascii="Times New Roman" w:hAnsi="Times New Roman" w:cs="Times New Roman"/>
-        </w:rPr>
-        <w:t>"</w:t>
-      </w:r>
-    </w:p>
-    <w:p>
-      <w:pPr>
-        <w:spacing w:line="240" w:lineRule="auto"/>
-        <w:rPr>
-          <w:rFonts w:ascii="Times New Roman" w:hAnsi="Times New Roman" w:cs="Times New Roman"/>
-        </w:rPr>
-      </w:pPr>
-    </w:p>
-    <w:p>
-      <w:pPr>
-        <w:spacing w:line="240" w:lineRule="auto"/>
-        <w:rPr>
-          <w:rFonts w:ascii="Times New Roman" w:hAnsi="Times New Roman" w:cs="Times New Roman"/>
-        </w:rPr>
-      </w:pPr>
-      <w:proofErr w:type="spellStart"/>
-      <w:r>
-        <w:rPr>
-          <w:rFonts w:ascii="Times New Roman" w:hAnsi="Times New Roman" w:cs="Times New Roman"/>
-        </w:rPr>
-        <w:t>gcloud</w:t>
-      </w:r>
-      <w:proofErr w:type="spellEnd"/>
-      <w:r>
-        <w:rPr>
-          <w:rFonts w:ascii="Times New Roman" w:hAnsi="Times New Roman" w:cs="Times New Roman"/>
-        </w:rPr>
-        <w:t xml:space="preserve"> projects add-</w:t>
-      </w:r>
-      <w:proofErr w:type="spellStart"/>
-      <w:r>
-        <w:rPr>
-          <w:rFonts w:ascii="Times New Roman" w:hAnsi="Times New Roman" w:cs="Times New Roman"/>
-        </w:rPr>
-        <w:t>iam</w:t>
-      </w:r>
-      <w:proofErr w:type="spellEnd"/>
-      <w:r>
-        <w:rPr>
-          <w:rFonts w:ascii="Times New Roman" w:hAnsi="Times New Roman" w:cs="Times New Roman"/>
-        </w:rPr>
-        <w:t>-policy-binding $PROJECT_ID \</w:t>
-      </w:r>
-    </w:p>
-    <w:p>
-      <w:pPr>
-        <w:spacing w:line="240" w:lineRule="auto"/>
-        <w:rPr>
-          <w:rFonts w:ascii="Times New Roman" w:hAnsi="Times New Roman" w:cs="Times New Roman"/>
-        </w:rPr>
-      </w:pPr>
-      <w:r>
-        <w:rPr>
-          <w:rFonts w:ascii="Times New Roman" w:hAnsi="Times New Roman" w:cs="Times New Roman"/>
-        </w:rPr>
-        <w:t>  --member="</w:t>
-      </w:r>
-      <w:proofErr w:type="spellStart"/>
-      <w:proofErr w:type="gramStart"/>
-      <w:r>
-        <w:rPr>
-          <w:rFonts w:ascii="Times New Roman" w:hAnsi="Times New Roman" w:cs="Times New Roman"/>
-        </w:rPr>
-        <w:t>serviceAccount</w:t>
-      </w:r>
-      <w:proofErr w:type="spellEnd"/>
-      <w:r>
-        <w:rPr>
-          <w:rFonts w:ascii="Times New Roman" w:hAnsi="Times New Roman" w:cs="Times New Roman"/>
-        </w:rPr>
-        <w:t>:$</w:t>
-      </w:r>
-      <w:proofErr w:type="gramEnd"/>
-      <w:r>
-        <w:rPr>
-          <w:rFonts w:ascii="Times New Roman" w:hAnsi="Times New Roman" w:cs="Times New Roman"/>
-        </w:rPr>
-        <w:t>{SA_EMAIL}" \</w:t>
-      </w:r>
-    </w:p>
-    <w:p>
-      <w:pPr>
-        <w:spacing w:line="240" w:lineRule="auto"/>
-        <w:rPr>
-          <w:rFonts w:ascii="Times New Roman" w:hAnsi="Times New Roman" w:cs="Times New Roman"/>
-        </w:rPr>
-      </w:pPr>
-      <w:r>
-        <w:rPr>
-          <w:rFonts w:ascii="Times New Roman" w:hAnsi="Times New Roman" w:cs="Times New Roman"/>
-        </w:rPr>
-        <w:t>  --role="roles/</w:t>
-      </w:r>
-      <w:proofErr w:type="spellStart"/>
-      <w:r>
-        <w:rPr>
-          <w:rFonts w:ascii="Times New Roman" w:hAnsi="Times New Roman" w:cs="Times New Roman"/>
-        </w:rPr>
-        <w:t>storage.objectAdmin</w:t>
-      </w:r>
-      <w:proofErr w:type="spellEnd"/>
-      <w:r>
-        <w:rPr>
-          <w:rFonts w:ascii="Times New Roman" w:hAnsi="Times New Roman" w:cs="Times New Roman"/>
-        </w:rPr>
-        <w:t>"</w:t>
-      </w:r>
-    </w:p>
-    <w:p>
-      <w:pPr>
-        <w:spacing w:line="240" w:lineRule="auto"/>
-        <w:rPr>
-          <w:rFonts w:ascii="Times New Roman" w:hAnsi="Times New Roman" w:cs="Times New Roman"/>
-        </w:rPr>
-      </w:pPr>
-    </w:p>
-    <w:p>
-      <w:pPr>
-        <w:spacing w:line="240" w:lineRule="auto"/>
-        <w:rPr>
-          <w:rFonts w:ascii="Times New Roman" w:hAnsi="Times New Roman" w:cs="Times New Roman"/>
-        </w:rPr>
-      </w:pPr>
-      <w:proofErr w:type="spellStart"/>
-      <w:r>
-        <w:rPr>
-          <w:rFonts w:ascii="Times New Roman" w:hAnsi="Times New Roman" w:cs="Times New Roman"/>
-        </w:rPr>
-        <w:t>gcloud</w:t>
-      </w:r>
-      <w:proofErr w:type="spellEnd"/>
-      <w:r>
-        <w:rPr>
-          <w:rFonts w:ascii="Times New Roman" w:hAnsi="Times New Roman" w:cs="Times New Roman"/>
-        </w:rPr>
-        <w:t xml:space="preserve"> projects add-</w:t>
-      </w:r>
-      <w:proofErr w:type="spellStart"/>
-      <w:r>
-        <w:rPr>
-          <w:rFonts w:ascii="Times New Roman" w:hAnsi="Times New Roman" w:cs="Times New Roman"/>
-        </w:rPr>
-        <w:t>iam</w:t>
-      </w:r>
-      <w:proofErr w:type="spellEnd"/>
-      <w:r>
-        <w:rPr>
-          <w:rFonts w:ascii="Times New Roman" w:hAnsi="Times New Roman" w:cs="Times New Roman"/>
-        </w:rPr>
-        <w:t>-policy-binding $PROJECT_ID \</w:t>
-      </w:r>
-    </w:p>
-    <w:p>
-      <w:pPr>
-        <w:spacing w:line="240" w:lineRule="auto"/>
-        <w:rPr>
-          <w:rFonts w:ascii="Times New Roman" w:hAnsi="Times New Roman" w:cs="Times New Roman"/>
-        </w:rPr>
-      </w:pPr>
-      <w:r>
-        <w:rPr>
-          <w:rFonts w:ascii="Times New Roman" w:hAnsi="Times New Roman" w:cs="Times New Roman"/>
-        </w:rPr>
-        <w:t>  --member="</w:t>
-      </w:r>
-      <w:proofErr w:type="spellStart"/>
-      <w:proofErr w:type="gramStart"/>
-      <w:r>
-        <w:rPr>
-          <w:rFonts w:ascii="Times New Roman" w:hAnsi="Times New Roman" w:cs="Times New Roman"/>
-        </w:rPr>
-        <w:t>serviceAccount</w:t>
-      </w:r>
-      <w:proofErr w:type="spellEnd"/>
-      <w:r>
-        <w:rPr>
-          <w:rFonts w:ascii="Times New Roman" w:hAnsi="Times New Roman" w:cs="Times New Roman"/>
-        </w:rPr>
-        <w:t>:$</w:t>
-      </w:r>
-      <w:proofErr w:type="gramEnd"/>
-      <w:r>
-        <w:rPr>
-          <w:rFonts w:ascii="Times New Roman" w:hAnsi="Times New Roman" w:cs="Times New Roman"/>
-        </w:rPr>
-        <w:t>{SA_EMAIL}" \</w:t>
-      </w:r>
-    </w:p>
-    <w:p>
-      <w:pPr>
-        <w:spacing w:line="240" w:lineRule="auto"/>
-        <w:rPr>
-          <w:rFonts w:ascii="Times New Roman" w:hAnsi="Times New Roman" w:cs="Times New Roman"/>
-        </w:rPr>
-      </w:pPr>
-      <w:r>
-        <w:rPr>
-          <w:rFonts w:ascii="Times New Roman" w:hAnsi="Times New Roman" w:cs="Times New Roman"/>
-        </w:rPr>
-        <w:t>  --role="roles/</w:t>
-      </w:r>
-      <w:proofErr w:type="spellStart"/>
-      <w:r>
-        <w:rPr>
-          <w:rFonts w:ascii="Times New Roman" w:hAnsi="Times New Roman" w:cs="Times New Roman"/>
-        </w:rPr>
-        <w:t>dataflow.worker</w:t>
-      </w:r>
-      <w:proofErr w:type="spellEnd"/>
-      <w:r>
-        <w:rPr>
-          <w:rFonts w:ascii="Times New Roman" w:hAnsi="Times New Roman" w:cs="Times New Roman"/>
-        </w:rPr>
-        <w:t>"</w:t>
-      </w:r>
-    </w:p>
-    <w:p>
-      <w:pPr>
-        <w:spacing w:line="240" w:lineRule="auto"/>
-        <w:rPr>
-          <w:rFonts w:ascii="Times New Roman" w:hAnsi="Times New Roman" w:cs="Times New Roman"/>
-        </w:rPr>
-      </w:pPr>
-    </w:p>
-    <w:p>
-      <w:pPr>
-        <w:spacing w:line="240" w:lineRule="auto"/>
-        <w:rPr>
-          <w:rFonts w:ascii="Times New Roman" w:hAnsi="Times New Roman" w:cs="Times New Roman"/>
-        </w:rPr>
-      </w:pPr>
-      <w:proofErr w:type="spellStart"/>
-      <w:r>
-        <w:rPr>
-          <w:rFonts w:ascii="Times New Roman" w:hAnsi="Times New Roman" w:cs="Times New Roman"/>
-        </w:rPr>
-        <w:t>gcloud</w:t>
-      </w:r>
-      <w:proofErr w:type="spellEnd"/>
-      <w:r>
-        <w:rPr>
-          <w:rFonts w:ascii="Times New Roman" w:hAnsi="Times New Roman" w:cs="Times New Roman"/>
-        </w:rPr>
-        <w:t xml:space="preserve"> projects add-</w:t>
-      </w:r>
-      <w:proofErr w:type="spellStart"/>
-      <w:r>
-        <w:rPr>
-          <w:rFonts w:ascii="Times New Roman" w:hAnsi="Times New Roman" w:cs="Times New Roman"/>
-        </w:rPr>
-        <w:t>iam</w:t>
-      </w:r>
-      <w:proofErr w:type="spellEnd"/>
-      <w:r>
-        <w:rPr>
-          <w:rFonts w:ascii="Times New Roman" w:hAnsi="Times New Roman" w:cs="Times New Roman"/>
-        </w:rPr>
-        <w:t>-policy-binding $PROJECT_ID \</w:t>
-      </w:r>
-    </w:p>
-    <w:p>
-      <w:pPr>
-        <w:spacing w:line="240" w:lineRule="auto"/>
-        <w:rPr>
-          <w:rFonts w:ascii="Times New Roman" w:hAnsi="Times New Roman" w:cs="Times New Roman"/>
-        </w:rPr>
-      </w:pPr>
-      <w:r>
-        <w:rPr>
-          <w:rFonts w:ascii="Times New Roman" w:hAnsi="Times New Roman" w:cs="Times New Roman"/>
-        </w:rPr>
-        <w:t>  --member="</w:t>
-      </w:r>
-      <w:proofErr w:type="spellStart"/>
-      <w:proofErr w:type="gramStart"/>
-      <w:r>
-        <w:rPr>
-          <w:rFonts w:ascii="Times New Roman" w:hAnsi="Times New Roman" w:cs="Times New Roman"/>
-        </w:rPr>
-        <w:t>serviceAccount</w:t>
-      </w:r>
-      <w:proofErr w:type="spellEnd"/>
-      <w:r>
-        <w:rPr>
-          <w:rFonts w:ascii="Times New Roman" w:hAnsi="Times New Roman" w:cs="Times New Roman"/>
-        </w:rPr>
-        <w:t>:$</w:t>
-      </w:r>
-      <w:proofErr w:type="gramEnd"/>
-      <w:r>
-        <w:rPr>
-          <w:rFonts w:ascii="Times New Roman" w:hAnsi="Times New Roman" w:cs="Times New Roman"/>
-        </w:rPr>
-        <w:t>{SA_EMAIL}" \</w:t>
-      </w:r>
-    </w:p>
-    <w:p>
-      <w:pPr>
-        <w:spacing w:line="240" w:lineRule="auto"/>
-        <w:rPr>
-          <w:rFonts w:ascii="Times New Roman" w:hAnsi="Times New Roman" w:cs="Times New Roman"/>
-        </w:rPr>
-      </w:pPr>
-      <w:r>
-        <w:rPr>
-          <w:rFonts w:ascii="Times New Roman" w:hAnsi="Times New Roman" w:cs="Times New Roman"/>
-        </w:rPr>
-        <w:t>  --role="roles/</w:t>
-      </w:r>
-      <w:proofErr w:type="spellStart"/>
-      <w:r>
-        <w:rPr>
-          <w:rFonts w:ascii="Times New Roman" w:hAnsi="Times New Roman" w:cs="Times New Roman"/>
-        </w:rPr>
-        <w:t>pubsub.editor</w:t>
-      </w:r>
-      <w:proofErr w:type="spellEnd"/>
-      <w:r>
-        <w:rPr>
-          <w:rFonts w:ascii="Times New Roman" w:hAnsi="Times New Roman" w:cs="Times New Roman"/>
-        </w:rPr>
-        <w:t>"</w:t>
-      </w:r>
-    </w:p>
-    <w:p>
-      <w:pPr>
-        <w:spacing w:line="240" w:lineRule="auto"/>
-        <w:rPr>
-          <w:rFonts w:ascii="Times New Roman" w:hAnsi="Times New Roman" w:cs="Times New Roman"/>
-        </w:rPr>
-      </w:pPr>
-    </w:p>
-    <w:p>
-      <w:pPr>
-        <w:spacing w:line="240" w:lineRule="auto"/>
-        <w:rPr>
-          <w:rFonts w:ascii="Times New Roman" w:hAnsi="Times New Roman" w:cs="Times New Roman"/>
-        </w:rPr>
-      </w:pPr>
-      <w:proofErr w:type="spellStart"/>
-      <w:r>
-        <w:rPr>
-          <w:rFonts w:ascii="Times New Roman" w:hAnsi="Times New Roman" w:cs="Times New Roman"/>
-        </w:rPr>
-        <w:t>gcloud</w:t>
-      </w:r>
-      <w:proofErr w:type="spellEnd"/>
-      <w:r>
-        <w:rPr>
-          <w:rFonts w:ascii="Times New Roman" w:hAnsi="Times New Roman" w:cs="Times New Roman"/>
-        </w:rPr>
-        <w:t xml:space="preserve"> auth application-default login</w:t>
-      </w:r>
-    </w:p>
-    <w:p>
-      <w:pPr>
-        <w:spacing w:line="240" w:lineRule="auto"/>
-        <w:rPr>
-          <w:rFonts w:ascii="Times New Roman" w:hAnsi="Times New Roman" w:cs="Times New Roman"/>
-        </w:rPr>
-      </w:pPr>
-    </w:p>
-    <w:p>
-      <w:pPr>
-        <w:spacing w:line="240" w:lineRule="auto"/>
-        <w:rPr>
-          <w:rFonts w:ascii="Times New Roman" w:hAnsi="Times New Roman" w:cs="Times New Roman"/>
-        </w:rPr>
-      </w:pPr>
-      <w:proofErr w:type="spellStart"/>
-      <w:r>
-        <w:rPr>
-          <w:rFonts w:ascii="Times New Roman" w:hAnsi="Times New Roman" w:cs="Times New Roman"/>
-        </w:rPr>
-        <w:t>gcloud</w:t>
-      </w:r>
-      <w:proofErr w:type="spellEnd"/>
-      <w:r>
-        <w:rPr>
-          <w:rFonts w:ascii="Times New Roman" w:hAnsi="Times New Roman" w:cs="Times New Roman"/>
-        </w:rPr>
-        <w:t xml:space="preserve"> auth application-default print-access-token</w:t>
+      <w:r>
+        <w:rPr>
+          <w:rFonts w:ascii="Times New Roman" w:hAnsi="Times New Roman" w:cs="Times New Roman"/>
+        </w:rPr>
+        <w:t>gcloud projects add-iam-policy-binding $PROJECT_ID \</w:t>
+      </w:r>
+    </w:p>
+    <w:p>
+      <w:pPr>
+        <w:spacing w:line="240" w:lineRule="auto"/>
+        <w:rPr>
+          <w:rFonts w:ascii="Times New Roman" w:hAnsi="Times New Roman" w:cs="Times New Roman"/>
+        </w:rPr>
+      </w:pPr>
+      <w:r>
+        <w:rPr>
+          <w:rFonts w:ascii="Times New Roman" w:hAnsi="Times New Roman" w:cs="Times New Roman"/>
+        </w:rPr>
+        <w:t>  --member="serviceAccount:${SA_EMAIL}" \</w:t>
+      </w:r>
+    </w:p>
+    <w:p>
+      <w:pPr>
+        <w:spacing w:line="240" w:lineRule="auto"/>
+        <w:rPr>
+          <w:rFonts w:ascii="Times New Roman" w:hAnsi="Times New Roman" w:cs="Times New Roman"/>
+        </w:rPr>
+      </w:pPr>
+      <w:r>
+        <w:rPr>
+          <w:rFonts w:ascii="Times New Roman" w:hAnsi="Times New Roman" w:cs="Times New Roman"/>
+        </w:rPr>
+        <w:t>  --role="roles/bigquery.dataEditor"</w:t>
+      </w:r>
+    </w:p>
+    <w:p>
+      <w:pPr>
+        <w:spacing w:line="240" w:lineRule="auto"/>
+        <w:rPr>
+          <w:rFonts w:ascii="Times New Roman" w:hAnsi="Times New Roman" w:cs="Times New Roman"/>
+        </w:rPr>
+      </w:pPr>
+    </w:p>
+    <w:p>
+      <w:pPr>
+        <w:spacing w:line="240" w:lineRule="auto"/>
+        <w:rPr>
+          <w:rFonts w:ascii="Times New Roman" w:hAnsi="Times New Roman" w:cs="Times New Roman"/>
+        </w:rPr>
+      </w:pPr>
+      <w:r>
+        <w:rPr>
+          <w:rFonts w:ascii="Times New Roman" w:hAnsi="Times New Roman" w:cs="Times New Roman"/>
+        </w:rPr>
+        <w:t>gcloud projects add-iam-policy-binding $PROJECT_ID \</w:t>
+      </w:r>
+    </w:p>
+    <w:p>
+      <w:pPr>
+        <w:spacing w:line="240" w:lineRule="auto"/>
+        <w:rPr>
+          <w:rFonts w:ascii="Times New Roman" w:hAnsi="Times New Roman" w:cs="Times New Roman"/>
+        </w:rPr>
+      </w:pPr>
+      <w:r>
+        <w:rPr>
+          <w:rFonts w:ascii="Times New Roman" w:hAnsi="Times New Roman" w:cs="Times New Roman"/>
+        </w:rPr>
+        <w:t>  --member="serviceAccount:${SA_EMAIL}" \</w:t>
+      </w:r>
+    </w:p>
+    <w:p>
+      <w:pPr>
+        <w:spacing w:line="240" w:lineRule="auto"/>
+        <w:rPr>
+          <w:rFonts w:ascii="Times New Roman" w:hAnsi="Times New Roman" w:cs="Times New Roman"/>
+        </w:rPr>
+      </w:pPr>
+      <w:r>
+        <w:rPr>
+          <w:rFonts w:ascii="Times New Roman" w:hAnsi="Times New Roman" w:cs="Times New Roman"/>
+        </w:rPr>
+        <w:t>  --role="roles/bigquery.jobUser"</w:t>
+      </w:r>
+    </w:p>
+    <w:p>
+      <w:pPr>
+        <w:spacing w:line="240" w:lineRule="auto"/>
+        <w:rPr>
+          <w:rFonts w:ascii="Times New Roman" w:hAnsi="Times New Roman" w:cs="Times New Roman"/>
+        </w:rPr>
+      </w:pPr>
+    </w:p>
+    <w:p>
+      <w:pPr>
+        <w:spacing w:line="240" w:lineRule="auto"/>
+        <w:rPr>
+          <w:rFonts w:ascii="Times New Roman" w:hAnsi="Times New Roman" w:cs="Times New Roman"/>
+        </w:rPr>
+      </w:pPr>
+      <w:r>
+        <w:rPr>
+          <w:rFonts w:ascii="Times New Roman" w:hAnsi="Times New Roman" w:cs="Times New Roman"/>
+        </w:rPr>
+        <w:t>gcloud projects add-iam-policy-binding $PROJECT_ID \</w:t>
+      </w:r>
+    </w:p>
+    <w:p>
+      <w:pPr>
+        <w:spacing w:line="240" w:lineRule="auto"/>
+        <w:rPr>
+          <w:rFonts w:ascii="Times New Roman" w:hAnsi="Times New Roman" w:cs="Times New Roman"/>
+        </w:rPr>
+      </w:pPr>
+      <w:r>
+        <w:rPr>
+          <w:rFonts w:ascii="Times New Roman" w:hAnsi="Times New Roman" w:cs="Times New Roman"/>
+        </w:rPr>
+        <w:t>  --member="serviceAccount:${SA_EMAIL}" \</w:t>
+      </w:r>
+    </w:p>
+    <w:p>
+      <w:pPr>
+        <w:spacing w:line="240" w:lineRule="auto"/>
+        <w:rPr>
+          <w:rFonts w:ascii="Times New Roman" w:hAnsi="Times New Roman" w:cs="Times New Roman"/>
+        </w:rPr>
+      </w:pPr>
+      <w:r>
+        <w:rPr>
+          <w:rFonts w:ascii="Times New Roman" w:hAnsi="Times New Roman" w:cs="Times New Roman"/>
+        </w:rPr>
+        <w:t>  --role="roles/storage.objectAdmin"</w:t>
+      </w:r>
+    </w:p>
+    <w:p>
+      <w:pPr>
+        <w:spacing w:line="240" w:lineRule="auto"/>
+        <w:rPr>
+          <w:rFonts w:ascii="Times New Roman" w:hAnsi="Times New Roman" w:cs="Times New Roman"/>
+        </w:rPr>
+      </w:pPr>
+    </w:p>
+    <w:p>
+      <w:pPr>
+        <w:spacing w:line="240" w:lineRule="auto"/>
+        <w:rPr>
+          <w:rFonts w:ascii="Times New Roman" w:hAnsi="Times New Roman" w:cs="Times New Roman"/>
+        </w:rPr>
+      </w:pPr>
+      <w:r>
+        <w:rPr>
+          <w:rFonts w:ascii="Times New Roman" w:hAnsi="Times New Roman" w:cs="Times New Roman"/>
+        </w:rPr>
+        <w:t>gcloud projects add-iam-policy-binding $PROJECT_ID \</w:t>
+      </w:r>
+    </w:p>
+    <w:p>
+      <w:pPr>
+        <w:spacing w:line="240" w:lineRule="auto"/>
+        <w:rPr>
+          <w:rFonts w:ascii="Times New Roman" w:hAnsi="Times New Roman" w:cs="Times New Roman"/>
+        </w:rPr>
+      </w:pPr>
+      <w:r>
+        <w:rPr>
+          <w:rFonts w:ascii="Times New Roman" w:hAnsi="Times New Roman" w:cs="Times New Roman"/>
+        </w:rPr>
+        <w:t>  --member="serviceAccount:${SA_EMAIL}" \</w:t>
+      </w:r>
+    </w:p>
+    <w:p>
+      <w:pPr>
+        <w:spacing w:line="240" w:lineRule="auto"/>
+        <w:rPr>
+          <w:rFonts w:ascii="Times New Roman" w:hAnsi="Times New Roman" w:cs="Times New Roman"/>
+        </w:rPr>
+      </w:pPr>
+      <w:r>
+        <w:rPr>
+          <w:rFonts w:ascii="Times New Roman" w:hAnsi="Times New Roman" w:cs="Times New Roman"/>
+        </w:rPr>
+        <w:t>  --role="roles/dataflow.worker"</w:t>
+      </w:r>
+    </w:p>
+    <w:p>
+      <w:pPr>
+        <w:spacing w:line="240" w:lineRule="auto"/>
+        <w:rPr>
+          <w:rFonts w:ascii="Times New Roman" w:hAnsi="Times New Roman" w:cs="Times New Roman"/>
+        </w:rPr>
+      </w:pPr>
+    </w:p>
+    <w:p>
+      <w:pPr>
+        <w:spacing w:line="240" w:lineRule="auto"/>
+        <w:rPr>
+          <w:rFonts w:ascii="Times New Roman" w:hAnsi="Times New Roman" w:cs="Times New Roman"/>
+        </w:rPr>
+      </w:pPr>
+      <w:r>
+        <w:rPr>
+          <w:rFonts w:ascii="Times New Roman" w:hAnsi="Times New Roman" w:cs="Times New Roman"/>
+        </w:rPr>
+        <w:t>gcloud projects add-iam-policy-binding $PROJECT_ID \</w:t>
+      </w:r>
+    </w:p>
+    <w:p>
+      <w:pPr>
+        <w:spacing w:line="240" w:lineRule="auto"/>
+        <w:rPr>
+          <w:rFonts w:ascii="Times New Roman" w:hAnsi="Times New Roman" w:cs="Times New Roman"/>
+        </w:rPr>
+      </w:pPr>
+      <w:r>
+        <w:rPr>
+          <w:rFonts w:ascii="Times New Roman" w:hAnsi="Times New Roman" w:cs="Times New Roman"/>
+        </w:rPr>
+        <w:t>  --member="serviceAccount:${SA_EMAIL}" \</w:t>
+      </w:r>
+    </w:p>
+    <w:p>
+      <w:pPr>
+        <w:spacing w:line="240" w:lineRule="auto"/>
+        <w:rPr>
+          <w:rFonts w:ascii="Times New Roman" w:hAnsi="Times New Roman" w:cs="Times New Roman"/>
+        </w:rPr>
+      </w:pPr>
+      <w:r>
+        <w:rPr>
+          <w:rFonts w:ascii="Times New Roman" w:hAnsi="Times New Roman" w:cs="Times New Roman"/>
+        </w:rPr>
+        <w:t>  --role="roles/pubsub.editor"</w:t>
+      </w:r>
+    </w:p>
+    <w:p>
+      <w:pPr>
+        <w:spacing w:line="240" w:lineRule="auto"/>
+        <w:rPr>
+          <w:rFonts w:ascii="Times New Roman" w:hAnsi="Times New Roman" w:cs="Times New Roman"/>
+        </w:rPr>
+      </w:pPr>
+    </w:p>
+    <w:p>
+      <w:pPr>
+        <w:spacing w:line="240" w:lineRule="auto"/>
+        <w:rPr>
+          <w:rFonts w:ascii="Times New Roman" w:hAnsi="Times New Roman" w:cs="Times New Roman"/>
+        </w:rPr>
+      </w:pPr>
+      <w:r>
+        <w:rPr>
+          <w:rFonts w:ascii="Times New Roman" w:hAnsi="Times New Roman" w:cs="Times New Roman"/>
+        </w:rPr>
+        <w:t>gcloud auth application-default login</w:t>
+      </w:r>
+    </w:p>
+    <w:p>
+      <w:pPr>
+        <w:spacing w:line="240" w:lineRule="auto"/>
+        <w:rPr>
+          <w:rFonts w:ascii="Times New Roman" w:hAnsi="Times New Roman" w:cs="Times New Roman"/>
+        </w:rPr>
+      </w:pPr>
+    </w:p>
+    <w:p>
+      <w:pPr>
+        <w:spacing w:line="240" w:lineRule="auto"/>
+        <w:rPr>
+          <w:rFonts w:ascii="Times New Roman" w:hAnsi="Times New Roman" w:cs="Times New Roman"/>
+        </w:rPr>
+      </w:pPr>
+      <w:r>
+        <w:rPr>
+          <w:rFonts w:ascii="Times New Roman" w:hAnsi="Times New Roman" w:cs="Times New Roman"/>
+        </w:rPr>
+        <w:t>gcloud auth application-default print-access-token</w:t>
       </w:r>
     </w:p>
     <w:p>
@@ -2533,14 +1997,6 @@
           <w:rFonts w:ascii="Times New Roman" w:hAnsi="Times New Roman" w:cs="Times New Roman"/>
         </w:rPr>
       </w:pPr>
-    </w:p>
-    <w:p>
-      <w:pPr>
-        <w:spacing w:line="240" w:lineRule="auto"/>
-        <w:rPr>
-          <w:rFonts w:ascii="Times New Roman" w:hAnsi="Times New Roman" w:cs="Times New Roman"/>
-        </w:rPr>
-      </w:pPr>
       <w:r>
         <w:rPr>
           <w:rFonts w:ascii="Times New Roman" w:hAnsi="Times New Roman" w:cs="Times New Roman"/>
@@ -2555,6 +2011,559 @@
           <w:rFonts w:ascii="Times New Roman" w:hAnsi="Times New Roman" w:cs="Times New Roman"/>
         </w:rPr>
       </w:pPr>
+      <w:r>
+        <w:rPr>
+          <w:rFonts w:ascii="Times New Roman" w:hAnsi="Times New Roman" w:cs="Times New Roman"/>
+        </w:rPr>
+        <w:t>## 6. Create Cloud Storage Buckets</w:t>
+      </w:r>
+    </w:p>
+    <w:p>
+      <w:pPr>
+        <w:spacing w:line="240" w:lineRule="auto"/>
+        <w:rPr>
+          <w:rFonts w:ascii="Times New Roman" w:hAnsi="Times New Roman" w:cs="Times New Roman"/>
+        </w:rPr>
+      </w:pPr>
+      <w:r>
+        <w:rPr>
+          <w:rFonts w:ascii="Times New Roman" w:hAnsi="Times New Roman" w:cs="Times New Roman"/>
+        </w:rPr>
+        <w:t>bash</w:t>
+      </w:r>
+    </w:p>
+    <w:p>
+      <w:pPr>
+        <w:spacing w:line="240" w:lineRule="auto"/>
+        <w:rPr>
+          <w:rFonts w:ascii="Times New Roman" w:hAnsi="Times New Roman" w:cs="Times New Roman"/>
+          <w:sz w:val="28"/>
+          <w:szCs w:val="28"/>
+        </w:rPr>
+      </w:pPr>
+      <w:r>
+        <w:rPr>
+          <w:rFonts w:ascii="Times New Roman" w:hAnsi="Times New Roman" w:cs="Times New Roman"/>
+          <w:sz w:val="28"/>
+          <w:szCs w:val="28"/>
+        </w:rPr>
+        <w:t># Create main data lake bucket</w:t>
+      </w:r>
+    </w:p>
+    <w:p>
+      <w:pPr>
+        <w:spacing w:line="240" w:lineRule="auto"/>
+        <w:rPr>
+          <w:rFonts w:ascii="Times New Roman" w:hAnsi="Times New Roman" w:cs="Times New Roman"/>
+        </w:rPr>
+      </w:pPr>
+      <w:r>
+        <w:rPr>
+          <w:rFonts w:ascii="Times New Roman" w:hAnsi="Times New Roman" w:cs="Times New Roman"/>
+        </w:rPr>
+        <w:t>gcloud storage buckets create gs://%BUCKET_NAME% ^</w:t>
+      </w:r>
+    </w:p>
+    <w:p>
+      <w:pPr>
+        <w:spacing w:line="240" w:lineRule="auto"/>
+        <w:rPr>
+          <w:rFonts w:ascii="Times New Roman" w:hAnsi="Times New Roman" w:cs="Times New Roman"/>
+        </w:rPr>
+      </w:pPr>
+      <w:r>
+        <w:rPr>
+          <w:rFonts w:ascii="Times New Roman" w:hAnsi="Times New Roman" w:cs="Times New Roman"/>
+        </w:rPr>
+        <w:t xml:space="preserve">  --project=%PROJECT_ID% ^</w:t>
+      </w:r>
+    </w:p>
+    <w:p>
+      <w:pPr>
+        <w:spacing w:line="240" w:lineRule="auto"/>
+        <w:rPr>
+          <w:rFonts w:ascii="Times New Roman" w:hAnsi="Times New Roman" w:cs="Times New Roman"/>
+        </w:rPr>
+      </w:pPr>
+      <w:r>
+        <w:rPr>
+          <w:rFonts w:ascii="Times New Roman" w:hAnsi="Times New Roman" w:cs="Times New Roman"/>
+        </w:rPr>
+        <w:t xml:space="preserve">  --location=%REGION% ^</w:t>
+      </w:r>
+    </w:p>
+    <w:p>
+      <w:pPr>
+        <w:spacing w:line="240" w:lineRule="auto"/>
+        <w:rPr>
+          <w:rFonts w:ascii="Times New Roman" w:hAnsi="Times New Roman" w:cs="Times New Roman"/>
+        </w:rPr>
+      </w:pPr>
+      <w:r>
+        <w:rPr>
+          <w:rFonts w:ascii="Times New Roman" w:hAnsi="Times New Roman" w:cs="Times New Roman"/>
+        </w:rPr>
+        <w:t xml:space="preserve">  --uniform-bucket-level-access ^</w:t>
+      </w:r>
+    </w:p>
+    <w:p>
+      <w:pPr>
+        <w:spacing w:line="240" w:lineRule="auto"/>
+        <w:rPr>
+          <w:rFonts w:ascii="Times New Roman" w:hAnsi="Times New Roman" w:cs="Times New Roman"/>
+        </w:rPr>
+      </w:pPr>
+      <w:r>
+        <w:rPr>
+          <w:rFonts w:ascii="Times New Roman" w:hAnsi="Times New Roman" w:cs="Times New Roman"/>
+        </w:rPr>
+        <w:t xml:space="preserve">  --default-storage-class=STANDARD</w:t>
+      </w:r>
+    </w:p>
+    <w:p>
+      <w:pPr>
+        <w:spacing w:line="240" w:lineRule="auto"/>
+        <w:rPr>
+          <w:rFonts w:ascii="Times New Roman" w:hAnsi="Times New Roman" w:cs="Times New Roman"/>
+          <w:b/>
+          <w:bCs/>
+        </w:rPr>
+      </w:pPr>
+      <w:r>
+        <w:rPr>
+          <w:rFonts w:ascii="Times New Roman" w:hAnsi="Times New Roman" w:cs="Times New Roman"/>
+        </w:rPr>
+        <w:t xml:space="preserve">Bucket name must be </w:t>
+      </w:r>
+      <w:r>
+        <w:rPr>
+          <w:rFonts w:ascii="Times New Roman" w:hAnsi="Times New Roman" w:cs="Times New Roman"/>
+          <w:b/>
+          <w:bCs/>
+        </w:rPr>
+        <w:t>globally unique</w:t>
+      </w:r>
+    </w:p>
+    <w:p>
+      <w:pPr>
+        <w:spacing w:line="240" w:lineRule="auto"/>
+        <w:rPr>
+          <w:rFonts w:ascii="Times New Roman" w:hAnsi="Times New Roman" w:cs="Times New Roman"/>
+          <w:sz w:val="28"/>
+          <w:szCs w:val="28"/>
+        </w:rPr>
+      </w:pPr>
+      <w:r>
+        <w:rPr>
+          <w:rFonts w:ascii="Times New Roman" w:hAnsi="Times New Roman" w:cs="Times New Roman"/>
+          <w:sz w:val="28"/>
+          <w:szCs w:val="28"/>
+        </w:rPr>
+        <w:t># Create Dataflow temp bucket (Dataflow requires its own bucket)</w:t>
+      </w:r>
+    </w:p>
+    <w:p>
+      <w:pPr>
+        <w:spacing w:line="240" w:lineRule="auto"/>
+        <w:rPr>
+          <w:rFonts w:ascii="Times New Roman" w:hAnsi="Times New Roman" w:cs="Times New Roman"/>
+        </w:rPr>
+      </w:pPr>
+      <w:r>
+        <w:rPr>
+          <w:rFonts w:ascii="Times New Roman" w:hAnsi="Times New Roman" w:cs="Times New Roman"/>
+        </w:rPr>
+        <w:lastRenderedPageBreak/>
+        <w:t>gcloud storage buckets create gs://%BUCKET_NAME%-dataflow-temp ^</w:t>
+      </w:r>
+    </w:p>
+    <w:p>
+      <w:pPr>
+        <w:spacing w:line="240" w:lineRule="auto"/>
+        <w:rPr>
+          <w:rFonts w:ascii="Times New Roman" w:hAnsi="Times New Roman" w:cs="Times New Roman"/>
+        </w:rPr>
+      </w:pPr>
+      <w:r>
+        <w:rPr>
+          <w:rFonts w:ascii="Times New Roman" w:hAnsi="Times New Roman" w:cs="Times New Roman"/>
+        </w:rPr>
+        <w:t xml:space="preserve">  --project=%PROJECT_ID% ^</w:t>
+      </w:r>
+    </w:p>
+    <w:p>
+      <w:pPr>
+        <w:spacing w:line="240" w:lineRule="auto"/>
+        <w:rPr>
+          <w:rFonts w:ascii="Times New Roman" w:hAnsi="Times New Roman" w:cs="Times New Roman"/>
+        </w:rPr>
+      </w:pPr>
+      <w:r>
+        <w:rPr>
+          <w:rFonts w:ascii="Times New Roman" w:hAnsi="Times New Roman" w:cs="Times New Roman"/>
+        </w:rPr>
+        <w:t xml:space="preserve">  --location=%REGION% ^</w:t>
+      </w:r>
+    </w:p>
+    <w:p>
+      <w:pPr>
+        <w:spacing w:line="240" w:lineRule="auto"/>
+        <w:rPr>
+          <w:rFonts w:ascii="Times New Roman" w:hAnsi="Times New Roman" w:cs="Times New Roman"/>
+        </w:rPr>
+      </w:pPr>
+      <w:r>
+        <w:rPr>
+          <w:rFonts w:ascii="Times New Roman" w:hAnsi="Times New Roman" w:cs="Times New Roman"/>
+        </w:rPr>
+        <w:t xml:space="preserve">  --uniform-bucket-level-access</w:t>
+      </w:r>
+    </w:p>
+    <w:p>
+      <w:pPr>
+        <w:spacing w:line="240" w:lineRule="auto"/>
+        <w:rPr>
+          <w:rFonts w:ascii="Times New Roman" w:hAnsi="Times New Roman" w:cs="Times New Roman"/>
+          <w:sz w:val="28"/>
+          <w:szCs w:val="28"/>
+        </w:rPr>
+      </w:pPr>
+      <w:r>
+        <w:rPr>
+          <w:rFonts w:ascii="Times New Roman" w:hAnsi="Times New Roman" w:cs="Times New Roman"/>
+          <w:sz w:val="28"/>
+          <w:szCs w:val="28"/>
+        </w:rPr>
+        <w:t># Create folder structure (GCS uses prefixes, not real folders)</w:t>
+      </w:r>
+    </w:p>
+    <w:p>
+      <w:pPr>
+        <w:spacing w:line="240" w:lineRule="auto"/>
+        <w:rPr>
+          <w:rFonts w:ascii="Times New Roman" w:hAnsi="Times New Roman" w:cs="Times New Roman"/>
+        </w:rPr>
+      </w:pPr>
+      <w:r>
+        <w:rPr>
+          <w:rFonts w:ascii="Times New Roman" w:hAnsi="Times New Roman" w:cs="Times New Roman"/>
+        </w:rPr>
+        <w:t>echo placeholder | gcloud storage cp - gs://%BUCKET_NAME%/raw/.keep</w:t>
+      </w:r>
+    </w:p>
+    <w:p>
+      <w:pPr>
+        <w:spacing w:line="240" w:lineRule="auto"/>
+        <w:rPr>
+          <w:rFonts w:ascii="Times New Roman" w:hAnsi="Times New Roman" w:cs="Times New Roman"/>
+        </w:rPr>
+      </w:pPr>
+      <w:r>
+        <w:rPr>
+          <w:rFonts w:ascii="Times New Roman" w:hAnsi="Times New Roman" w:cs="Times New Roman"/>
+        </w:rPr>
+        <w:t>echo placeholder | gcloud storage cp - gs://%BUCKET_NAME%/staging/.keep</w:t>
+      </w:r>
+    </w:p>
+    <w:p>
+      <w:pPr>
+        <w:spacing w:line="240" w:lineRule="auto"/>
+        <w:rPr>
+          <w:rFonts w:ascii="Times New Roman" w:hAnsi="Times New Roman" w:cs="Times New Roman"/>
+        </w:rPr>
+      </w:pPr>
+      <w:r>
+        <w:rPr>
+          <w:rFonts w:ascii="Times New Roman" w:hAnsi="Times New Roman" w:cs="Times New Roman"/>
+        </w:rPr>
+        <w:t>echo placeholder | gcloud storage cp - gs://%BUCKET_NAME%/processed/.keep</w:t>
+      </w:r>
+    </w:p>
+    <w:p>
+      <w:pPr>
+        <w:spacing w:line="240" w:lineRule="auto"/>
+        <w:rPr>
+          <w:rFonts w:ascii="Times New Roman" w:hAnsi="Times New Roman" w:cs="Times New Roman"/>
+        </w:rPr>
+      </w:pPr>
+    </w:p>
+    <w:p>
+      <w:pPr>
+        <w:spacing w:line="240" w:lineRule="auto"/>
+        <w:rPr>
+          <w:rFonts w:ascii="Times New Roman" w:hAnsi="Times New Roman" w:cs="Times New Roman"/>
+        </w:rPr>
+      </w:pPr>
+      <w:r>
+        <w:rPr>
+          <w:rFonts w:ascii="Times New Roman" w:hAnsi="Times New Roman" w:cs="Times New Roman"/>
+        </w:rPr>
+        <w:t># Grant service account access to buckets</w:t>
+      </w:r>
+    </w:p>
+    <w:p>
+      <w:pPr>
+        <w:spacing w:line="240" w:lineRule="auto"/>
+        <w:rPr>
+          <w:rFonts w:ascii="Times New Roman" w:hAnsi="Times New Roman" w:cs="Times New Roman"/>
+        </w:rPr>
+      </w:pPr>
+      <w:r>
+        <w:rPr>
+          <w:rFonts w:ascii="Times New Roman" w:hAnsi="Times New Roman" w:cs="Times New Roman"/>
+        </w:rPr>
+        <w:t>gcloud storage buckets add-iam-policy-binding gs://%BUCKET_NAME% ^</w:t>
+      </w:r>
+    </w:p>
+    <w:p>
+      <w:pPr>
+        <w:spacing w:line="240" w:lineRule="auto"/>
+        <w:rPr>
+          <w:rFonts w:ascii="Times New Roman" w:hAnsi="Times New Roman" w:cs="Times New Roman"/>
+        </w:rPr>
+      </w:pPr>
+      <w:r>
+        <w:rPr>
+          <w:rFonts w:ascii="Times New Roman" w:hAnsi="Times New Roman" w:cs="Times New Roman"/>
+        </w:rPr>
+        <w:t xml:space="preserve">  --member="serviceAccount:%SA_EMAIL%" ^</w:t>
+      </w:r>
+    </w:p>
+    <w:p>
+      <w:pPr>
+        <w:spacing w:line="240" w:lineRule="auto"/>
+        <w:rPr>
+          <w:rFonts w:ascii="Times New Roman" w:hAnsi="Times New Roman" w:cs="Times New Roman"/>
+        </w:rPr>
+      </w:pPr>
+      <w:r>
+        <w:rPr>
+          <w:rFonts w:ascii="Times New Roman" w:hAnsi="Times New Roman" w:cs="Times New Roman"/>
+        </w:rPr>
+        <w:t xml:space="preserve">  --role="roles/storage.objectAdmin"</w:t>
+      </w:r>
+    </w:p>
+    <w:p>
+      <w:pPr>
+        <w:spacing w:line="240" w:lineRule="auto"/>
+        <w:rPr>
+          <w:rFonts w:ascii="Times New Roman" w:hAnsi="Times New Roman" w:cs="Times New Roman"/>
+        </w:rPr>
+      </w:pPr>
+    </w:p>
+    <w:p>
+      <w:pPr>
+        <w:spacing w:line="240" w:lineRule="auto"/>
+        <w:rPr>
+          <w:rFonts w:ascii="Times New Roman" w:hAnsi="Times New Roman" w:cs="Times New Roman"/>
+        </w:rPr>
+      </w:pPr>
+      <w:r>
+        <w:rPr>
+          <w:rFonts w:ascii="Times New Roman" w:hAnsi="Times New Roman" w:cs="Times New Roman"/>
+        </w:rPr>
+        <w:t xml:space="preserve"># Verify buckets exist </w:t>
+      </w:r>
+    </w:p>
+    <w:p>
+      <w:pPr>
+        <w:spacing w:line="240" w:lineRule="auto"/>
+        <w:rPr>
+          <w:rFonts w:ascii="Times New Roman" w:hAnsi="Times New Roman" w:cs="Times New Roman"/>
+        </w:rPr>
+      </w:pPr>
+      <w:r>
+        <w:rPr>
+          <w:rFonts w:ascii="Times New Roman" w:hAnsi="Times New Roman" w:cs="Times New Roman"/>
+        </w:rPr>
+        <w:t>gcloud storage ls</w:t>
+      </w:r>
+    </w:p>
+    <w:p>
+      <w:pPr>
+        <w:spacing w:line="240" w:lineRule="auto"/>
+        <w:rPr>
+          <w:rFonts w:ascii="Times New Roman" w:hAnsi="Times New Roman" w:cs="Times New Roman"/>
+        </w:rPr>
+      </w:pPr>
+    </w:p>
+    <w:p>
+      <w:pPr>
+        <w:spacing w:line="240" w:lineRule="auto"/>
+        <w:rPr>
+          <w:rFonts w:ascii="Times New Roman" w:hAnsi="Times New Roman" w:cs="Times New Roman"/>
+        </w:rPr>
+      </w:pPr>
+      <w:r>
+        <w:rPr>
+          <w:rFonts w:ascii="Times New Roman" w:hAnsi="Times New Roman" w:cs="Times New Roman"/>
+          <w:b/>
+          <w:bCs/>
+        </w:rPr>
+        <w:t>## 7. Upload CSV Files to GCS (raw/)</w:t>
+      </w:r>
+    </w:p>
+    <w:p>
+      <w:pPr>
+        <w:spacing w:line="240" w:lineRule="auto"/>
+        <w:rPr>
+          <w:rFonts w:ascii="Times New Roman" w:hAnsi="Times New Roman" w:cs="Times New Roman"/>
+        </w:rPr>
+      </w:pPr>
+    </w:p>
+    <w:p>
+      <w:pPr>
+        <w:spacing w:line="240" w:lineRule="auto"/>
+        <w:rPr>
+          <w:rFonts w:ascii="Times New Roman" w:hAnsi="Times New Roman" w:cs="Times New Roman"/>
+        </w:rPr>
+      </w:pPr>
+      <w:r>
+        <w:rPr>
+          <w:rFonts w:ascii="Times New Roman" w:hAnsi="Times New Roman" w:cs="Times New Roman"/>
+        </w:rPr>
+        <w:t>```bash</w:t>
+      </w:r>
+    </w:p>
+    <w:p>
+      <w:pPr>
+        <w:spacing w:line="240" w:lineRule="auto"/>
+        <w:rPr>
+          <w:rFonts w:ascii="Times New Roman" w:hAnsi="Times New Roman" w:cs="Times New Roman"/>
+          <w:b/>
+          <w:bCs/>
+        </w:rPr>
+      </w:pPr>
+      <w:r>
+        <w:rPr>
+          <w:rFonts w:ascii="Times New Roman" w:hAnsi="Times New Roman" w:cs="Times New Roman"/>
+          <w:b/>
+          <w:bCs/>
+        </w:rPr>
+        <w:t>Set DATA_DIR with quotes</w:t>
+      </w:r>
+    </w:p>
+    <w:p>
+      <w:pPr>
+        <w:spacing w:line="240" w:lineRule="auto"/>
+        <w:rPr>
+          <w:rFonts w:ascii="Times New Roman" w:hAnsi="Times New Roman" w:cs="Times New Roman"/>
+        </w:rPr>
+      </w:pPr>
+      <w:r>
+        <w:rPr>
+          <w:rFonts w:ascii="Times New Roman" w:hAnsi="Times New Roman" w:cs="Times New Roman"/>
+        </w:rPr>
+        <w:t>set DATA_DIR="D:\GCP\Big Query\Big Query data sets\Data_Sets"</w:t>
+      </w:r>
+    </w:p>
+    <w:p>
+      <w:pPr>
+        <w:spacing w:line="240" w:lineRule="auto"/>
+        <w:rPr>
+          <w:rFonts w:ascii="Times New Roman" w:hAnsi="Times New Roman" w:cs="Times New Roman"/>
+        </w:rPr>
+      </w:pPr>
+    </w:p>
+    <w:p>
+      <w:pPr>
+        <w:spacing w:line="240" w:lineRule="auto"/>
+        <w:rPr>
+          <w:rFonts w:ascii="Times New Roman" w:hAnsi="Times New Roman" w:cs="Times New Roman"/>
+        </w:rPr>
+      </w:pPr>
+      <w:r>
+        <w:rPr>
+          <w:rFonts w:ascii="Times New Roman" w:hAnsi="Times New Roman" w:cs="Times New Roman"/>
+        </w:rPr>
+        <w:t># Option A: Upload all CSVs at once (recommended)</w:t>
+      </w:r>
+    </w:p>
+    <w:p>
+      <w:pPr>
+        <w:spacing w:line="240" w:lineRule="auto"/>
+        <w:rPr>
+          <w:rFonts w:ascii="Times New Roman" w:hAnsi="Times New Roman" w:cs="Times New Roman"/>
+        </w:rPr>
+      </w:pPr>
+      <w:r>
+        <w:rPr>
+          <w:rFonts w:ascii="Times New Roman" w:hAnsi="Times New Roman" w:cs="Times New Roman"/>
+        </w:rPr>
+        <w:t>gcloud storage cp %DATA_DIR%\*.csv gs://%BUCKET_NAME%/raw/</w:t>
+      </w:r>
+    </w:p>
+    <w:p>
+      <w:pPr>
+        <w:spacing w:line="240" w:lineRule="auto"/>
+        <w:rPr>
+          <w:rFonts w:ascii="Times New Roman" w:hAnsi="Times New Roman" w:cs="Times New Roman"/>
+        </w:rPr>
+      </w:pPr>
+    </w:p>
+    <w:p>
+      <w:pPr>
+        <w:spacing w:line="240" w:lineRule="auto"/>
+        <w:rPr>
+          <w:rFonts w:ascii="Times New Roman" w:hAnsi="Times New Roman" w:cs="Times New Roman"/>
+        </w:rPr>
+      </w:pPr>
+      <w:r>
+        <w:rPr>
+          <w:rFonts w:ascii="Times New Roman" w:hAnsi="Times New Roman" w:cs="Times New Roman"/>
+        </w:rPr>
+        <w:t># Verify all files uploaded</w:t>
+      </w:r>
+    </w:p>
+    <w:p>
+      <w:pPr>
+        <w:spacing w:line="240" w:lineRule="auto"/>
+        <w:rPr>
+          <w:rFonts w:ascii="Times New Roman" w:hAnsi="Times New Roman" w:cs="Times New Roman"/>
+        </w:rPr>
+      </w:pPr>
+      <w:r>
+        <w:rPr>
+          <w:rFonts w:ascii="Times New Roman" w:hAnsi="Times New Roman" w:cs="Times New Roman"/>
+        </w:rPr>
+        <w:t>gcloud storage ls gs://%BUCKET_NAME%/raw/</w:t>
+      </w:r>
+    </w:p>
+    <w:p>
+      <w:pPr>
+        <w:spacing w:line="240" w:lineRule="auto"/>
+        <w:rPr>
+          <w:rFonts w:ascii="Times New Roman" w:hAnsi="Times New Roman" w:cs="Times New Roman"/>
+        </w:rPr>
+      </w:pPr>
+    </w:p>
+    <w:p>
+      <w:pPr>
+        <w:spacing w:line="240" w:lineRule="auto"/>
+        <w:rPr>
+          <w:rFonts w:ascii="Times New Roman" w:hAnsi="Times New Roman" w:cs="Times New Roman"/>
+        </w:rPr>
+      </w:pPr>
+      <w:r>
+        <w:rPr>
+          <w:rFonts w:ascii="Times New Roman" w:hAnsi="Times New Roman" w:cs="Times New Roman"/>
+        </w:rPr>
+        <w:t># Check file sizes to confirm nothing is truncated</w:t>
+      </w:r>
+    </w:p>
+    <w:p>
+      <w:pPr>
+        <w:spacing w:line="240" w:lineRule="auto"/>
+        <w:rPr>
+          <w:rFonts w:ascii="Times New Roman" w:hAnsi="Times New Roman" w:cs="Times New Roman"/>
+        </w:rPr>
+      </w:pPr>
+      <w:r>
+        <w:rPr>
+          <w:rFonts w:ascii="Times New Roman" w:hAnsi="Times New Roman" w:cs="Times New Roman"/>
+        </w:rPr>
+        <w:t>gcloud storage du gs://%BUCKET_NAME%/raw/ --human-readable</w:t>
+      </w:r>
     </w:p>
     <w:sectPr>
       <w:pgSz w:w="11906" w:h="16838"/>
@@ -3115,7 +3124,6 @@
     <w:next w:val="Normal"/>
     <w:link w:val="Heading2Char"/>
     <w:uiPriority w:val="9"/>
-    <w:semiHidden/>
     <w:unhideWhenUsed/>
     <w:qFormat/>
     <w:rsid w:val="00E4511D"/>
@@ -3331,7 +3339,6 @@
     <w:basedOn w:val="DefaultParagraphFont"/>
     <w:link w:val="Heading2"/>
     <w:uiPriority w:val="9"/>
-    <w:semiHidden/>
     <w:rsid w:val="00E4511D"/>
     <w:rPr>
       <w:rFonts w:asciiTheme="majorHAnsi" w:eastAsiaTheme="majorEastAsia" w:hAnsiTheme="majorHAnsi" w:cstheme="majorBidi"/>

</xml_diff>

<commit_message>
GCP project setup, IAM, Cloud Storage, raw CSV upload
</commit_message>
<xml_diff>
--- a/steps.docx
+++ b/steps.docx
@@ -41,13 +41,23 @@
           <w:bCs/>
         </w:rPr>
       </w:pPr>
-      <w:r>
-        <w:rPr>
-          <w:rFonts w:ascii="Times New Roman" w:hAnsi="Times New Roman" w:cs="Times New Roman"/>
-          <w:b/>
-          <w:bCs/>
-        </w:rPr>
-        <w:t>gcloud version</w:t>
+      <w:proofErr w:type="spellStart"/>
+      <w:r>
+        <w:rPr>
+          <w:rFonts w:ascii="Times New Roman" w:hAnsi="Times New Roman" w:cs="Times New Roman"/>
+          <w:b/>
+          <w:bCs/>
+        </w:rPr>
+        <w:t>gcloud</w:t>
+      </w:r>
+      <w:proofErr w:type="spellEnd"/>
+      <w:r>
+        <w:rPr>
+          <w:rFonts w:ascii="Times New Roman" w:hAnsi="Times New Roman" w:cs="Times New Roman"/>
+          <w:b/>
+          <w:bCs/>
+        </w:rPr>
+        <w:t xml:space="preserve"> version</w:t>
       </w:r>
     </w:p>
     <w:p>
@@ -111,13 +121,23 @@
           <w:bCs/>
         </w:rPr>
       </w:pPr>
-      <w:r>
-        <w:rPr>
-          <w:rFonts w:ascii="Times New Roman" w:hAnsi="Times New Roman" w:cs="Times New Roman"/>
-          <w:b/>
-          <w:bCs/>
-        </w:rPr>
-        <w:t>gcloud auth login</w:t>
+      <w:proofErr w:type="spellStart"/>
+      <w:r>
+        <w:rPr>
+          <w:rFonts w:ascii="Times New Roman" w:hAnsi="Times New Roman" w:cs="Times New Roman"/>
+          <w:b/>
+          <w:bCs/>
+        </w:rPr>
+        <w:t>gcloud</w:t>
+      </w:r>
+      <w:proofErr w:type="spellEnd"/>
+      <w:r>
+        <w:rPr>
+          <w:rFonts w:ascii="Times New Roman" w:hAnsi="Times New Roman" w:cs="Times New Roman"/>
+          <w:b/>
+          <w:bCs/>
+        </w:rPr>
+        <w:t xml:space="preserve"> auth login</w:t>
       </w:r>
     </w:p>
     <w:p>
@@ -143,13 +163,23 @@
           <w:bCs/>
         </w:rPr>
       </w:pPr>
-      <w:r>
-        <w:rPr>
-          <w:rFonts w:ascii="Times New Roman" w:hAnsi="Times New Roman" w:cs="Times New Roman"/>
-          <w:b/>
-          <w:bCs/>
-        </w:rPr>
-        <w:t>gcloud auth list</w:t>
+      <w:proofErr w:type="spellStart"/>
+      <w:r>
+        <w:rPr>
+          <w:rFonts w:ascii="Times New Roman" w:hAnsi="Times New Roman" w:cs="Times New Roman"/>
+          <w:b/>
+          <w:bCs/>
+        </w:rPr>
+        <w:t>gcloud</w:t>
+      </w:r>
+      <w:proofErr w:type="spellEnd"/>
+      <w:r>
+        <w:rPr>
+          <w:rFonts w:ascii="Times New Roman" w:hAnsi="Times New Roman" w:cs="Times New Roman"/>
+          <w:b/>
+          <w:bCs/>
+        </w:rPr>
+        <w:t xml:space="preserve"> auth list</w:t>
       </w:r>
     </w:p>
     <w:p>
@@ -227,13 +257,23 @@
           <w:bCs/>
         </w:rPr>
       </w:pPr>
-      <w:r>
-        <w:rPr>
-          <w:rFonts w:ascii="Times New Roman" w:hAnsi="Times New Roman" w:cs="Times New Roman"/>
-          <w:b/>
-          <w:bCs/>
-        </w:rPr>
-        <w:t>gcloud projects create $PROJECT_ID --name="Brazilian Ecommerce Pipeline"</w:t>
+      <w:proofErr w:type="spellStart"/>
+      <w:r>
+        <w:rPr>
+          <w:rFonts w:ascii="Times New Roman" w:hAnsi="Times New Roman" w:cs="Times New Roman"/>
+          <w:b/>
+          <w:bCs/>
+        </w:rPr>
+        <w:t>gcloud</w:t>
+      </w:r>
+      <w:proofErr w:type="spellEnd"/>
+      <w:r>
+        <w:rPr>
+          <w:rFonts w:ascii="Times New Roman" w:hAnsi="Times New Roman" w:cs="Times New Roman"/>
+          <w:b/>
+          <w:bCs/>
+        </w:rPr>
+        <w:t xml:space="preserve"> projects create $PROJECT_ID --name="Brazilian Ecommerce Pipeline"</w:t>
       </w:r>
     </w:p>
     <w:p>
@@ -267,13 +307,23 @@
           <w:bCs/>
         </w:rPr>
       </w:pPr>
-      <w:r>
-        <w:rPr>
-          <w:rFonts w:ascii="Times New Roman" w:hAnsi="Times New Roman" w:cs="Times New Roman"/>
-          <w:b/>
-          <w:bCs/>
-        </w:rPr>
-        <w:t>gcloud config set project $PROJECT_ID</w:t>
+      <w:proofErr w:type="spellStart"/>
+      <w:r>
+        <w:rPr>
+          <w:rFonts w:ascii="Times New Roman" w:hAnsi="Times New Roman" w:cs="Times New Roman"/>
+          <w:b/>
+          <w:bCs/>
+        </w:rPr>
+        <w:t>gcloud</w:t>
+      </w:r>
+      <w:proofErr w:type="spellEnd"/>
+      <w:r>
+        <w:rPr>
+          <w:rFonts w:ascii="Times New Roman" w:hAnsi="Times New Roman" w:cs="Times New Roman"/>
+          <w:b/>
+          <w:bCs/>
+        </w:rPr>
+        <w:t xml:space="preserve"> config set project $PROJECT_ID</w:t>
       </w:r>
     </w:p>
     <w:p>
@@ -307,13 +357,23 @@
           <w:bCs/>
         </w:rPr>
       </w:pPr>
-      <w:r>
-        <w:rPr>
-          <w:rFonts w:ascii="Times New Roman" w:hAnsi="Times New Roman" w:cs="Times New Roman"/>
-          <w:b/>
-          <w:bCs/>
-        </w:rPr>
-        <w:t>gcloud config get-value project</w:t>
+      <w:proofErr w:type="spellStart"/>
+      <w:r>
+        <w:rPr>
+          <w:rFonts w:ascii="Times New Roman" w:hAnsi="Times New Roman" w:cs="Times New Roman"/>
+          <w:b/>
+          <w:bCs/>
+        </w:rPr>
+        <w:t>gcloud</w:t>
+      </w:r>
+      <w:proofErr w:type="spellEnd"/>
+      <w:r>
+        <w:rPr>
+          <w:rFonts w:ascii="Times New Roman" w:hAnsi="Times New Roman" w:cs="Times New Roman"/>
+          <w:b/>
+          <w:bCs/>
+        </w:rPr>
+        <w:t xml:space="preserve"> config get-value project</w:t>
       </w:r>
     </w:p>
     <w:p>
@@ -361,13 +421,23 @@
           <w:bCs/>
         </w:rPr>
       </w:pPr>
-      <w:r>
-        <w:rPr>
-          <w:rFonts w:ascii="Times New Roman" w:hAnsi="Times New Roman" w:cs="Times New Roman"/>
-          <w:b/>
-          <w:bCs/>
-        </w:rPr>
-        <w:t>gcloud billing accounts list</w:t>
+      <w:proofErr w:type="spellStart"/>
+      <w:r>
+        <w:rPr>
+          <w:rFonts w:ascii="Times New Roman" w:hAnsi="Times New Roman" w:cs="Times New Roman"/>
+          <w:b/>
+          <w:bCs/>
+        </w:rPr>
+        <w:t>gcloud</w:t>
+      </w:r>
+      <w:proofErr w:type="spellEnd"/>
+      <w:r>
+        <w:rPr>
+          <w:rFonts w:ascii="Times New Roman" w:hAnsi="Times New Roman" w:cs="Times New Roman"/>
+          <w:b/>
+          <w:bCs/>
+        </w:rPr>
+        <w:t xml:space="preserve"> billing accounts list</w:t>
       </w:r>
     </w:p>
     <w:p>
@@ -401,13 +471,23 @@
           <w:bCs/>
         </w:rPr>
       </w:pPr>
-      <w:r>
-        <w:rPr>
-          <w:rFonts w:ascii="Times New Roman" w:hAnsi="Times New Roman" w:cs="Times New Roman"/>
-          <w:b/>
-          <w:bCs/>
-        </w:rPr>
-        <w:t>gcloud billing projects link $PROJECT_ID --billing-account=BILLING_ACCOUNT_ID</w:t>
+      <w:proofErr w:type="spellStart"/>
+      <w:r>
+        <w:rPr>
+          <w:rFonts w:ascii="Times New Roman" w:hAnsi="Times New Roman" w:cs="Times New Roman"/>
+          <w:b/>
+          <w:bCs/>
+        </w:rPr>
+        <w:t>gcloud</w:t>
+      </w:r>
+      <w:proofErr w:type="spellEnd"/>
+      <w:r>
+        <w:rPr>
+          <w:rFonts w:ascii="Times New Roman" w:hAnsi="Times New Roman" w:cs="Times New Roman"/>
+          <w:b/>
+          <w:bCs/>
+        </w:rPr>
+        <w:t xml:space="preserve"> billing projects link $PROJECT_ID --billing-account=BILLING_ACCOUNT_ID</w:t>
       </w:r>
     </w:p>
     <w:p>
@@ -482,13 +562,23 @@
           <w:bCs/>
         </w:rPr>
       </w:pPr>
-      <w:r>
-        <w:rPr>
-          <w:rFonts w:ascii="Times New Roman" w:hAnsi="Times New Roman" w:cs="Times New Roman"/>
-          <w:b/>
-          <w:bCs/>
-        </w:rPr>
-        <w:t>gcloud services enable \</w:t>
+      <w:proofErr w:type="spellStart"/>
+      <w:r>
+        <w:rPr>
+          <w:rFonts w:ascii="Times New Roman" w:hAnsi="Times New Roman" w:cs="Times New Roman"/>
+          <w:b/>
+          <w:bCs/>
+        </w:rPr>
+        <w:t>gcloud</w:t>
+      </w:r>
+      <w:proofErr w:type="spellEnd"/>
+      <w:r>
+        <w:rPr>
+          <w:rFonts w:ascii="Times New Roman" w:hAnsi="Times New Roman" w:cs="Times New Roman"/>
+          <w:b/>
+          <w:bCs/>
+        </w:rPr>
+        <w:t xml:space="preserve"> services enable \</w:t>
       </w:r>
     </w:p>
     <w:p>
@@ -1045,11 +1135,19 @@
                 <w:rFonts w:ascii="Times New Roman" w:hAnsi="Times New Roman" w:cs="Times New Roman"/>
               </w:rPr>
             </w:pPr>
+            <w:proofErr w:type="spellStart"/>
             <w:r>
               <w:rPr>
                 <w:rFonts w:ascii="Times New Roman" w:hAnsi="Times New Roman" w:cs="Times New Roman"/>
               </w:rPr>
-              <w:t>BigQuery API</w:t>
+              <w:t>BigQuery</w:t>
+            </w:r>
+            <w:proofErr w:type="spellEnd"/>
+            <w:r>
+              <w:rPr>
+                <w:rFonts w:ascii="Times New Roman" w:hAnsi="Times New Roman" w:cs="Times New Roman"/>
+              </w:rPr>
+              <w:t xml:space="preserve"> API</w:t>
             </w:r>
           </w:p>
         </w:tc>
@@ -1463,13 +1561,59 @@
           <w:bCs/>
         </w:rPr>
       </w:pPr>
-      <w:r>
-        <w:rPr>
-          <w:rFonts w:ascii="Times New Roman" w:hAnsi="Times New Roman" w:cs="Times New Roman"/>
-          <w:b/>
-          <w:bCs/>
-        </w:rPr>
-        <w:t>gcloud services list --enabled --filter="name:(storage OR bigquery OR dataflow OR pubsub OR composer)"</w:t>
+      <w:proofErr w:type="spellStart"/>
+      <w:r>
+        <w:rPr>
+          <w:rFonts w:ascii="Times New Roman" w:hAnsi="Times New Roman" w:cs="Times New Roman"/>
+          <w:b/>
+          <w:bCs/>
+        </w:rPr>
+        <w:t>gcloud</w:t>
+      </w:r>
+      <w:proofErr w:type="spellEnd"/>
+      <w:r>
+        <w:rPr>
+          <w:rFonts w:ascii="Times New Roman" w:hAnsi="Times New Roman" w:cs="Times New Roman"/>
+          <w:b/>
+          <w:bCs/>
+        </w:rPr>
+        <w:t xml:space="preserve"> services list --enabled --filter="name:(storage OR </w:t>
+      </w:r>
+      <w:proofErr w:type="spellStart"/>
+      <w:r>
+        <w:rPr>
+          <w:rFonts w:ascii="Times New Roman" w:hAnsi="Times New Roman" w:cs="Times New Roman"/>
+          <w:b/>
+          <w:bCs/>
+        </w:rPr>
+        <w:t>bigquery</w:t>
+      </w:r>
+      <w:proofErr w:type="spellEnd"/>
+      <w:r>
+        <w:rPr>
+          <w:rFonts w:ascii="Times New Roman" w:hAnsi="Times New Roman" w:cs="Times New Roman"/>
+          <w:b/>
+          <w:bCs/>
+        </w:rPr>
+        <w:t xml:space="preserve"> OR dataflow OR </w:t>
+      </w:r>
+      <w:proofErr w:type="spellStart"/>
+      <w:r>
+        <w:rPr>
+          <w:rFonts w:ascii="Times New Roman" w:hAnsi="Times New Roman" w:cs="Times New Roman"/>
+          <w:b/>
+          <w:bCs/>
+        </w:rPr>
+        <w:t>pubsub</w:t>
+      </w:r>
+      <w:proofErr w:type="spellEnd"/>
+      <w:r>
+        <w:rPr>
+          <w:rFonts w:ascii="Times New Roman" w:hAnsi="Times New Roman" w:cs="Times New Roman"/>
+          <w:b/>
+          <w:bCs/>
+        </w:rPr>
+        <w:t xml:space="preserve"> OR composer)"</w:t>
       </w:r>
     </w:p>
     <w:p>
@@ -1553,11 +1697,33 @@
           <w:rFonts w:ascii="Times New Roman" w:hAnsi="Times New Roman" w:cs="Times New Roman"/>
         </w:rPr>
       </w:pPr>
-      <w:r>
-        <w:rPr>
-          <w:rFonts w:ascii="Times New Roman" w:hAnsi="Times New Roman" w:cs="Times New Roman"/>
-        </w:rPr>
-        <w:t>gcloud iam service-accounts create $SA_NAME \</w:t>
+      <w:proofErr w:type="spellStart"/>
+      <w:r>
+        <w:rPr>
+          <w:rFonts w:ascii="Times New Roman" w:hAnsi="Times New Roman" w:cs="Times New Roman"/>
+        </w:rPr>
+        <w:t>gcloud</w:t>
+      </w:r>
+      <w:proofErr w:type="spellEnd"/>
+      <w:r>
+        <w:rPr>
+          <w:rFonts w:ascii="Times New Roman" w:hAnsi="Times New Roman" w:cs="Times New Roman"/>
+        </w:rPr>
+        <w:t xml:space="preserve"> </w:t>
+      </w:r>
+      <w:proofErr w:type="spellStart"/>
+      <w:r>
+        <w:rPr>
+          <w:rFonts w:ascii="Times New Roman" w:hAnsi="Times New Roman" w:cs="Times New Roman"/>
+        </w:rPr>
+        <w:t>iam</w:t>
+      </w:r>
+      <w:proofErr w:type="spellEnd"/>
+      <w:r>
+        <w:rPr>
+          <w:rFonts w:ascii="Times New Roman" w:hAnsi="Times New Roman" w:cs="Times New Roman"/>
+        </w:rPr>
+        <w:t xml:space="preserve"> service-accounts create $SA_NAME \</w:t>
       </w:r>
     </w:p>
     <w:p>
@@ -1585,7 +1751,21 @@
         <w:rPr>
           <w:rFonts w:ascii="Times New Roman" w:hAnsi="Times New Roman" w:cs="Times New Roman"/>
         </w:rPr>
-        <w:t>  --description="Used by Dataflow, Composer, and dbt"</w:t>
+        <w:t xml:space="preserve">  --description="Used by Dataflow, Composer, and </w:t>
+      </w:r>
+      <w:proofErr w:type="spellStart"/>
+      <w:r>
+        <w:rPr>
+          <w:rFonts w:ascii="Times New Roman" w:hAnsi="Times New Roman" w:cs="Times New Roman"/>
+        </w:rPr>
+        <w:t>dbt</w:t>
+      </w:r>
+      <w:proofErr w:type="spellEnd"/>
+      <w:r>
+        <w:rPr>
+          <w:rFonts w:ascii="Times New Roman" w:hAnsi="Times New Roman" w:cs="Times New Roman"/>
+        </w:rPr>
+        <w:t>"</w:t>
       </w:r>
     </w:p>
     <w:p>
@@ -1653,283 +1833,549 @@
           <w:rFonts w:ascii="Times New Roman" w:hAnsi="Times New Roman" w:cs="Times New Roman"/>
         </w:rPr>
       </w:pPr>
-      <w:r>
-        <w:rPr>
-          <w:rFonts w:ascii="Times New Roman" w:hAnsi="Times New Roman" w:cs="Times New Roman"/>
-        </w:rPr>
-        <w:t>gcloud projects add-iam-policy-binding $PROJECT_ID \</w:t>
-      </w:r>
-    </w:p>
-    <w:p>
-      <w:pPr>
-        <w:spacing w:line="240" w:lineRule="auto"/>
-        <w:rPr>
-          <w:rFonts w:ascii="Times New Roman" w:hAnsi="Times New Roman" w:cs="Times New Roman"/>
-        </w:rPr>
-      </w:pPr>
-      <w:r>
-        <w:rPr>
-          <w:rFonts w:ascii="Times New Roman" w:hAnsi="Times New Roman" w:cs="Times New Roman"/>
-        </w:rPr>
-        <w:t>  --member="serviceAccount:${SA_EMAIL}" \</w:t>
-      </w:r>
-    </w:p>
-    <w:p>
-      <w:pPr>
-        <w:spacing w:line="240" w:lineRule="auto"/>
-        <w:rPr>
-          <w:rFonts w:ascii="Times New Roman" w:hAnsi="Times New Roman" w:cs="Times New Roman"/>
-        </w:rPr>
-      </w:pPr>
-      <w:r>
-        <w:rPr>
-          <w:rFonts w:ascii="Times New Roman" w:hAnsi="Times New Roman" w:cs="Times New Roman"/>
-        </w:rPr>
-        <w:t>  --role="roles/bigquery.dataEditor"</w:t>
-      </w:r>
-    </w:p>
-    <w:p>
-      <w:pPr>
-        <w:spacing w:line="240" w:lineRule="auto"/>
-        <w:rPr>
-          <w:rFonts w:ascii="Times New Roman" w:hAnsi="Times New Roman" w:cs="Times New Roman"/>
-        </w:rPr>
-      </w:pPr>
-    </w:p>
-    <w:p>
-      <w:pPr>
-        <w:spacing w:line="240" w:lineRule="auto"/>
-        <w:rPr>
-          <w:rFonts w:ascii="Times New Roman" w:hAnsi="Times New Roman" w:cs="Times New Roman"/>
-        </w:rPr>
-      </w:pPr>
-      <w:r>
-        <w:rPr>
-          <w:rFonts w:ascii="Times New Roman" w:hAnsi="Times New Roman" w:cs="Times New Roman"/>
-        </w:rPr>
-        <w:t>gcloud projects add-iam-policy-binding $PROJECT_ID \</w:t>
-      </w:r>
-    </w:p>
-    <w:p>
-      <w:pPr>
-        <w:spacing w:line="240" w:lineRule="auto"/>
-        <w:rPr>
-          <w:rFonts w:ascii="Times New Roman" w:hAnsi="Times New Roman" w:cs="Times New Roman"/>
-        </w:rPr>
-      </w:pPr>
-      <w:r>
-        <w:rPr>
-          <w:rFonts w:ascii="Times New Roman" w:hAnsi="Times New Roman" w:cs="Times New Roman"/>
-        </w:rPr>
-        <w:t>  --member="serviceAccount:${SA_EMAIL}" \</w:t>
-      </w:r>
-    </w:p>
-    <w:p>
-      <w:pPr>
-        <w:spacing w:line="240" w:lineRule="auto"/>
-        <w:rPr>
-          <w:rFonts w:ascii="Times New Roman" w:hAnsi="Times New Roman" w:cs="Times New Roman"/>
-        </w:rPr>
-      </w:pPr>
-      <w:r>
-        <w:rPr>
-          <w:rFonts w:ascii="Times New Roman" w:hAnsi="Times New Roman" w:cs="Times New Roman"/>
-        </w:rPr>
-        <w:t>  --role="roles/bigquery.jobUser"</w:t>
-      </w:r>
-    </w:p>
-    <w:p>
-      <w:pPr>
-        <w:spacing w:line="240" w:lineRule="auto"/>
-        <w:rPr>
-          <w:rFonts w:ascii="Times New Roman" w:hAnsi="Times New Roman" w:cs="Times New Roman"/>
-        </w:rPr>
-      </w:pPr>
-    </w:p>
-    <w:p>
-      <w:pPr>
-        <w:spacing w:line="240" w:lineRule="auto"/>
-        <w:rPr>
-          <w:rFonts w:ascii="Times New Roman" w:hAnsi="Times New Roman" w:cs="Times New Roman"/>
-        </w:rPr>
-      </w:pPr>
-      <w:r>
-        <w:rPr>
-          <w:rFonts w:ascii="Times New Roman" w:hAnsi="Times New Roman" w:cs="Times New Roman"/>
-        </w:rPr>
-        <w:t>gcloud projects add-iam-policy-binding $PROJECT_ID \</w:t>
-      </w:r>
-    </w:p>
-    <w:p>
-      <w:pPr>
-        <w:spacing w:line="240" w:lineRule="auto"/>
-        <w:rPr>
-          <w:rFonts w:ascii="Times New Roman" w:hAnsi="Times New Roman" w:cs="Times New Roman"/>
-        </w:rPr>
-      </w:pPr>
-      <w:r>
-        <w:rPr>
-          <w:rFonts w:ascii="Times New Roman" w:hAnsi="Times New Roman" w:cs="Times New Roman"/>
-        </w:rPr>
-        <w:t>  --member="serviceAccount:${SA_EMAIL}" \</w:t>
-      </w:r>
-    </w:p>
-    <w:p>
-      <w:pPr>
-        <w:spacing w:line="240" w:lineRule="auto"/>
-        <w:rPr>
-          <w:rFonts w:ascii="Times New Roman" w:hAnsi="Times New Roman" w:cs="Times New Roman"/>
-        </w:rPr>
-      </w:pPr>
-      <w:r>
-        <w:rPr>
-          <w:rFonts w:ascii="Times New Roman" w:hAnsi="Times New Roman" w:cs="Times New Roman"/>
-        </w:rPr>
-        <w:t>  --role="roles/storage.objectAdmin"</w:t>
-      </w:r>
-    </w:p>
-    <w:p>
-      <w:pPr>
-        <w:spacing w:line="240" w:lineRule="auto"/>
-        <w:rPr>
-          <w:rFonts w:ascii="Times New Roman" w:hAnsi="Times New Roman" w:cs="Times New Roman"/>
-        </w:rPr>
-      </w:pPr>
-    </w:p>
-    <w:p>
-      <w:pPr>
-        <w:spacing w:line="240" w:lineRule="auto"/>
-        <w:rPr>
-          <w:rFonts w:ascii="Times New Roman" w:hAnsi="Times New Roman" w:cs="Times New Roman"/>
-        </w:rPr>
-      </w:pPr>
-      <w:r>
-        <w:rPr>
-          <w:rFonts w:ascii="Times New Roman" w:hAnsi="Times New Roman" w:cs="Times New Roman"/>
-        </w:rPr>
-        <w:t>gcloud projects add-iam-policy-binding $PROJECT_ID \</w:t>
-      </w:r>
-    </w:p>
-    <w:p>
-      <w:pPr>
-        <w:spacing w:line="240" w:lineRule="auto"/>
-        <w:rPr>
-          <w:rFonts w:ascii="Times New Roman" w:hAnsi="Times New Roman" w:cs="Times New Roman"/>
-        </w:rPr>
-      </w:pPr>
-      <w:r>
-        <w:rPr>
-          <w:rFonts w:ascii="Times New Roman" w:hAnsi="Times New Roman" w:cs="Times New Roman"/>
-        </w:rPr>
-        <w:t>  --member="serviceAccount:${SA_EMAIL}" \</w:t>
-      </w:r>
-    </w:p>
-    <w:p>
-      <w:pPr>
-        <w:spacing w:line="240" w:lineRule="auto"/>
-        <w:rPr>
-          <w:rFonts w:ascii="Times New Roman" w:hAnsi="Times New Roman" w:cs="Times New Roman"/>
-        </w:rPr>
-      </w:pPr>
-      <w:r>
-        <w:rPr>
-          <w:rFonts w:ascii="Times New Roman" w:hAnsi="Times New Roman" w:cs="Times New Roman"/>
-        </w:rPr>
-        <w:t>  --role="roles/dataflow.worker"</w:t>
-      </w:r>
-    </w:p>
-    <w:p>
-      <w:pPr>
-        <w:spacing w:line="240" w:lineRule="auto"/>
-        <w:rPr>
-          <w:rFonts w:ascii="Times New Roman" w:hAnsi="Times New Roman" w:cs="Times New Roman"/>
-        </w:rPr>
-      </w:pPr>
-    </w:p>
-    <w:p>
-      <w:pPr>
-        <w:spacing w:line="240" w:lineRule="auto"/>
-        <w:rPr>
-          <w:rFonts w:ascii="Times New Roman" w:hAnsi="Times New Roman" w:cs="Times New Roman"/>
-        </w:rPr>
-      </w:pPr>
-      <w:r>
-        <w:rPr>
-          <w:rFonts w:ascii="Times New Roman" w:hAnsi="Times New Roman" w:cs="Times New Roman"/>
-        </w:rPr>
-        <w:t>gcloud projects add-iam-policy-binding $PROJECT_ID \</w:t>
-      </w:r>
-    </w:p>
-    <w:p>
-      <w:pPr>
-        <w:spacing w:line="240" w:lineRule="auto"/>
-        <w:rPr>
-          <w:rFonts w:ascii="Times New Roman" w:hAnsi="Times New Roman" w:cs="Times New Roman"/>
-        </w:rPr>
-      </w:pPr>
-      <w:r>
-        <w:rPr>
-          <w:rFonts w:ascii="Times New Roman" w:hAnsi="Times New Roman" w:cs="Times New Roman"/>
-        </w:rPr>
-        <w:t>  --member="serviceAccount:${SA_EMAIL}" \</w:t>
-      </w:r>
-    </w:p>
-    <w:p>
-      <w:pPr>
-        <w:spacing w:line="240" w:lineRule="auto"/>
-        <w:rPr>
-          <w:rFonts w:ascii="Times New Roman" w:hAnsi="Times New Roman" w:cs="Times New Roman"/>
-        </w:rPr>
-      </w:pPr>
-      <w:r>
-        <w:rPr>
-          <w:rFonts w:ascii="Times New Roman" w:hAnsi="Times New Roman" w:cs="Times New Roman"/>
-        </w:rPr>
-        <w:t>  --role="roles/pubsub.editor"</w:t>
-      </w:r>
-    </w:p>
-    <w:p>
-      <w:pPr>
-        <w:spacing w:line="240" w:lineRule="auto"/>
-        <w:rPr>
-          <w:rFonts w:ascii="Times New Roman" w:hAnsi="Times New Roman" w:cs="Times New Roman"/>
-        </w:rPr>
-      </w:pPr>
-    </w:p>
-    <w:p>
-      <w:pPr>
-        <w:spacing w:line="240" w:lineRule="auto"/>
-        <w:rPr>
-          <w:rFonts w:ascii="Times New Roman" w:hAnsi="Times New Roman" w:cs="Times New Roman"/>
-        </w:rPr>
-      </w:pPr>
-      <w:r>
-        <w:rPr>
-          <w:rFonts w:ascii="Times New Roman" w:hAnsi="Times New Roman" w:cs="Times New Roman"/>
-        </w:rPr>
-        <w:t>gcloud auth application-default login</w:t>
-      </w:r>
-    </w:p>
-    <w:p>
-      <w:pPr>
-        <w:spacing w:line="240" w:lineRule="auto"/>
-        <w:rPr>
-          <w:rFonts w:ascii="Times New Roman" w:hAnsi="Times New Roman" w:cs="Times New Roman"/>
-        </w:rPr>
-      </w:pPr>
-    </w:p>
-    <w:p>
-      <w:pPr>
-        <w:spacing w:line="240" w:lineRule="auto"/>
-        <w:rPr>
-          <w:rFonts w:ascii="Times New Roman" w:hAnsi="Times New Roman" w:cs="Times New Roman"/>
-        </w:rPr>
-      </w:pPr>
-      <w:r>
-        <w:rPr>
-          <w:rFonts w:ascii="Times New Roman" w:hAnsi="Times New Roman" w:cs="Times New Roman"/>
-        </w:rPr>
-        <w:t>gcloud auth application-default print-access-token</w:t>
+      <w:proofErr w:type="spellStart"/>
+      <w:r>
+        <w:rPr>
+          <w:rFonts w:ascii="Times New Roman" w:hAnsi="Times New Roman" w:cs="Times New Roman"/>
+        </w:rPr>
+        <w:t>gcloud</w:t>
+      </w:r>
+      <w:proofErr w:type="spellEnd"/>
+      <w:r>
+        <w:rPr>
+          <w:rFonts w:ascii="Times New Roman" w:hAnsi="Times New Roman" w:cs="Times New Roman"/>
+        </w:rPr>
+        <w:t xml:space="preserve"> projects add-</w:t>
+      </w:r>
+      <w:proofErr w:type="spellStart"/>
+      <w:r>
+        <w:rPr>
+          <w:rFonts w:ascii="Times New Roman" w:hAnsi="Times New Roman" w:cs="Times New Roman"/>
+        </w:rPr>
+        <w:t>iam</w:t>
+      </w:r>
+      <w:proofErr w:type="spellEnd"/>
+      <w:r>
+        <w:rPr>
+          <w:rFonts w:ascii="Times New Roman" w:hAnsi="Times New Roman" w:cs="Times New Roman"/>
+        </w:rPr>
+        <w:t>-policy-binding $PROJECT_ID \</w:t>
+      </w:r>
+    </w:p>
+    <w:p>
+      <w:pPr>
+        <w:spacing w:line="240" w:lineRule="auto"/>
+        <w:rPr>
+          <w:rFonts w:ascii="Times New Roman" w:hAnsi="Times New Roman" w:cs="Times New Roman"/>
+        </w:rPr>
+      </w:pPr>
+      <w:r>
+        <w:rPr>
+          <w:rFonts w:ascii="Times New Roman" w:hAnsi="Times New Roman" w:cs="Times New Roman"/>
+        </w:rPr>
+        <w:t>  --member="</w:t>
+      </w:r>
+      <w:proofErr w:type="spellStart"/>
+      <w:r>
+        <w:rPr>
+          <w:rFonts w:ascii="Times New Roman" w:hAnsi="Times New Roman" w:cs="Times New Roman"/>
+        </w:rPr>
+        <w:t>serviceAccount</w:t>
+      </w:r>
+      <w:proofErr w:type="spellEnd"/>
+      <w:r>
+        <w:rPr>
+          <w:rFonts w:ascii="Times New Roman" w:hAnsi="Times New Roman" w:cs="Times New Roman"/>
+        </w:rPr>
+        <w:t>:${SA_EMAIL}" \</w:t>
+      </w:r>
+    </w:p>
+    <w:p>
+      <w:pPr>
+        <w:spacing w:line="240" w:lineRule="auto"/>
+        <w:rPr>
+          <w:rFonts w:ascii="Times New Roman" w:hAnsi="Times New Roman" w:cs="Times New Roman"/>
+        </w:rPr>
+      </w:pPr>
+      <w:r>
+        <w:rPr>
+          <w:rFonts w:ascii="Times New Roman" w:hAnsi="Times New Roman" w:cs="Times New Roman"/>
+        </w:rPr>
+        <w:t>  --role="roles/</w:t>
+      </w:r>
+      <w:proofErr w:type="spellStart"/>
+      <w:r>
+        <w:rPr>
+          <w:rFonts w:ascii="Times New Roman" w:hAnsi="Times New Roman" w:cs="Times New Roman"/>
+        </w:rPr>
+        <w:t>bigquery.dataEditor</w:t>
+      </w:r>
+      <w:proofErr w:type="spellEnd"/>
+      <w:r>
+        <w:rPr>
+          <w:rFonts w:ascii="Times New Roman" w:hAnsi="Times New Roman" w:cs="Times New Roman"/>
+        </w:rPr>
+        <w:t>"</w:t>
+      </w:r>
+    </w:p>
+    <w:p>
+      <w:pPr>
+        <w:spacing w:line="240" w:lineRule="auto"/>
+        <w:rPr>
+          <w:rFonts w:ascii="Times New Roman" w:hAnsi="Times New Roman" w:cs="Times New Roman"/>
+        </w:rPr>
+      </w:pPr>
+    </w:p>
+    <w:p>
+      <w:pPr>
+        <w:spacing w:line="240" w:lineRule="auto"/>
+        <w:rPr>
+          <w:rFonts w:ascii="Times New Roman" w:hAnsi="Times New Roman" w:cs="Times New Roman"/>
+        </w:rPr>
+      </w:pPr>
+      <w:proofErr w:type="spellStart"/>
+      <w:r>
+        <w:rPr>
+          <w:rFonts w:ascii="Times New Roman" w:hAnsi="Times New Roman" w:cs="Times New Roman"/>
+        </w:rPr>
+        <w:t>gcloud</w:t>
+      </w:r>
+      <w:proofErr w:type="spellEnd"/>
+      <w:r>
+        <w:rPr>
+          <w:rFonts w:ascii="Times New Roman" w:hAnsi="Times New Roman" w:cs="Times New Roman"/>
+        </w:rPr>
+        <w:t xml:space="preserve"> projects add-</w:t>
+      </w:r>
+      <w:proofErr w:type="spellStart"/>
+      <w:r>
+        <w:rPr>
+          <w:rFonts w:ascii="Times New Roman" w:hAnsi="Times New Roman" w:cs="Times New Roman"/>
+        </w:rPr>
+        <w:t>iam</w:t>
+      </w:r>
+      <w:proofErr w:type="spellEnd"/>
+      <w:r>
+        <w:rPr>
+          <w:rFonts w:ascii="Times New Roman" w:hAnsi="Times New Roman" w:cs="Times New Roman"/>
+        </w:rPr>
+        <w:t>-policy-binding $PROJECT_ID \</w:t>
+      </w:r>
+    </w:p>
+    <w:p>
+      <w:pPr>
+        <w:spacing w:line="240" w:lineRule="auto"/>
+        <w:rPr>
+          <w:rFonts w:ascii="Times New Roman" w:hAnsi="Times New Roman" w:cs="Times New Roman"/>
+        </w:rPr>
+      </w:pPr>
+      <w:r>
+        <w:rPr>
+          <w:rFonts w:ascii="Times New Roman" w:hAnsi="Times New Roman" w:cs="Times New Roman"/>
+        </w:rPr>
+        <w:t>  --member="</w:t>
+      </w:r>
+      <w:proofErr w:type="spellStart"/>
+      <w:r>
+        <w:rPr>
+          <w:rFonts w:ascii="Times New Roman" w:hAnsi="Times New Roman" w:cs="Times New Roman"/>
+        </w:rPr>
+        <w:t>serviceAccount</w:t>
+      </w:r>
+      <w:proofErr w:type="spellEnd"/>
+      <w:r>
+        <w:rPr>
+          <w:rFonts w:ascii="Times New Roman" w:hAnsi="Times New Roman" w:cs="Times New Roman"/>
+        </w:rPr>
+        <w:t>:${SA_EMAIL}" \</w:t>
+      </w:r>
+    </w:p>
+    <w:p>
+      <w:pPr>
+        <w:spacing w:line="240" w:lineRule="auto"/>
+        <w:rPr>
+          <w:rFonts w:ascii="Times New Roman" w:hAnsi="Times New Roman" w:cs="Times New Roman"/>
+        </w:rPr>
+      </w:pPr>
+      <w:r>
+        <w:rPr>
+          <w:rFonts w:ascii="Times New Roman" w:hAnsi="Times New Roman" w:cs="Times New Roman"/>
+        </w:rPr>
+        <w:t>  --role="roles/</w:t>
+      </w:r>
+      <w:proofErr w:type="spellStart"/>
+      <w:r>
+        <w:rPr>
+          <w:rFonts w:ascii="Times New Roman" w:hAnsi="Times New Roman" w:cs="Times New Roman"/>
+        </w:rPr>
+        <w:t>bigquery.jobUser</w:t>
+      </w:r>
+      <w:proofErr w:type="spellEnd"/>
+      <w:r>
+        <w:rPr>
+          <w:rFonts w:ascii="Times New Roman" w:hAnsi="Times New Roman" w:cs="Times New Roman"/>
+        </w:rPr>
+        <w:t>"</w:t>
+      </w:r>
+    </w:p>
+    <w:p>
+      <w:pPr>
+        <w:spacing w:line="240" w:lineRule="auto"/>
+        <w:rPr>
+          <w:rFonts w:ascii="Times New Roman" w:hAnsi="Times New Roman" w:cs="Times New Roman"/>
+        </w:rPr>
+      </w:pPr>
+    </w:p>
+    <w:p>
+      <w:pPr>
+        <w:spacing w:line="240" w:lineRule="auto"/>
+        <w:rPr>
+          <w:rFonts w:ascii="Times New Roman" w:hAnsi="Times New Roman" w:cs="Times New Roman"/>
+        </w:rPr>
+      </w:pPr>
+      <w:proofErr w:type="spellStart"/>
+      <w:r>
+        <w:rPr>
+          <w:rFonts w:ascii="Times New Roman" w:hAnsi="Times New Roman" w:cs="Times New Roman"/>
+        </w:rPr>
+        <w:t>gcloud</w:t>
+      </w:r>
+      <w:proofErr w:type="spellEnd"/>
+      <w:r>
+        <w:rPr>
+          <w:rFonts w:ascii="Times New Roman" w:hAnsi="Times New Roman" w:cs="Times New Roman"/>
+        </w:rPr>
+        <w:t xml:space="preserve"> projects add-</w:t>
+      </w:r>
+      <w:proofErr w:type="spellStart"/>
+      <w:r>
+        <w:rPr>
+          <w:rFonts w:ascii="Times New Roman" w:hAnsi="Times New Roman" w:cs="Times New Roman"/>
+        </w:rPr>
+        <w:t>iam</w:t>
+      </w:r>
+      <w:proofErr w:type="spellEnd"/>
+      <w:r>
+        <w:rPr>
+          <w:rFonts w:ascii="Times New Roman" w:hAnsi="Times New Roman" w:cs="Times New Roman"/>
+        </w:rPr>
+        <w:t>-policy-binding $PROJECT_ID \</w:t>
+      </w:r>
+    </w:p>
+    <w:p>
+      <w:pPr>
+        <w:spacing w:line="240" w:lineRule="auto"/>
+        <w:rPr>
+          <w:rFonts w:ascii="Times New Roman" w:hAnsi="Times New Roman" w:cs="Times New Roman"/>
+        </w:rPr>
+      </w:pPr>
+      <w:r>
+        <w:rPr>
+          <w:rFonts w:ascii="Times New Roman" w:hAnsi="Times New Roman" w:cs="Times New Roman"/>
+        </w:rPr>
+        <w:t>  --member="</w:t>
+      </w:r>
+      <w:proofErr w:type="spellStart"/>
+      <w:r>
+        <w:rPr>
+          <w:rFonts w:ascii="Times New Roman" w:hAnsi="Times New Roman" w:cs="Times New Roman"/>
+        </w:rPr>
+        <w:t>serviceAccount</w:t>
+      </w:r>
+      <w:proofErr w:type="spellEnd"/>
+      <w:r>
+        <w:rPr>
+          <w:rFonts w:ascii="Times New Roman" w:hAnsi="Times New Roman" w:cs="Times New Roman"/>
+        </w:rPr>
+        <w:t>:${SA_EMAIL}" \</w:t>
+      </w:r>
+    </w:p>
+    <w:p>
+      <w:pPr>
+        <w:spacing w:line="240" w:lineRule="auto"/>
+        <w:rPr>
+          <w:rFonts w:ascii="Times New Roman" w:hAnsi="Times New Roman" w:cs="Times New Roman"/>
+        </w:rPr>
+      </w:pPr>
+      <w:r>
+        <w:rPr>
+          <w:rFonts w:ascii="Times New Roman" w:hAnsi="Times New Roman" w:cs="Times New Roman"/>
+        </w:rPr>
+        <w:t>  --role="roles/</w:t>
+      </w:r>
+      <w:proofErr w:type="spellStart"/>
+      <w:r>
+        <w:rPr>
+          <w:rFonts w:ascii="Times New Roman" w:hAnsi="Times New Roman" w:cs="Times New Roman"/>
+        </w:rPr>
+        <w:t>storage.objectAdmin</w:t>
+      </w:r>
+      <w:proofErr w:type="spellEnd"/>
+      <w:r>
+        <w:rPr>
+          <w:rFonts w:ascii="Times New Roman" w:hAnsi="Times New Roman" w:cs="Times New Roman"/>
+        </w:rPr>
+        <w:t>"</w:t>
+      </w:r>
+    </w:p>
+    <w:p>
+      <w:pPr>
+        <w:spacing w:line="240" w:lineRule="auto"/>
+        <w:rPr>
+          <w:rFonts w:ascii="Times New Roman" w:hAnsi="Times New Roman" w:cs="Times New Roman"/>
+        </w:rPr>
+      </w:pPr>
+    </w:p>
+    <w:p>
+      <w:pPr>
+        <w:spacing w:line="240" w:lineRule="auto"/>
+        <w:rPr>
+          <w:rFonts w:ascii="Times New Roman" w:hAnsi="Times New Roman" w:cs="Times New Roman"/>
+        </w:rPr>
+      </w:pPr>
+      <w:proofErr w:type="spellStart"/>
+      <w:r>
+        <w:rPr>
+          <w:rFonts w:ascii="Times New Roman" w:hAnsi="Times New Roman" w:cs="Times New Roman"/>
+        </w:rPr>
+        <w:t>gcloud</w:t>
+      </w:r>
+      <w:proofErr w:type="spellEnd"/>
+      <w:r>
+        <w:rPr>
+          <w:rFonts w:ascii="Times New Roman" w:hAnsi="Times New Roman" w:cs="Times New Roman"/>
+        </w:rPr>
+        <w:t xml:space="preserve"> projects add-</w:t>
+      </w:r>
+      <w:proofErr w:type="spellStart"/>
+      <w:r>
+        <w:rPr>
+          <w:rFonts w:ascii="Times New Roman" w:hAnsi="Times New Roman" w:cs="Times New Roman"/>
+        </w:rPr>
+        <w:t>iam</w:t>
+      </w:r>
+      <w:proofErr w:type="spellEnd"/>
+      <w:r>
+        <w:rPr>
+          <w:rFonts w:ascii="Times New Roman" w:hAnsi="Times New Roman" w:cs="Times New Roman"/>
+        </w:rPr>
+        <w:t>-policy-binding $PROJECT_ID \</w:t>
+      </w:r>
+    </w:p>
+    <w:p>
+      <w:pPr>
+        <w:spacing w:line="240" w:lineRule="auto"/>
+        <w:rPr>
+          <w:rFonts w:ascii="Times New Roman" w:hAnsi="Times New Roman" w:cs="Times New Roman"/>
+        </w:rPr>
+      </w:pPr>
+      <w:r>
+        <w:rPr>
+          <w:rFonts w:ascii="Times New Roman" w:hAnsi="Times New Roman" w:cs="Times New Roman"/>
+        </w:rPr>
+        <w:t>  --member="</w:t>
+      </w:r>
+      <w:proofErr w:type="spellStart"/>
+      <w:r>
+        <w:rPr>
+          <w:rFonts w:ascii="Times New Roman" w:hAnsi="Times New Roman" w:cs="Times New Roman"/>
+        </w:rPr>
+        <w:t>serviceAccount</w:t>
+      </w:r>
+      <w:proofErr w:type="spellEnd"/>
+      <w:r>
+        <w:rPr>
+          <w:rFonts w:ascii="Times New Roman" w:hAnsi="Times New Roman" w:cs="Times New Roman"/>
+        </w:rPr>
+        <w:t>:${SA_EMAIL}" \</w:t>
+      </w:r>
+    </w:p>
+    <w:p>
+      <w:pPr>
+        <w:spacing w:line="240" w:lineRule="auto"/>
+        <w:rPr>
+          <w:rFonts w:ascii="Times New Roman" w:hAnsi="Times New Roman" w:cs="Times New Roman"/>
+        </w:rPr>
+      </w:pPr>
+      <w:r>
+        <w:rPr>
+          <w:rFonts w:ascii="Times New Roman" w:hAnsi="Times New Roman" w:cs="Times New Roman"/>
+        </w:rPr>
+        <w:t>  --role="roles/</w:t>
+      </w:r>
+      <w:proofErr w:type="spellStart"/>
+      <w:r>
+        <w:rPr>
+          <w:rFonts w:ascii="Times New Roman" w:hAnsi="Times New Roman" w:cs="Times New Roman"/>
+        </w:rPr>
+        <w:t>dataflow.worker</w:t>
+      </w:r>
+      <w:proofErr w:type="spellEnd"/>
+      <w:r>
+        <w:rPr>
+          <w:rFonts w:ascii="Times New Roman" w:hAnsi="Times New Roman" w:cs="Times New Roman"/>
+        </w:rPr>
+        <w:t>"</w:t>
+      </w:r>
+    </w:p>
+    <w:p>
+      <w:pPr>
+        <w:spacing w:line="240" w:lineRule="auto"/>
+        <w:rPr>
+          <w:rFonts w:ascii="Times New Roman" w:hAnsi="Times New Roman" w:cs="Times New Roman"/>
+        </w:rPr>
+      </w:pPr>
+    </w:p>
+    <w:p>
+      <w:pPr>
+        <w:spacing w:line="240" w:lineRule="auto"/>
+        <w:rPr>
+          <w:rFonts w:ascii="Times New Roman" w:hAnsi="Times New Roman" w:cs="Times New Roman"/>
+        </w:rPr>
+      </w:pPr>
+      <w:proofErr w:type="spellStart"/>
+      <w:r>
+        <w:rPr>
+          <w:rFonts w:ascii="Times New Roman" w:hAnsi="Times New Roman" w:cs="Times New Roman"/>
+        </w:rPr>
+        <w:t>gcloud</w:t>
+      </w:r>
+      <w:proofErr w:type="spellEnd"/>
+      <w:r>
+        <w:rPr>
+          <w:rFonts w:ascii="Times New Roman" w:hAnsi="Times New Roman" w:cs="Times New Roman"/>
+        </w:rPr>
+        <w:t xml:space="preserve"> projects add-</w:t>
+      </w:r>
+      <w:proofErr w:type="spellStart"/>
+      <w:r>
+        <w:rPr>
+          <w:rFonts w:ascii="Times New Roman" w:hAnsi="Times New Roman" w:cs="Times New Roman"/>
+        </w:rPr>
+        <w:t>iam</w:t>
+      </w:r>
+      <w:proofErr w:type="spellEnd"/>
+      <w:r>
+        <w:rPr>
+          <w:rFonts w:ascii="Times New Roman" w:hAnsi="Times New Roman" w:cs="Times New Roman"/>
+        </w:rPr>
+        <w:t>-policy-binding $PROJECT_ID \</w:t>
+      </w:r>
+    </w:p>
+    <w:p>
+      <w:pPr>
+        <w:spacing w:line="240" w:lineRule="auto"/>
+        <w:rPr>
+          <w:rFonts w:ascii="Times New Roman" w:hAnsi="Times New Roman" w:cs="Times New Roman"/>
+        </w:rPr>
+      </w:pPr>
+      <w:r>
+        <w:rPr>
+          <w:rFonts w:ascii="Times New Roman" w:hAnsi="Times New Roman" w:cs="Times New Roman"/>
+        </w:rPr>
+        <w:t>  --member="</w:t>
+      </w:r>
+      <w:proofErr w:type="spellStart"/>
+      <w:r>
+        <w:rPr>
+          <w:rFonts w:ascii="Times New Roman" w:hAnsi="Times New Roman" w:cs="Times New Roman"/>
+        </w:rPr>
+        <w:t>serviceAccount</w:t>
+      </w:r>
+      <w:proofErr w:type="spellEnd"/>
+      <w:r>
+        <w:rPr>
+          <w:rFonts w:ascii="Times New Roman" w:hAnsi="Times New Roman" w:cs="Times New Roman"/>
+        </w:rPr>
+        <w:t>:${SA_EMAIL}" \</w:t>
+      </w:r>
+    </w:p>
+    <w:p>
+      <w:pPr>
+        <w:spacing w:line="240" w:lineRule="auto"/>
+        <w:rPr>
+          <w:rFonts w:ascii="Times New Roman" w:hAnsi="Times New Roman" w:cs="Times New Roman"/>
+        </w:rPr>
+      </w:pPr>
+      <w:r>
+        <w:rPr>
+          <w:rFonts w:ascii="Times New Roman" w:hAnsi="Times New Roman" w:cs="Times New Roman"/>
+        </w:rPr>
+        <w:t>  --role="roles/</w:t>
+      </w:r>
+      <w:proofErr w:type="spellStart"/>
+      <w:r>
+        <w:rPr>
+          <w:rFonts w:ascii="Times New Roman" w:hAnsi="Times New Roman" w:cs="Times New Roman"/>
+        </w:rPr>
+        <w:t>pubsub.editor</w:t>
+      </w:r>
+      <w:proofErr w:type="spellEnd"/>
+      <w:r>
+        <w:rPr>
+          <w:rFonts w:ascii="Times New Roman" w:hAnsi="Times New Roman" w:cs="Times New Roman"/>
+        </w:rPr>
+        <w:t>"</w:t>
+      </w:r>
+    </w:p>
+    <w:p>
+      <w:pPr>
+        <w:spacing w:line="240" w:lineRule="auto"/>
+        <w:rPr>
+          <w:rFonts w:ascii="Times New Roman" w:hAnsi="Times New Roman" w:cs="Times New Roman"/>
+        </w:rPr>
+      </w:pPr>
+    </w:p>
+    <w:p>
+      <w:pPr>
+        <w:spacing w:line="240" w:lineRule="auto"/>
+        <w:rPr>
+          <w:rFonts w:ascii="Times New Roman" w:hAnsi="Times New Roman" w:cs="Times New Roman"/>
+        </w:rPr>
+      </w:pPr>
+      <w:proofErr w:type="spellStart"/>
+      <w:r>
+        <w:rPr>
+          <w:rFonts w:ascii="Times New Roman" w:hAnsi="Times New Roman" w:cs="Times New Roman"/>
+        </w:rPr>
+        <w:t>gcloud</w:t>
+      </w:r>
+      <w:proofErr w:type="spellEnd"/>
+      <w:r>
+        <w:rPr>
+          <w:rFonts w:ascii="Times New Roman" w:hAnsi="Times New Roman" w:cs="Times New Roman"/>
+        </w:rPr>
+        <w:t xml:space="preserve"> auth application-default login</w:t>
+      </w:r>
+    </w:p>
+    <w:p>
+      <w:pPr>
+        <w:spacing w:line="240" w:lineRule="auto"/>
+        <w:rPr>
+          <w:rFonts w:ascii="Times New Roman" w:hAnsi="Times New Roman" w:cs="Times New Roman"/>
+        </w:rPr>
+      </w:pPr>
+    </w:p>
+    <w:p>
+      <w:pPr>
+        <w:spacing w:line="240" w:lineRule="auto"/>
+        <w:rPr>
+          <w:rFonts w:ascii="Times New Roman" w:hAnsi="Times New Roman" w:cs="Times New Roman"/>
+        </w:rPr>
+      </w:pPr>
+      <w:proofErr w:type="spellStart"/>
+      <w:r>
+        <w:rPr>
+          <w:rFonts w:ascii="Times New Roman" w:hAnsi="Times New Roman" w:cs="Times New Roman"/>
+        </w:rPr>
+        <w:t>gcloud</w:t>
+      </w:r>
+      <w:proofErr w:type="spellEnd"/>
+      <w:r>
+        <w:rPr>
+          <w:rFonts w:ascii="Times New Roman" w:hAnsi="Times New Roman" w:cs="Times New Roman"/>
+        </w:rPr>
+        <w:t xml:space="preserve"> auth application-default print-access-token</w:t>
       </w:r>
     </w:p>
     <w:p>
@@ -2057,11 +2503,19 @@
           <w:rFonts w:ascii="Times New Roman" w:hAnsi="Times New Roman" w:cs="Times New Roman"/>
         </w:rPr>
       </w:pPr>
-      <w:r>
-        <w:rPr>
-          <w:rFonts w:ascii="Times New Roman" w:hAnsi="Times New Roman" w:cs="Times New Roman"/>
-        </w:rPr>
-        <w:t>gcloud storage buckets create gs://%BUCKET_NAME% ^</w:t>
+      <w:proofErr w:type="spellStart"/>
+      <w:r>
+        <w:rPr>
+          <w:rFonts w:ascii="Times New Roman" w:hAnsi="Times New Roman" w:cs="Times New Roman"/>
+        </w:rPr>
+        <w:t>gcloud</w:t>
+      </w:r>
+      <w:proofErr w:type="spellEnd"/>
+      <w:r>
+        <w:rPr>
+          <w:rFonts w:ascii="Times New Roman" w:hAnsi="Times New Roman" w:cs="Times New Roman"/>
+        </w:rPr>
+        <w:t xml:space="preserve"> storage buckets create gs://%BUCKET_NAME% ^</w:t>
       </w:r>
     </w:p>
     <w:p>
@@ -2169,12 +2623,20 @@
           <w:rFonts w:ascii="Times New Roman" w:hAnsi="Times New Roman" w:cs="Times New Roman"/>
         </w:rPr>
       </w:pPr>
+      <w:proofErr w:type="spellStart"/>
       <w:r>
         <w:rPr>
           <w:rFonts w:ascii="Times New Roman" w:hAnsi="Times New Roman" w:cs="Times New Roman"/>
         </w:rPr>
         <w:lastRenderedPageBreak/>
-        <w:t>gcloud storage buckets create gs://%BUCKET_NAME%-dataflow-temp ^</w:t>
+        <w:t>gcloud</w:t>
+      </w:r>
+      <w:proofErr w:type="spellEnd"/>
+      <w:r>
+        <w:rPr>
+          <w:rFonts w:ascii="Times New Roman" w:hAnsi="Times New Roman" w:cs="Times New Roman"/>
+        </w:rPr>
+        <w:t xml:space="preserve"> storage buckets create gs://%BUCKET_NAME%-dataflow-temp ^</w:t>
       </w:r>
     </w:p>
     <w:p>
@@ -2248,35 +2710,77 @@
         <w:rPr>
           <w:rFonts w:ascii="Times New Roman" w:hAnsi="Times New Roman" w:cs="Times New Roman"/>
         </w:rPr>
-        <w:t>echo placeholder | gcloud storage cp - gs://%BUCKET_NAME%/raw/.keep</w:t>
-      </w:r>
-    </w:p>
-    <w:p>
-      <w:pPr>
-        <w:spacing w:line="240" w:lineRule="auto"/>
-        <w:rPr>
-          <w:rFonts w:ascii="Times New Roman" w:hAnsi="Times New Roman" w:cs="Times New Roman"/>
-        </w:rPr>
-      </w:pPr>
-      <w:r>
-        <w:rPr>
-          <w:rFonts w:ascii="Times New Roman" w:hAnsi="Times New Roman" w:cs="Times New Roman"/>
-        </w:rPr>
-        <w:t>echo placeholder | gcloud storage cp - gs://%BUCKET_NAME%/staging/.keep</w:t>
-      </w:r>
-    </w:p>
-    <w:p>
-      <w:pPr>
-        <w:spacing w:line="240" w:lineRule="auto"/>
-        <w:rPr>
-          <w:rFonts w:ascii="Times New Roman" w:hAnsi="Times New Roman" w:cs="Times New Roman"/>
-        </w:rPr>
-      </w:pPr>
-      <w:r>
-        <w:rPr>
-          <w:rFonts w:ascii="Times New Roman" w:hAnsi="Times New Roman" w:cs="Times New Roman"/>
-        </w:rPr>
-        <w:t>echo placeholder | gcloud storage cp - gs://%BUCKET_NAME%/processed/.keep</w:t>
+        <w:t xml:space="preserve">echo placeholder | </w:t>
+      </w:r>
+      <w:proofErr w:type="spellStart"/>
+      <w:r>
+        <w:rPr>
+          <w:rFonts w:ascii="Times New Roman" w:hAnsi="Times New Roman" w:cs="Times New Roman"/>
+        </w:rPr>
+        <w:t>gcloud</w:t>
+      </w:r>
+      <w:proofErr w:type="spellEnd"/>
+      <w:r>
+        <w:rPr>
+          <w:rFonts w:ascii="Times New Roman" w:hAnsi="Times New Roman" w:cs="Times New Roman"/>
+        </w:rPr>
+        <w:t xml:space="preserve"> storage cp - gs://%BUCKET_NAME%/raw/.keep</w:t>
+      </w:r>
+    </w:p>
+    <w:p>
+      <w:pPr>
+        <w:spacing w:line="240" w:lineRule="auto"/>
+        <w:rPr>
+          <w:rFonts w:ascii="Times New Roman" w:hAnsi="Times New Roman" w:cs="Times New Roman"/>
+        </w:rPr>
+      </w:pPr>
+      <w:r>
+        <w:rPr>
+          <w:rFonts w:ascii="Times New Roman" w:hAnsi="Times New Roman" w:cs="Times New Roman"/>
+        </w:rPr>
+        <w:t xml:space="preserve">echo placeholder | </w:t>
+      </w:r>
+      <w:proofErr w:type="spellStart"/>
+      <w:r>
+        <w:rPr>
+          <w:rFonts w:ascii="Times New Roman" w:hAnsi="Times New Roman" w:cs="Times New Roman"/>
+        </w:rPr>
+        <w:t>gcloud</w:t>
+      </w:r>
+      <w:proofErr w:type="spellEnd"/>
+      <w:r>
+        <w:rPr>
+          <w:rFonts w:ascii="Times New Roman" w:hAnsi="Times New Roman" w:cs="Times New Roman"/>
+        </w:rPr>
+        <w:t xml:space="preserve"> storage cp - gs://%BUCKET_NAME%/staging/.keep</w:t>
+      </w:r>
+    </w:p>
+    <w:p>
+      <w:pPr>
+        <w:spacing w:line="240" w:lineRule="auto"/>
+        <w:rPr>
+          <w:rFonts w:ascii="Times New Roman" w:hAnsi="Times New Roman" w:cs="Times New Roman"/>
+        </w:rPr>
+      </w:pPr>
+      <w:r>
+        <w:rPr>
+          <w:rFonts w:ascii="Times New Roman" w:hAnsi="Times New Roman" w:cs="Times New Roman"/>
+        </w:rPr>
+        <w:t xml:space="preserve">echo placeholder | </w:t>
+      </w:r>
+      <w:proofErr w:type="spellStart"/>
+      <w:r>
+        <w:rPr>
+          <w:rFonts w:ascii="Times New Roman" w:hAnsi="Times New Roman" w:cs="Times New Roman"/>
+        </w:rPr>
+        <w:t>gcloud</w:t>
+      </w:r>
+      <w:proofErr w:type="spellEnd"/>
+      <w:r>
+        <w:rPr>
+          <w:rFonts w:ascii="Times New Roman" w:hAnsi="Times New Roman" w:cs="Times New Roman"/>
+        </w:rPr>
+        <w:t xml:space="preserve"> storage cp - gs://%BUCKET_NAME%/processed/.keep</w:t>
       </w:r>
     </w:p>
     <w:p>
@@ -2308,39 +2812,89 @@
           <w:rFonts w:ascii="Times New Roman" w:hAnsi="Times New Roman" w:cs="Times New Roman"/>
         </w:rPr>
       </w:pPr>
-      <w:r>
-        <w:rPr>
-          <w:rFonts w:ascii="Times New Roman" w:hAnsi="Times New Roman" w:cs="Times New Roman"/>
-        </w:rPr>
-        <w:t>gcloud storage buckets add-iam-policy-binding gs://%BUCKET_NAME% ^</w:t>
-      </w:r>
-    </w:p>
-    <w:p>
-      <w:pPr>
-        <w:spacing w:line="240" w:lineRule="auto"/>
-        <w:rPr>
-          <w:rFonts w:ascii="Times New Roman" w:hAnsi="Times New Roman" w:cs="Times New Roman"/>
-        </w:rPr>
-      </w:pPr>
-      <w:r>
-        <w:rPr>
-          <w:rFonts w:ascii="Times New Roman" w:hAnsi="Times New Roman" w:cs="Times New Roman"/>
-        </w:rPr>
-        <w:t xml:space="preserve">  --member="serviceAccount:%SA_EMAIL%" ^</w:t>
-      </w:r>
-    </w:p>
-    <w:p>
-      <w:pPr>
-        <w:spacing w:line="240" w:lineRule="auto"/>
-        <w:rPr>
-          <w:rFonts w:ascii="Times New Roman" w:hAnsi="Times New Roman" w:cs="Times New Roman"/>
-        </w:rPr>
-      </w:pPr>
-      <w:r>
-        <w:rPr>
-          <w:rFonts w:ascii="Times New Roman" w:hAnsi="Times New Roman" w:cs="Times New Roman"/>
-        </w:rPr>
-        <w:t xml:space="preserve">  --role="roles/storage.objectAdmin"</w:t>
+      <w:proofErr w:type="spellStart"/>
+      <w:r>
+        <w:rPr>
+          <w:rFonts w:ascii="Times New Roman" w:hAnsi="Times New Roman" w:cs="Times New Roman"/>
+        </w:rPr>
+        <w:t>gcloud</w:t>
+      </w:r>
+      <w:proofErr w:type="spellEnd"/>
+      <w:r>
+        <w:rPr>
+          <w:rFonts w:ascii="Times New Roman" w:hAnsi="Times New Roman" w:cs="Times New Roman"/>
+        </w:rPr>
+        <w:t xml:space="preserve"> storage buckets add-</w:t>
+      </w:r>
+      <w:proofErr w:type="spellStart"/>
+      <w:r>
+        <w:rPr>
+          <w:rFonts w:ascii="Times New Roman" w:hAnsi="Times New Roman" w:cs="Times New Roman"/>
+        </w:rPr>
+        <w:t>iam</w:t>
+      </w:r>
+      <w:proofErr w:type="spellEnd"/>
+      <w:r>
+        <w:rPr>
+          <w:rFonts w:ascii="Times New Roman" w:hAnsi="Times New Roman" w:cs="Times New Roman"/>
+        </w:rPr>
+        <w:t>-policy-binding gs://%BUCKET_NAME% ^</w:t>
+      </w:r>
+    </w:p>
+    <w:p>
+      <w:pPr>
+        <w:spacing w:line="240" w:lineRule="auto"/>
+        <w:rPr>
+          <w:rFonts w:ascii="Times New Roman" w:hAnsi="Times New Roman" w:cs="Times New Roman"/>
+        </w:rPr>
+      </w:pPr>
+      <w:r>
+        <w:rPr>
+          <w:rFonts w:ascii="Times New Roman" w:hAnsi="Times New Roman" w:cs="Times New Roman"/>
+        </w:rPr>
+        <w:t xml:space="preserve">  --member="</w:t>
+      </w:r>
+      <w:proofErr w:type="spellStart"/>
+      <w:r>
+        <w:rPr>
+          <w:rFonts w:ascii="Times New Roman" w:hAnsi="Times New Roman" w:cs="Times New Roman"/>
+        </w:rPr>
+        <w:t>serviceAccount</w:t>
+      </w:r>
+      <w:proofErr w:type="spellEnd"/>
+      <w:r>
+        <w:rPr>
+          <w:rFonts w:ascii="Times New Roman" w:hAnsi="Times New Roman" w:cs="Times New Roman"/>
+        </w:rPr>
+        <w:t>:%SA_EMAIL%" ^</w:t>
+      </w:r>
+    </w:p>
+    <w:p>
+      <w:pPr>
+        <w:spacing w:line="240" w:lineRule="auto"/>
+        <w:rPr>
+          <w:rFonts w:ascii="Times New Roman" w:hAnsi="Times New Roman" w:cs="Times New Roman"/>
+        </w:rPr>
+      </w:pPr>
+      <w:r>
+        <w:rPr>
+          <w:rFonts w:ascii="Times New Roman" w:hAnsi="Times New Roman" w:cs="Times New Roman"/>
+        </w:rPr>
+        <w:t xml:space="preserve">  --role="roles/</w:t>
+      </w:r>
+      <w:proofErr w:type="spellStart"/>
+      <w:r>
+        <w:rPr>
+          <w:rFonts w:ascii="Times New Roman" w:hAnsi="Times New Roman" w:cs="Times New Roman"/>
+        </w:rPr>
+        <w:t>storage.objectAdmin</w:t>
+      </w:r>
+      <w:proofErr w:type="spellEnd"/>
+      <w:r>
+        <w:rPr>
+          <w:rFonts w:ascii="Times New Roman" w:hAnsi="Times New Roman" w:cs="Times New Roman"/>
+        </w:rPr>
+        <w:t>"</w:t>
       </w:r>
     </w:p>
     <w:p>
@@ -2372,11 +2926,19 @@
           <w:rFonts w:ascii="Times New Roman" w:hAnsi="Times New Roman" w:cs="Times New Roman"/>
         </w:rPr>
       </w:pPr>
-      <w:r>
-        <w:rPr>
-          <w:rFonts w:ascii="Times New Roman" w:hAnsi="Times New Roman" w:cs="Times New Roman"/>
-        </w:rPr>
-        <w:t>gcloud storage ls</w:t>
+      <w:proofErr w:type="spellStart"/>
+      <w:r>
+        <w:rPr>
+          <w:rFonts w:ascii="Times New Roman" w:hAnsi="Times New Roman" w:cs="Times New Roman"/>
+        </w:rPr>
+        <w:t>gcloud</w:t>
+      </w:r>
+      <w:proofErr w:type="spellEnd"/>
+      <w:r>
+        <w:rPr>
+          <w:rFonts w:ascii="Times New Roman" w:hAnsi="Times New Roman" w:cs="Times New Roman"/>
+        </w:rPr>
+        <w:t xml:space="preserve"> storage ls</w:t>
       </w:r>
     </w:p>
     <w:p>
@@ -2454,7 +3016,21 @@
         <w:rPr>
           <w:rFonts w:ascii="Times New Roman" w:hAnsi="Times New Roman" w:cs="Times New Roman"/>
         </w:rPr>
-        <w:t>set DATA_DIR="D:\GCP\Big Query\Big Query data sets\Data_Sets"</w:t>
+        <w:t>set DATA_DIR="D:\GCP\Big Query\Big Query data sets\</w:t>
+      </w:r>
+      <w:proofErr w:type="spellStart"/>
+      <w:r>
+        <w:rPr>
+          <w:rFonts w:ascii="Times New Roman" w:hAnsi="Times New Roman" w:cs="Times New Roman"/>
+        </w:rPr>
+        <w:t>Data_Sets</w:t>
+      </w:r>
+      <w:proofErr w:type="spellEnd"/>
+      <w:r>
+        <w:rPr>
+          <w:rFonts w:ascii="Times New Roman" w:hAnsi="Times New Roman" w:cs="Times New Roman"/>
+        </w:rPr>
+        <w:t>"</w:t>
       </w:r>
     </w:p>
     <w:p>
@@ -2486,11 +3062,19 @@
           <w:rFonts w:ascii="Times New Roman" w:hAnsi="Times New Roman" w:cs="Times New Roman"/>
         </w:rPr>
       </w:pPr>
-      <w:r>
-        <w:rPr>
-          <w:rFonts w:ascii="Times New Roman" w:hAnsi="Times New Roman" w:cs="Times New Roman"/>
-        </w:rPr>
-        <w:t>gcloud storage cp %DATA_DIR%\*.csv gs://%BUCKET_NAME%/raw/</w:t>
+      <w:proofErr w:type="spellStart"/>
+      <w:r>
+        <w:rPr>
+          <w:rFonts w:ascii="Times New Roman" w:hAnsi="Times New Roman" w:cs="Times New Roman"/>
+        </w:rPr>
+        <w:t>gcloud</w:t>
+      </w:r>
+      <w:proofErr w:type="spellEnd"/>
+      <w:r>
+        <w:rPr>
+          <w:rFonts w:ascii="Times New Roman" w:hAnsi="Times New Roman" w:cs="Times New Roman"/>
+        </w:rPr>
+        <w:t xml:space="preserve"> storage cp %DATA_DIR%\*.csv gs://%BUCKET_NAME%/raw/</w:t>
       </w:r>
     </w:p>
     <w:p>
@@ -2522,11 +3106,19 @@
           <w:rFonts w:ascii="Times New Roman" w:hAnsi="Times New Roman" w:cs="Times New Roman"/>
         </w:rPr>
       </w:pPr>
-      <w:r>
-        <w:rPr>
-          <w:rFonts w:ascii="Times New Roman" w:hAnsi="Times New Roman" w:cs="Times New Roman"/>
-        </w:rPr>
-        <w:t>gcloud storage ls gs://%BUCKET_NAME%/raw/</w:t>
+      <w:proofErr w:type="spellStart"/>
+      <w:r>
+        <w:rPr>
+          <w:rFonts w:ascii="Times New Roman" w:hAnsi="Times New Roman" w:cs="Times New Roman"/>
+        </w:rPr>
+        <w:t>gcloud</w:t>
+      </w:r>
+      <w:proofErr w:type="spellEnd"/>
+      <w:r>
+        <w:rPr>
+          <w:rFonts w:ascii="Times New Roman" w:hAnsi="Times New Roman" w:cs="Times New Roman"/>
+        </w:rPr>
+        <w:t xml:space="preserve"> storage ls gs://%BUCKET_NAME%/raw/</w:t>
       </w:r>
     </w:p>
     <w:p>
@@ -2558,12 +3150,1249 @@
           <w:rFonts w:ascii="Times New Roman" w:hAnsi="Times New Roman" w:cs="Times New Roman"/>
         </w:rPr>
       </w:pPr>
-      <w:r>
-        <w:rPr>
-          <w:rFonts w:ascii="Times New Roman" w:hAnsi="Times New Roman" w:cs="Times New Roman"/>
-        </w:rPr>
-        <w:t>gcloud storage du gs://%BUCKET_NAME%/raw/ --human-readable</w:t>
-      </w:r>
+      <w:proofErr w:type="spellStart"/>
+      <w:r>
+        <w:rPr>
+          <w:rFonts w:ascii="Times New Roman" w:hAnsi="Times New Roman" w:cs="Times New Roman"/>
+        </w:rPr>
+        <w:t>gcloud</w:t>
+      </w:r>
+      <w:proofErr w:type="spellEnd"/>
+      <w:r>
+        <w:rPr>
+          <w:rFonts w:ascii="Times New Roman" w:hAnsi="Times New Roman" w:cs="Times New Roman"/>
+        </w:rPr>
+        <w:t xml:space="preserve"> storage du gs://%BUCKET_NAME%/raw/ --human-readable</w:t>
+      </w:r>
+    </w:p>
+    <w:p>
+      <w:pPr>
+        <w:spacing w:line="240" w:lineRule="auto"/>
+        <w:rPr>
+          <w:rFonts w:ascii="Times New Roman" w:hAnsi="Times New Roman" w:cs="Times New Roman"/>
+        </w:rPr>
+      </w:pPr>
+    </w:p>
+    <w:p>
+      <w:pPr>
+        <w:spacing w:line="240" w:lineRule="auto"/>
+        <w:rPr>
+          <w:rFonts w:ascii="Times New Roman" w:hAnsi="Times New Roman" w:cs="Times New Roman"/>
+        </w:rPr>
+      </w:pPr>
+      <w:r>
+        <w:rPr>
+          <w:rFonts w:ascii="Times New Roman" w:hAnsi="Times New Roman" w:cs="Times New Roman"/>
+          <w:b/>
+          <w:bCs/>
+        </w:rPr>
+        <w:lastRenderedPageBreak/>
+        <w:t>## 8. Set Lifecycle Policy on Bucket (cost saving)</w:t>
+      </w:r>
+    </w:p>
+    <w:p>
+      <w:pPr>
+        <w:spacing w:line="240" w:lineRule="auto"/>
+        <w:rPr>
+          <w:rFonts w:ascii="Times New Roman" w:hAnsi="Times New Roman" w:cs="Times New Roman"/>
+        </w:rPr>
+      </w:pPr>
+    </w:p>
+    <w:p>
+      <w:pPr>
+        <w:spacing w:line="240" w:lineRule="auto"/>
+        <w:rPr>
+          <w:rFonts w:ascii="Times New Roman" w:hAnsi="Times New Roman" w:cs="Times New Roman"/>
+        </w:rPr>
+      </w:pPr>
+      <w:r>
+        <w:rPr>
+          <w:rFonts w:ascii="Times New Roman" w:hAnsi="Times New Roman" w:cs="Times New Roman"/>
+        </w:rPr>
+        <w:t>```bash</w:t>
+      </w:r>
+    </w:p>
+    <w:p>
+      <w:pPr>
+        <w:spacing w:line="240" w:lineRule="auto"/>
+        <w:rPr>
+          <w:rFonts w:ascii="Times New Roman" w:hAnsi="Times New Roman" w:cs="Times New Roman"/>
+        </w:rPr>
+      </w:pPr>
+      <w:r>
+        <w:rPr>
+          <w:rFonts w:ascii="Times New Roman" w:hAnsi="Times New Roman" w:cs="Times New Roman"/>
+        </w:rPr>
+        <w:t xml:space="preserve"># Apply lifecycle policy — moves files to Nearline after 30 days, </w:t>
+      </w:r>
+      <w:proofErr w:type="spellStart"/>
+      <w:r>
+        <w:rPr>
+          <w:rFonts w:ascii="Times New Roman" w:hAnsi="Times New Roman" w:cs="Times New Roman"/>
+        </w:rPr>
+        <w:t>Coldline</w:t>
+      </w:r>
+      <w:proofErr w:type="spellEnd"/>
+      <w:r>
+        <w:rPr>
+          <w:rFonts w:ascii="Times New Roman" w:hAnsi="Times New Roman" w:cs="Times New Roman"/>
+        </w:rPr>
+        <w:t xml:space="preserve"> after 90</w:t>
+      </w:r>
+    </w:p>
+    <w:p>
+      <w:pPr>
+        <w:spacing w:line="240" w:lineRule="auto"/>
+        <w:rPr>
+          <w:rFonts w:ascii="Times New Roman" w:hAnsi="Times New Roman" w:cs="Times New Roman"/>
+          <w:b/>
+          <w:bCs/>
+        </w:rPr>
+      </w:pPr>
+      <w:r>
+        <w:rPr>
+          <w:rFonts w:ascii="Times New Roman" w:hAnsi="Times New Roman" w:cs="Times New Roman"/>
+          <w:b/>
+          <w:bCs/>
+        </w:rPr>
+        <w:t>Step 1: Create lifecycle JSON file</w:t>
+      </w:r>
+    </w:p>
+    <w:p>
+      <w:pPr>
+        <w:spacing w:line="240" w:lineRule="auto"/>
+        <w:rPr>
+          <w:rFonts w:ascii="Times New Roman" w:hAnsi="Times New Roman" w:cs="Times New Roman"/>
+        </w:rPr>
+      </w:pPr>
+      <w:r>
+        <w:rPr>
+          <w:rFonts w:ascii="Times New Roman" w:hAnsi="Times New Roman" w:cs="Times New Roman"/>
+        </w:rPr>
+        <w:t>First create this file:</w:t>
+      </w:r>
+    </w:p>
+    <w:p>
+      <w:pPr>
+        <w:spacing w:line="240" w:lineRule="auto"/>
+        <w:rPr>
+          <w:rFonts w:ascii="Times New Roman" w:hAnsi="Times New Roman" w:cs="Times New Roman"/>
+        </w:rPr>
+      </w:pPr>
+      <w:r>
+        <w:rPr>
+          <w:rFonts w:ascii="Times New Roman" w:hAnsi="Times New Roman" w:cs="Times New Roman"/>
+        </w:rPr>
+        <w:t>D:\gcp-brazilian-pipeline\infrastructure\gcs_lifecycle.json</w:t>
+      </w:r>
+    </w:p>
+    <w:p>
+      <w:pPr>
+        <w:spacing w:line="240" w:lineRule="auto"/>
+        <w:rPr>
+          <w:rFonts w:ascii="Times New Roman" w:hAnsi="Times New Roman" w:cs="Times New Roman"/>
+        </w:rPr>
+      </w:pPr>
+      <w:r>
+        <w:rPr>
+          <w:rFonts w:ascii="Times New Roman" w:hAnsi="Times New Roman" w:cs="Times New Roman"/>
+        </w:rPr>
+        <w:t>Json:</w:t>
+      </w:r>
+    </w:p>
+    <w:p>
+      <w:pPr>
+        <w:spacing w:line="240" w:lineRule="auto"/>
+        <w:rPr>
+          <w:rFonts w:ascii="Times New Roman" w:hAnsi="Times New Roman" w:cs="Times New Roman"/>
+        </w:rPr>
+      </w:pPr>
+      <w:r>
+        <w:rPr>
+          <w:rFonts w:ascii="Times New Roman" w:hAnsi="Times New Roman" w:cs="Times New Roman"/>
+        </w:rPr>
+        <w:t>{</w:t>
+      </w:r>
+      <w:r>
+        <w:rPr>
+          <w:rFonts w:ascii="Times New Roman" w:hAnsi="Times New Roman" w:cs="Times New Roman"/>
+        </w:rPr>
+        <w:br/>
+        <w:t>"rule": [</w:t>
+      </w:r>
+      <w:r>
+        <w:rPr>
+          <w:rFonts w:ascii="Times New Roman" w:hAnsi="Times New Roman" w:cs="Times New Roman"/>
+        </w:rPr>
+        <w:br/>
+        <w:t>{</w:t>
+      </w:r>
+      <w:r>
+        <w:rPr>
+          <w:rFonts w:ascii="Times New Roman" w:hAnsi="Times New Roman" w:cs="Times New Roman"/>
+        </w:rPr>
+        <w:br/>
+        <w:t>"action": { "type": "</w:t>
+      </w:r>
+      <w:proofErr w:type="spellStart"/>
+      <w:r>
+        <w:rPr>
+          <w:rFonts w:ascii="Times New Roman" w:hAnsi="Times New Roman" w:cs="Times New Roman"/>
+        </w:rPr>
+        <w:t>SetStorageClass</w:t>
+      </w:r>
+      <w:proofErr w:type="spellEnd"/>
+      <w:r>
+        <w:rPr>
+          <w:rFonts w:ascii="Times New Roman" w:hAnsi="Times New Roman" w:cs="Times New Roman"/>
+        </w:rPr>
+        <w:t>", "</w:t>
+      </w:r>
+      <w:proofErr w:type="spellStart"/>
+      <w:r>
+        <w:rPr>
+          <w:rFonts w:ascii="Times New Roman" w:hAnsi="Times New Roman" w:cs="Times New Roman"/>
+        </w:rPr>
+        <w:t>storageClass</w:t>
+      </w:r>
+      <w:proofErr w:type="spellEnd"/>
+      <w:r>
+        <w:rPr>
+          <w:rFonts w:ascii="Times New Roman" w:hAnsi="Times New Roman" w:cs="Times New Roman"/>
+        </w:rPr>
+        <w:t>": "NEARLINE" },</w:t>
+      </w:r>
+      <w:r>
+        <w:rPr>
+          <w:rFonts w:ascii="Times New Roman" w:hAnsi="Times New Roman" w:cs="Times New Roman"/>
+        </w:rPr>
+        <w:br/>
+        <w:t>"condition": { "age": 30 }</w:t>
+      </w:r>
+      <w:r>
+        <w:rPr>
+          <w:rFonts w:ascii="Times New Roman" w:hAnsi="Times New Roman" w:cs="Times New Roman"/>
+        </w:rPr>
+        <w:br/>
+        <w:t>},</w:t>
+      </w:r>
+      <w:r>
+        <w:rPr>
+          <w:rFonts w:ascii="Times New Roman" w:hAnsi="Times New Roman" w:cs="Times New Roman"/>
+        </w:rPr>
+        <w:br/>
+        <w:t>{</w:t>
+      </w:r>
+      <w:r>
+        <w:rPr>
+          <w:rFonts w:ascii="Times New Roman" w:hAnsi="Times New Roman" w:cs="Times New Roman"/>
+        </w:rPr>
+        <w:br/>
+        <w:t>"action": { "type": "</w:t>
+      </w:r>
+      <w:proofErr w:type="spellStart"/>
+      <w:r>
+        <w:rPr>
+          <w:rFonts w:ascii="Times New Roman" w:hAnsi="Times New Roman" w:cs="Times New Roman"/>
+        </w:rPr>
+        <w:t>SetStorageClass</w:t>
+      </w:r>
+      <w:proofErr w:type="spellEnd"/>
+      <w:r>
+        <w:rPr>
+          <w:rFonts w:ascii="Times New Roman" w:hAnsi="Times New Roman" w:cs="Times New Roman"/>
+        </w:rPr>
+        <w:t>", "</w:t>
+      </w:r>
+      <w:proofErr w:type="spellStart"/>
+      <w:r>
+        <w:rPr>
+          <w:rFonts w:ascii="Times New Roman" w:hAnsi="Times New Roman" w:cs="Times New Roman"/>
+        </w:rPr>
+        <w:t>storageClass</w:t>
+      </w:r>
+      <w:proofErr w:type="spellEnd"/>
+      <w:r>
+        <w:rPr>
+          <w:rFonts w:ascii="Times New Roman" w:hAnsi="Times New Roman" w:cs="Times New Roman"/>
+        </w:rPr>
+        <w:t>": "COLDLINE" },</w:t>
+      </w:r>
+      <w:r>
+        <w:rPr>
+          <w:rFonts w:ascii="Times New Roman" w:hAnsi="Times New Roman" w:cs="Times New Roman"/>
+        </w:rPr>
+        <w:br/>
+        <w:t>"condition": { "age": 90 }</w:t>
+      </w:r>
+      <w:r>
+        <w:rPr>
+          <w:rFonts w:ascii="Times New Roman" w:hAnsi="Times New Roman" w:cs="Times New Roman"/>
+        </w:rPr>
+        <w:br/>
+        <w:t>}</w:t>
+      </w:r>
+      <w:r>
+        <w:rPr>
+          <w:rFonts w:ascii="Times New Roman" w:hAnsi="Times New Roman" w:cs="Times New Roman"/>
+        </w:rPr>
+        <w:br/>
+        <w:t>]</w:t>
+      </w:r>
+      <w:r>
+        <w:rPr>
+          <w:rFonts w:ascii="Times New Roman" w:hAnsi="Times New Roman" w:cs="Times New Roman"/>
+        </w:rPr>
+        <w:br/>
+        <w:t>}</w:t>
+      </w:r>
+    </w:p>
+    <w:p>
+      <w:pPr>
+        <w:spacing w:line="240" w:lineRule="auto"/>
+        <w:rPr>
+          <w:rFonts w:ascii="Times New Roman" w:hAnsi="Times New Roman" w:cs="Times New Roman"/>
+          <w:b/>
+          <w:bCs/>
+        </w:rPr>
+      </w:pPr>
+      <w:r>
+        <w:rPr>
+          <w:rFonts w:ascii="Times New Roman" w:hAnsi="Times New Roman" w:cs="Times New Roman"/>
+          <w:b/>
+          <w:bCs/>
+        </w:rPr>
+        <w:t>Apply lifecycle policy</w:t>
+      </w:r>
+    </w:p>
+    <w:p>
+      <w:pPr>
+        <w:spacing w:line="240" w:lineRule="auto"/>
+        <w:rPr>
+          <w:rFonts w:ascii="Times New Roman" w:hAnsi="Times New Roman" w:cs="Times New Roman"/>
+        </w:rPr>
+      </w:pPr>
+      <w:proofErr w:type="spellStart"/>
+      <w:r>
+        <w:rPr>
+          <w:rFonts w:ascii="Times New Roman" w:hAnsi="Times New Roman" w:cs="Times New Roman"/>
+        </w:rPr>
+        <w:t>gcloud</w:t>
+      </w:r>
+      <w:proofErr w:type="spellEnd"/>
+      <w:r>
+        <w:rPr>
+          <w:rFonts w:ascii="Times New Roman" w:hAnsi="Times New Roman" w:cs="Times New Roman"/>
+        </w:rPr>
+        <w:t xml:space="preserve"> storage buckets update gs://%BUCKET_NAME% --lifecycle-file=</w:t>
+      </w:r>
+      <w:r>
+        <w:rPr>
+          <w:rFonts w:ascii="Times New Roman" w:hAnsi="Times New Roman" w:cs="Times New Roman"/>
+        </w:rPr>
+        <w:t>”…\</w:t>
+      </w:r>
+      <w:r>
+        <w:rPr>
+          <w:rFonts w:ascii="Times New Roman" w:hAnsi="Times New Roman" w:cs="Times New Roman"/>
+        </w:rPr>
+        <w:t>infrastructure\</w:t>
+      </w:r>
+      <w:proofErr w:type="spellStart"/>
+      <w:r>
+        <w:rPr>
+          <w:rFonts w:ascii="Times New Roman" w:hAnsi="Times New Roman" w:cs="Times New Roman"/>
+        </w:rPr>
+        <w:t>gcs_lifecycle.json</w:t>
+      </w:r>
+      <w:proofErr w:type="spellEnd"/>
+      <w:r>
+        <w:rPr>
+          <w:rFonts w:ascii="Times New Roman" w:hAnsi="Times New Roman" w:cs="Times New Roman"/>
+        </w:rPr>
+        <w:t>”</w:t>
+      </w:r>
+    </w:p>
+    <w:p>
+      <w:pPr>
+        <w:spacing w:line="240" w:lineRule="auto"/>
+        <w:rPr>
+          <w:rFonts w:ascii="Times New Roman" w:hAnsi="Times New Roman" w:cs="Times New Roman"/>
+        </w:rPr>
+      </w:pPr>
+      <w:r>
+        <w:rPr>
+          <w:rFonts w:ascii="Times New Roman" w:hAnsi="Times New Roman" w:cs="Times New Roman"/>
+        </w:rPr>
+        <w:t>Verify policy</w:t>
+      </w:r>
+      <w:r>
+        <w:rPr>
+          <w:rFonts w:ascii="Times New Roman" w:hAnsi="Times New Roman" w:cs="Times New Roman"/>
+        </w:rPr>
+        <w:t>:</w:t>
+      </w:r>
+    </w:p>
+    <w:p>
+      <w:pPr>
+        <w:spacing w:line="240" w:lineRule="auto"/>
+        <w:rPr>
+          <w:rFonts w:ascii="Times New Roman" w:hAnsi="Times New Roman" w:cs="Times New Roman"/>
+        </w:rPr>
+      </w:pPr>
+      <w:proofErr w:type="spellStart"/>
+      <w:r>
+        <w:rPr>
+          <w:rFonts w:ascii="Times New Roman" w:hAnsi="Times New Roman" w:cs="Times New Roman"/>
+        </w:rPr>
+        <w:t>gcloud</w:t>
+      </w:r>
+      <w:proofErr w:type="spellEnd"/>
+      <w:r>
+        <w:rPr>
+          <w:rFonts w:ascii="Times New Roman" w:hAnsi="Times New Roman" w:cs="Times New Roman"/>
+        </w:rPr>
+        <w:t xml:space="preserve"> storage buckets describe gs://%BUCKET_NAME% --format="</w:t>
+      </w:r>
+      <w:proofErr w:type="spellStart"/>
+      <w:r>
+        <w:rPr>
+          <w:rFonts w:ascii="Times New Roman" w:hAnsi="Times New Roman" w:cs="Times New Roman"/>
+        </w:rPr>
+        <w:t>json</w:t>
+      </w:r>
+      <w:proofErr w:type="spellEnd"/>
+      <w:r>
+        <w:rPr>
+          <w:rFonts w:ascii="Times New Roman" w:hAnsi="Times New Roman" w:cs="Times New Roman"/>
+        </w:rPr>
+        <w:t>"</w:t>
+      </w:r>
+    </w:p>
+    <w:p>
+      <w:pPr>
+        <w:spacing w:line="240" w:lineRule="auto"/>
+        <w:rPr>
+          <w:rFonts w:ascii="Times New Roman" w:hAnsi="Times New Roman" w:cs="Times New Roman"/>
+        </w:rPr>
+      </w:pPr>
+      <w:r>
+        <w:rPr>
+          <w:rFonts w:ascii="Times New Roman" w:hAnsi="Times New Roman" w:cs="Times New Roman"/>
+          <w:b/>
+          <w:bCs/>
+        </w:rPr>
+        <w:t>9. Set Up Git + GitHub</w:t>
+      </w:r>
+    </w:p>
+    <w:p>
+      <w:pPr>
+        <w:spacing w:line="240" w:lineRule="auto"/>
+        <w:rPr>
+          <w:rFonts w:ascii="Times New Roman" w:hAnsi="Times New Roman" w:cs="Times New Roman"/>
+        </w:rPr>
+      </w:pPr>
+    </w:p>
+    <w:p>
+      <w:pPr>
+        <w:spacing w:line="240" w:lineRule="auto"/>
+        <w:rPr>
+          <w:rFonts w:ascii="Times New Roman" w:hAnsi="Times New Roman" w:cs="Times New Roman"/>
+        </w:rPr>
+      </w:pPr>
+      <w:r>
+        <w:rPr>
+          <w:rFonts w:ascii="Times New Roman" w:hAnsi="Times New Roman" w:cs="Times New Roman"/>
+        </w:rPr>
+        <w:t>```bash</w:t>
+      </w:r>
+    </w:p>
+    <w:p>
+      <w:pPr>
+        <w:spacing w:line="240" w:lineRule="auto"/>
+        <w:rPr>
+          <w:rFonts w:ascii="Times New Roman" w:hAnsi="Times New Roman" w:cs="Times New Roman"/>
+        </w:rPr>
+      </w:pPr>
+      <w:r>
+        <w:rPr>
+          <w:rFonts w:ascii="Times New Roman" w:hAnsi="Times New Roman" w:cs="Times New Roman"/>
+        </w:rPr>
+        <w:t># Inside the project folder</w:t>
+      </w:r>
+    </w:p>
+    <w:p>
+      <w:pPr>
+        <w:spacing w:line="240" w:lineRule="auto"/>
+        <w:rPr>
+          <w:rFonts w:ascii="Times New Roman" w:hAnsi="Times New Roman" w:cs="Times New Roman"/>
+        </w:rPr>
+      </w:pPr>
+      <w:r>
+        <w:rPr>
+          <w:rFonts w:ascii="Times New Roman" w:hAnsi="Times New Roman" w:cs="Times New Roman"/>
+        </w:rPr>
+        <w:t xml:space="preserve">cd </w:t>
+      </w:r>
+      <w:proofErr w:type="spellStart"/>
+      <w:r>
+        <w:rPr>
+          <w:rFonts w:ascii="Times New Roman" w:hAnsi="Times New Roman" w:cs="Times New Roman"/>
+        </w:rPr>
+        <w:t>gcp</w:t>
+      </w:r>
+      <w:proofErr w:type="spellEnd"/>
+      <w:r>
+        <w:rPr>
+          <w:rFonts w:ascii="Times New Roman" w:hAnsi="Times New Roman" w:cs="Times New Roman"/>
+        </w:rPr>
+        <w:t>-</w:t>
+      </w:r>
+      <w:proofErr w:type="spellStart"/>
+      <w:r>
+        <w:rPr>
+          <w:rFonts w:ascii="Times New Roman" w:hAnsi="Times New Roman" w:cs="Times New Roman"/>
+        </w:rPr>
+        <w:t>brazilian</w:t>
+      </w:r>
+      <w:proofErr w:type="spellEnd"/>
+      <w:r>
+        <w:rPr>
+          <w:rFonts w:ascii="Times New Roman" w:hAnsi="Times New Roman" w:cs="Times New Roman"/>
+        </w:rPr>
+        <w:t>-ecommerce-pipeline</w:t>
+      </w:r>
+    </w:p>
+    <w:p>
+      <w:pPr>
+        <w:spacing w:line="240" w:lineRule="auto"/>
+        <w:rPr>
+          <w:rFonts w:ascii="Times New Roman" w:hAnsi="Times New Roman" w:cs="Times New Roman"/>
+        </w:rPr>
+      </w:pPr>
+    </w:p>
+    <w:p>
+      <w:pPr>
+        <w:spacing w:line="240" w:lineRule="auto"/>
+        <w:rPr>
+          <w:rFonts w:ascii="Times New Roman" w:hAnsi="Times New Roman" w:cs="Times New Roman"/>
+        </w:rPr>
+      </w:pPr>
+      <w:r>
+        <w:rPr>
+          <w:rFonts w:ascii="Times New Roman" w:hAnsi="Times New Roman" w:cs="Times New Roman"/>
+        </w:rPr>
+        <w:t xml:space="preserve">git </w:t>
+      </w:r>
+      <w:proofErr w:type="spellStart"/>
+      <w:r>
+        <w:rPr>
+          <w:rFonts w:ascii="Times New Roman" w:hAnsi="Times New Roman" w:cs="Times New Roman"/>
+        </w:rPr>
+        <w:t>init</w:t>
+      </w:r>
+      <w:proofErr w:type="spellEnd"/>
+    </w:p>
+    <w:p>
+      <w:pPr>
+        <w:spacing w:line="240" w:lineRule="auto"/>
+        <w:rPr>
+          <w:rFonts w:ascii="Times New Roman" w:hAnsi="Times New Roman" w:cs="Times New Roman"/>
+        </w:rPr>
+      </w:pPr>
+      <w:r>
+        <w:rPr>
+          <w:rFonts w:ascii="Times New Roman" w:hAnsi="Times New Roman" w:cs="Times New Roman"/>
+        </w:rPr>
+        <w:t>git add .</w:t>
+      </w:r>
+    </w:p>
+    <w:p>
+      <w:pPr>
+        <w:spacing w:line="240" w:lineRule="auto"/>
+        <w:rPr>
+          <w:rFonts w:ascii="Times New Roman" w:hAnsi="Times New Roman" w:cs="Times New Roman"/>
+        </w:rPr>
+      </w:pPr>
+    </w:p>
+    <w:p>
+      <w:pPr>
+        <w:spacing w:line="240" w:lineRule="auto"/>
+        <w:rPr>
+          <w:rFonts w:ascii="Times New Roman" w:hAnsi="Times New Roman" w:cs="Times New Roman"/>
+        </w:rPr>
+      </w:pPr>
+      <w:r>
+        <w:rPr>
+          <w:rFonts w:ascii="Times New Roman" w:hAnsi="Times New Roman" w:cs="Times New Roman"/>
+        </w:rPr>
+        <w:t># IMPORTANT: Make sure credentials/ is in .</w:t>
+      </w:r>
+      <w:proofErr w:type="spellStart"/>
+      <w:r>
+        <w:rPr>
+          <w:rFonts w:ascii="Times New Roman" w:hAnsi="Times New Roman" w:cs="Times New Roman"/>
+        </w:rPr>
+        <w:t>gitignore</w:t>
+      </w:r>
+      <w:proofErr w:type="spellEnd"/>
+      <w:r>
+        <w:rPr>
+          <w:rFonts w:ascii="Times New Roman" w:hAnsi="Times New Roman" w:cs="Times New Roman"/>
+        </w:rPr>
+        <w:t xml:space="preserve"> before committing</w:t>
+      </w:r>
+    </w:p>
+    <w:p>
+      <w:pPr>
+        <w:spacing w:line="240" w:lineRule="auto"/>
+        <w:rPr>
+          <w:rFonts w:ascii="Times New Roman" w:hAnsi="Times New Roman" w:cs="Times New Roman"/>
+        </w:rPr>
+      </w:pPr>
+      <w:r>
+        <w:rPr>
+          <w:rFonts w:ascii="Times New Roman" w:hAnsi="Times New Roman" w:cs="Times New Roman"/>
+        </w:rPr>
+        <w:t>grep "credentials/" .</w:t>
+      </w:r>
+      <w:proofErr w:type="spellStart"/>
+      <w:r>
+        <w:rPr>
+          <w:rFonts w:ascii="Times New Roman" w:hAnsi="Times New Roman" w:cs="Times New Roman"/>
+        </w:rPr>
+        <w:t>gitignore</w:t>
+      </w:r>
+      <w:proofErr w:type="spellEnd"/>
+      <w:r>
+        <w:rPr>
+          <w:rFonts w:ascii="Times New Roman" w:hAnsi="Times New Roman" w:cs="Times New Roman"/>
+        </w:rPr>
+        <w:t xml:space="preserve">   # should print "credentials/"</w:t>
+      </w:r>
+    </w:p>
+    <w:p>
+      <w:pPr>
+        <w:spacing w:line="240" w:lineRule="auto"/>
+        <w:rPr>
+          <w:rFonts w:ascii="Times New Roman" w:hAnsi="Times New Roman" w:cs="Times New Roman"/>
+        </w:rPr>
+      </w:pPr>
+    </w:p>
+    <w:p>
+      <w:pPr>
+        <w:spacing w:line="240" w:lineRule="auto"/>
+        <w:rPr>
+          <w:rFonts w:ascii="Times New Roman" w:hAnsi="Times New Roman" w:cs="Times New Roman"/>
+        </w:rPr>
+      </w:pPr>
+      <w:r>
+        <w:rPr>
+          <w:rFonts w:ascii="Times New Roman" w:hAnsi="Times New Roman" w:cs="Times New Roman"/>
+        </w:rPr>
+        <w:t>git commit -m "feat: Day 1 — GCP project setup, IAM, Cloud Storage, raw CSV upload"</w:t>
+      </w:r>
+    </w:p>
+    <w:p>
+      <w:pPr>
+        <w:spacing w:line="240" w:lineRule="auto"/>
+        <w:rPr>
+          <w:rFonts w:ascii="Times New Roman" w:hAnsi="Times New Roman" w:cs="Times New Roman"/>
+        </w:rPr>
+      </w:pPr>
+    </w:p>
+    <w:p>
+      <w:pPr>
+        <w:spacing w:line="240" w:lineRule="auto"/>
+        <w:rPr>
+          <w:rFonts w:ascii="Times New Roman" w:hAnsi="Times New Roman" w:cs="Times New Roman"/>
+        </w:rPr>
+      </w:pPr>
+      <w:r>
+        <w:rPr>
+          <w:rFonts w:ascii="Times New Roman" w:hAnsi="Times New Roman" w:cs="Times New Roman"/>
+        </w:rPr>
+        <w:t># Create repo on GitHub (if you have GitHub CLI)</w:t>
+      </w:r>
+    </w:p>
+    <w:p>
+      <w:pPr>
+        <w:spacing w:line="240" w:lineRule="auto"/>
+        <w:rPr>
+          <w:rFonts w:ascii="Times New Roman" w:hAnsi="Times New Roman" w:cs="Times New Roman"/>
+        </w:rPr>
+      </w:pPr>
+      <w:proofErr w:type="spellStart"/>
+      <w:r>
+        <w:rPr>
+          <w:rFonts w:ascii="Times New Roman" w:hAnsi="Times New Roman" w:cs="Times New Roman"/>
+        </w:rPr>
+        <w:t>gh</w:t>
+      </w:r>
+      <w:proofErr w:type="spellEnd"/>
+      <w:r>
+        <w:rPr>
+          <w:rFonts w:ascii="Times New Roman" w:hAnsi="Times New Roman" w:cs="Times New Roman"/>
+        </w:rPr>
+        <w:t xml:space="preserve"> repo create </w:t>
+      </w:r>
+      <w:proofErr w:type="spellStart"/>
+      <w:r>
+        <w:rPr>
+          <w:rFonts w:ascii="Times New Roman" w:hAnsi="Times New Roman" w:cs="Times New Roman"/>
+        </w:rPr>
+        <w:t>gcp</w:t>
+      </w:r>
+      <w:proofErr w:type="spellEnd"/>
+      <w:r>
+        <w:rPr>
+          <w:rFonts w:ascii="Times New Roman" w:hAnsi="Times New Roman" w:cs="Times New Roman"/>
+        </w:rPr>
+        <w:t>-</w:t>
+      </w:r>
+      <w:proofErr w:type="spellStart"/>
+      <w:r>
+        <w:rPr>
+          <w:rFonts w:ascii="Times New Roman" w:hAnsi="Times New Roman" w:cs="Times New Roman"/>
+        </w:rPr>
+        <w:t>brazilian</w:t>
+      </w:r>
+      <w:proofErr w:type="spellEnd"/>
+      <w:r>
+        <w:rPr>
+          <w:rFonts w:ascii="Times New Roman" w:hAnsi="Times New Roman" w:cs="Times New Roman"/>
+        </w:rPr>
+        <w:t>-ecommerce-pipeline --public --source=. --remote=origin --push</w:t>
+      </w:r>
+    </w:p>
+    <w:p>
+      <w:pPr>
+        <w:spacing w:line="240" w:lineRule="auto"/>
+        <w:rPr>
+          <w:rFonts w:ascii="Times New Roman" w:hAnsi="Times New Roman" w:cs="Times New Roman"/>
+        </w:rPr>
+      </w:pPr>
+    </w:p>
+    <w:p>
+      <w:pPr>
+        <w:spacing w:line="240" w:lineRule="auto"/>
+        <w:rPr>
+          <w:rFonts w:ascii="Times New Roman" w:hAnsi="Times New Roman" w:cs="Times New Roman"/>
+        </w:rPr>
+      </w:pPr>
+      <w:r>
+        <w:rPr>
+          <w:rFonts w:ascii="Times New Roman" w:hAnsi="Times New Roman" w:cs="Times New Roman"/>
+        </w:rPr>
+        <w:t># Or manually: go to github.com → New Repository → then:</w:t>
+      </w:r>
+    </w:p>
+    <w:p>
+      <w:pPr>
+        <w:spacing w:line="240" w:lineRule="auto"/>
+        <w:rPr>
+          <w:rFonts w:ascii="Times New Roman" w:hAnsi="Times New Roman" w:cs="Times New Roman"/>
+        </w:rPr>
+      </w:pPr>
+      <w:r>
+        <w:rPr>
+          <w:rFonts w:ascii="Times New Roman" w:hAnsi="Times New Roman" w:cs="Times New Roman"/>
+        </w:rPr>
+        <w:t>git remote add origin https://github.com/YOUR_USERNAME/gcp-brazilian-ecommerce-pipeline.git</w:t>
+      </w:r>
+    </w:p>
+    <w:p>
+      <w:pPr>
+        <w:spacing w:line="240" w:lineRule="auto"/>
+        <w:rPr>
+          <w:rFonts w:ascii="Times New Roman" w:hAnsi="Times New Roman" w:cs="Times New Roman"/>
+        </w:rPr>
+      </w:pPr>
+      <w:r>
+        <w:rPr>
+          <w:rFonts w:ascii="Times New Roman" w:hAnsi="Times New Roman" w:cs="Times New Roman"/>
+        </w:rPr>
+        <w:t>git branch -M main</w:t>
+      </w:r>
+    </w:p>
+    <w:p>
+      <w:pPr>
+        <w:spacing w:line="240" w:lineRule="auto"/>
+        <w:rPr>
+          <w:rFonts w:ascii="Times New Roman" w:hAnsi="Times New Roman" w:cs="Times New Roman"/>
+        </w:rPr>
+      </w:pPr>
+      <w:r>
+        <w:rPr>
+          <w:rFonts w:ascii="Times New Roman" w:hAnsi="Times New Roman" w:cs="Times New Roman"/>
+        </w:rPr>
+        <w:t>git push -u origin main</w:t>
+      </w:r>
+    </w:p>
+    <w:p>
+      <w:pPr>
+        <w:spacing w:line="240" w:lineRule="auto"/>
+        <w:rPr>
+          <w:rFonts w:ascii="Times New Roman" w:hAnsi="Times New Roman" w:cs="Times New Roman"/>
+        </w:rPr>
+      </w:pPr>
+      <w:r>
+        <w:rPr>
+          <w:rFonts w:ascii="Times New Roman" w:hAnsi="Times New Roman" w:cs="Times New Roman"/>
+        </w:rPr>
+        <w:t>```</w:t>
+      </w:r>
+    </w:p>
+    <w:p>
+      <w:pPr>
+        <w:spacing w:line="240" w:lineRule="auto"/>
+        <w:rPr>
+          <w:rFonts w:ascii="Times New Roman" w:hAnsi="Times New Roman" w:cs="Times New Roman"/>
+        </w:rPr>
+      </w:pPr>
+      <w:r>
+        <w:rPr>
+          <w:rFonts w:ascii="Times New Roman" w:hAnsi="Times New Roman" w:cs="Times New Roman"/>
+          <w:b/>
+          <w:bCs/>
+        </w:rPr>
+        <w:t>10. Verify Everything</w:t>
+      </w:r>
+    </w:p>
+    <w:p>
+      <w:pPr>
+        <w:spacing w:line="240" w:lineRule="auto"/>
+        <w:rPr>
+          <w:rFonts w:ascii="Times New Roman" w:hAnsi="Times New Roman" w:cs="Times New Roman"/>
+        </w:rPr>
+      </w:pPr>
+    </w:p>
+    <w:p>
+      <w:pPr>
+        <w:spacing w:line="240" w:lineRule="auto"/>
+        <w:rPr>
+          <w:rFonts w:ascii="Times New Roman" w:hAnsi="Times New Roman" w:cs="Times New Roman"/>
+        </w:rPr>
+      </w:pPr>
+      <w:r>
+        <w:rPr>
+          <w:rFonts w:ascii="Times New Roman" w:hAnsi="Times New Roman" w:cs="Times New Roman"/>
+        </w:rPr>
+        <w:t>```bash</w:t>
+      </w:r>
+    </w:p>
+    <w:p>
+      <w:pPr>
+        <w:spacing w:line="240" w:lineRule="auto"/>
+        <w:rPr>
+          <w:rFonts w:ascii="Times New Roman" w:hAnsi="Times New Roman" w:cs="Times New Roman"/>
+        </w:rPr>
+      </w:pPr>
+      <w:r>
+        <w:rPr>
+          <w:rFonts w:ascii="Times New Roman" w:hAnsi="Times New Roman" w:cs="Times New Roman"/>
+        </w:rPr>
+        <w:t># Check project</w:t>
+      </w:r>
+    </w:p>
+    <w:p>
+      <w:pPr>
+        <w:spacing w:line="240" w:lineRule="auto"/>
+        <w:rPr>
+          <w:rFonts w:ascii="Times New Roman" w:hAnsi="Times New Roman" w:cs="Times New Roman"/>
+        </w:rPr>
+      </w:pPr>
+      <w:proofErr w:type="spellStart"/>
+      <w:r>
+        <w:rPr>
+          <w:rFonts w:ascii="Times New Roman" w:hAnsi="Times New Roman" w:cs="Times New Roman"/>
+        </w:rPr>
+        <w:t>gcloud</w:t>
+      </w:r>
+      <w:proofErr w:type="spellEnd"/>
+      <w:r>
+        <w:rPr>
+          <w:rFonts w:ascii="Times New Roman" w:hAnsi="Times New Roman" w:cs="Times New Roman"/>
+        </w:rPr>
+        <w:t xml:space="preserve"> config get-value project</w:t>
+      </w:r>
+    </w:p>
+    <w:p>
+      <w:pPr>
+        <w:spacing w:line="240" w:lineRule="auto"/>
+        <w:rPr>
+          <w:rFonts w:ascii="Times New Roman" w:hAnsi="Times New Roman" w:cs="Times New Roman"/>
+        </w:rPr>
+      </w:pPr>
+    </w:p>
+    <w:p>
+      <w:pPr>
+        <w:spacing w:line="240" w:lineRule="auto"/>
+        <w:rPr>
+          <w:rFonts w:ascii="Times New Roman" w:hAnsi="Times New Roman" w:cs="Times New Roman"/>
+        </w:rPr>
+      </w:pPr>
+      <w:r>
+        <w:rPr>
+          <w:rFonts w:ascii="Times New Roman" w:hAnsi="Times New Roman" w:cs="Times New Roman"/>
+        </w:rPr>
+        <w:t># Check APIs enabled</w:t>
+      </w:r>
+    </w:p>
+    <w:p>
+      <w:pPr>
+        <w:spacing w:line="240" w:lineRule="auto"/>
+        <w:rPr>
+          <w:rFonts w:ascii="Times New Roman" w:hAnsi="Times New Roman" w:cs="Times New Roman"/>
+        </w:rPr>
+      </w:pPr>
+      <w:proofErr w:type="spellStart"/>
+      <w:r>
+        <w:rPr>
+          <w:rFonts w:ascii="Times New Roman" w:hAnsi="Times New Roman" w:cs="Times New Roman"/>
+        </w:rPr>
+        <w:t>gcloud</w:t>
+      </w:r>
+      <w:proofErr w:type="spellEnd"/>
+      <w:r>
+        <w:rPr>
+          <w:rFonts w:ascii="Times New Roman" w:hAnsi="Times New Roman" w:cs="Times New Roman"/>
+        </w:rPr>
+        <w:t xml:space="preserve"> services list --enabled | grep -E "(</w:t>
+      </w:r>
+      <w:proofErr w:type="spellStart"/>
+      <w:r>
+        <w:rPr>
+          <w:rFonts w:ascii="Times New Roman" w:hAnsi="Times New Roman" w:cs="Times New Roman"/>
+        </w:rPr>
+        <w:t>storage|bigquery|dataflow|pubsub|composer</w:t>
+      </w:r>
+      <w:proofErr w:type="spellEnd"/>
+      <w:r>
+        <w:rPr>
+          <w:rFonts w:ascii="Times New Roman" w:hAnsi="Times New Roman" w:cs="Times New Roman"/>
+        </w:rPr>
+        <w:t>)"</w:t>
+      </w:r>
+    </w:p>
+    <w:p>
+      <w:pPr>
+        <w:spacing w:line="240" w:lineRule="auto"/>
+        <w:rPr>
+          <w:rFonts w:ascii="Times New Roman" w:hAnsi="Times New Roman" w:cs="Times New Roman"/>
+        </w:rPr>
+      </w:pPr>
+    </w:p>
+    <w:p>
+      <w:pPr>
+        <w:spacing w:line="240" w:lineRule="auto"/>
+        <w:rPr>
+          <w:rFonts w:ascii="Times New Roman" w:hAnsi="Times New Roman" w:cs="Times New Roman"/>
+        </w:rPr>
+      </w:pPr>
+      <w:r>
+        <w:rPr>
+          <w:rFonts w:ascii="Times New Roman" w:hAnsi="Times New Roman" w:cs="Times New Roman"/>
+        </w:rPr>
+        <w:t># Check service account exists</w:t>
+      </w:r>
+    </w:p>
+    <w:p>
+      <w:pPr>
+        <w:spacing w:line="240" w:lineRule="auto"/>
+        <w:rPr>
+          <w:rFonts w:ascii="Times New Roman" w:hAnsi="Times New Roman" w:cs="Times New Roman"/>
+        </w:rPr>
+      </w:pPr>
+      <w:proofErr w:type="spellStart"/>
+      <w:r>
+        <w:rPr>
+          <w:rFonts w:ascii="Times New Roman" w:hAnsi="Times New Roman" w:cs="Times New Roman"/>
+        </w:rPr>
+        <w:t>gcloud</w:t>
+      </w:r>
+      <w:proofErr w:type="spellEnd"/>
+      <w:r>
+        <w:rPr>
+          <w:rFonts w:ascii="Times New Roman" w:hAnsi="Times New Roman" w:cs="Times New Roman"/>
+        </w:rPr>
+        <w:t xml:space="preserve"> </w:t>
+      </w:r>
+      <w:proofErr w:type="spellStart"/>
+      <w:r>
+        <w:rPr>
+          <w:rFonts w:ascii="Times New Roman" w:hAnsi="Times New Roman" w:cs="Times New Roman"/>
+        </w:rPr>
+        <w:t>iam</w:t>
+      </w:r>
+      <w:proofErr w:type="spellEnd"/>
+      <w:r>
+        <w:rPr>
+          <w:rFonts w:ascii="Times New Roman" w:hAnsi="Times New Roman" w:cs="Times New Roman"/>
+        </w:rPr>
+        <w:t xml:space="preserve"> service-accounts list</w:t>
+      </w:r>
+    </w:p>
+    <w:p>
+      <w:pPr>
+        <w:spacing w:line="240" w:lineRule="auto"/>
+        <w:rPr>
+          <w:rFonts w:ascii="Times New Roman" w:hAnsi="Times New Roman" w:cs="Times New Roman"/>
+        </w:rPr>
+      </w:pPr>
+    </w:p>
+    <w:p>
+      <w:pPr>
+        <w:spacing w:line="240" w:lineRule="auto"/>
+        <w:rPr>
+          <w:rFonts w:ascii="Times New Roman" w:hAnsi="Times New Roman" w:cs="Times New Roman"/>
+        </w:rPr>
+      </w:pPr>
+      <w:r>
+        <w:rPr>
+          <w:rFonts w:ascii="Times New Roman" w:hAnsi="Times New Roman" w:cs="Times New Roman"/>
+        </w:rPr>
+        <w:t># Check buckets</w:t>
+      </w:r>
+    </w:p>
+    <w:p>
+      <w:pPr>
+        <w:spacing w:line="240" w:lineRule="auto"/>
+        <w:rPr>
+          <w:rFonts w:ascii="Times New Roman" w:hAnsi="Times New Roman" w:cs="Times New Roman"/>
+        </w:rPr>
+      </w:pPr>
+      <w:proofErr w:type="spellStart"/>
+      <w:r>
+        <w:rPr>
+          <w:rFonts w:ascii="Times New Roman" w:hAnsi="Times New Roman" w:cs="Times New Roman"/>
+        </w:rPr>
+        <w:t>gcloud</w:t>
+      </w:r>
+      <w:proofErr w:type="spellEnd"/>
+      <w:r>
+        <w:rPr>
+          <w:rFonts w:ascii="Times New Roman" w:hAnsi="Times New Roman" w:cs="Times New Roman"/>
+        </w:rPr>
+        <w:t xml:space="preserve"> storage ls</w:t>
+      </w:r>
+    </w:p>
+    <w:p>
+      <w:pPr>
+        <w:spacing w:line="240" w:lineRule="auto"/>
+        <w:rPr>
+          <w:rFonts w:ascii="Times New Roman" w:hAnsi="Times New Roman" w:cs="Times New Roman"/>
+        </w:rPr>
+      </w:pPr>
+    </w:p>
+    <w:p>
+      <w:pPr>
+        <w:spacing w:line="240" w:lineRule="auto"/>
+        <w:rPr>
+          <w:rFonts w:ascii="Times New Roman" w:hAnsi="Times New Roman" w:cs="Times New Roman"/>
+        </w:rPr>
+      </w:pPr>
+      <w:r>
+        <w:rPr>
+          <w:rFonts w:ascii="Times New Roman" w:hAnsi="Times New Roman" w:cs="Times New Roman"/>
+        </w:rPr>
+        <w:t># Check all 9 files in raw/</w:t>
+      </w:r>
+    </w:p>
+    <w:p>
+      <w:pPr>
+        <w:spacing w:line="240" w:lineRule="auto"/>
+        <w:rPr>
+          <w:rFonts w:ascii="Times New Roman" w:hAnsi="Times New Roman" w:cs="Times New Roman"/>
+        </w:rPr>
+      </w:pPr>
+      <w:proofErr w:type="spellStart"/>
+      <w:r>
+        <w:rPr>
+          <w:rFonts w:ascii="Times New Roman" w:hAnsi="Times New Roman" w:cs="Times New Roman"/>
+        </w:rPr>
+        <w:t>gcloud</w:t>
+      </w:r>
+      <w:proofErr w:type="spellEnd"/>
+      <w:r>
+        <w:rPr>
+          <w:rFonts w:ascii="Times New Roman" w:hAnsi="Times New Roman" w:cs="Times New Roman"/>
+        </w:rPr>
+        <w:t xml:space="preserve"> storage ls gs://${BUCKET_NAME}/raw/ | </w:t>
+      </w:r>
+      <w:proofErr w:type="spellStart"/>
+      <w:r>
+        <w:rPr>
+          <w:rFonts w:ascii="Times New Roman" w:hAnsi="Times New Roman" w:cs="Times New Roman"/>
+        </w:rPr>
+        <w:t>wc</w:t>
+      </w:r>
+      <w:proofErr w:type="spellEnd"/>
+      <w:r>
+        <w:rPr>
+          <w:rFonts w:ascii="Times New Roman" w:hAnsi="Times New Roman" w:cs="Times New Roman"/>
+        </w:rPr>
+        <w:t xml:space="preserve"> -l   # should print 11 (9 CSVs + 2 .keep files)</w:t>
+      </w:r>
+    </w:p>
+    <w:p>
+      <w:pPr>
+        <w:spacing w:line="240" w:lineRule="auto"/>
+        <w:rPr>
+          <w:rFonts w:ascii="Times New Roman" w:hAnsi="Times New Roman" w:cs="Times New Roman"/>
+        </w:rPr>
+      </w:pPr>
+    </w:p>
+    <w:p>
+      <w:pPr>
+        <w:spacing w:line="240" w:lineRule="auto"/>
+        <w:rPr>
+          <w:rFonts w:ascii="Times New Roman" w:hAnsi="Times New Roman" w:cs="Times New Roman"/>
+        </w:rPr>
+      </w:pPr>
+      <w:r>
+        <w:rPr>
+          <w:rFonts w:ascii="Times New Roman" w:hAnsi="Times New Roman" w:cs="Times New Roman"/>
+        </w:rPr>
+        <w:t># Check IAM bindings on project</w:t>
+      </w:r>
+    </w:p>
+    <w:p>
+      <w:pPr>
+        <w:spacing w:line="240" w:lineRule="auto"/>
+        <w:rPr>
+          <w:rFonts w:ascii="Times New Roman" w:hAnsi="Times New Roman" w:cs="Times New Roman"/>
+        </w:rPr>
+      </w:pPr>
+      <w:proofErr w:type="spellStart"/>
+      <w:r>
+        <w:rPr>
+          <w:rFonts w:ascii="Times New Roman" w:hAnsi="Times New Roman" w:cs="Times New Roman"/>
+        </w:rPr>
+        <w:t>gcloud</w:t>
+      </w:r>
+      <w:proofErr w:type="spellEnd"/>
+      <w:r>
+        <w:rPr>
+          <w:rFonts w:ascii="Times New Roman" w:hAnsi="Times New Roman" w:cs="Times New Roman"/>
+        </w:rPr>
+        <w:t xml:space="preserve"> projects get-</w:t>
+      </w:r>
+      <w:proofErr w:type="spellStart"/>
+      <w:r>
+        <w:rPr>
+          <w:rFonts w:ascii="Times New Roman" w:hAnsi="Times New Roman" w:cs="Times New Roman"/>
+        </w:rPr>
+        <w:t>iam</w:t>
+      </w:r>
+      <w:proofErr w:type="spellEnd"/>
+      <w:r>
+        <w:rPr>
+          <w:rFonts w:ascii="Times New Roman" w:hAnsi="Times New Roman" w:cs="Times New Roman"/>
+        </w:rPr>
+        <w:t>-policy $PROJECT_ID \</w:t>
+      </w:r>
+    </w:p>
+    <w:p>
+      <w:pPr>
+        <w:spacing w:line="240" w:lineRule="auto"/>
+        <w:rPr>
+          <w:rFonts w:ascii="Times New Roman" w:hAnsi="Times New Roman" w:cs="Times New Roman"/>
+        </w:rPr>
+      </w:pPr>
+      <w:r>
+        <w:rPr>
+          <w:rFonts w:ascii="Times New Roman" w:hAnsi="Times New Roman" w:cs="Times New Roman"/>
+        </w:rPr>
+        <w:lastRenderedPageBreak/>
+        <w:t>  --flatten="bindings[].members" \</w:t>
+      </w:r>
+    </w:p>
+    <w:p>
+      <w:pPr>
+        <w:spacing w:line="240" w:lineRule="auto"/>
+        <w:rPr>
+          <w:rFonts w:ascii="Times New Roman" w:hAnsi="Times New Roman" w:cs="Times New Roman"/>
+        </w:rPr>
+      </w:pPr>
+      <w:r>
+        <w:rPr>
+          <w:rFonts w:ascii="Times New Roman" w:hAnsi="Times New Roman" w:cs="Times New Roman"/>
+        </w:rPr>
+        <w:t>  --filter="</w:t>
+      </w:r>
+      <w:proofErr w:type="spellStart"/>
+      <w:r>
+        <w:rPr>
+          <w:rFonts w:ascii="Times New Roman" w:hAnsi="Times New Roman" w:cs="Times New Roman"/>
+        </w:rPr>
+        <w:t>bindings.members</w:t>
+      </w:r>
+      <w:proofErr w:type="spellEnd"/>
+      <w:r>
+        <w:rPr>
+          <w:rFonts w:ascii="Times New Roman" w:hAnsi="Times New Roman" w:cs="Times New Roman"/>
+        </w:rPr>
+        <w:t>:${SA_EMAIL}" \</w:t>
+      </w:r>
+    </w:p>
+    <w:p>
+      <w:pPr>
+        <w:spacing w:line="240" w:lineRule="auto"/>
+        <w:rPr>
+          <w:rFonts w:ascii="Times New Roman" w:hAnsi="Times New Roman" w:cs="Times New Roman"/>
+        </w:rPr>
+      </w:pPr>
+      <w:r>
+        <w:rPr>
+          <w:rFonts w:ascii="Times New Roman" w:hAnsi="Times New Roman" w:cs="Times New Roman"/>
+        </w:rPr>
+        <w:t>  --format="table(</w:t>
+      </w:r>
+      <w:proofErr w:type="spellStart"/>
+      <w:r>
+        <w:rPr>
+          <w:rFonts w:ascii="Times New Roman" w:hAnsi="Times New Roman" w:cs="Times New Roman"/>
+        </w:rPr>
+        <w:t>bindings.role</w:t>
+      </w:r>
+      <w:proofErr w:type="spellEnd"/>
+      <w:r>
+        <w:rPr>
+          <w:rFonts w:ascii="Times New Roman" w:hAnsi="Times New Roman" w:cs="Times New Roman"/>
+        </w:rPr>
+        <w:t>)"</w:t>
+      </w:r>
+    </w:p>
+    <w:p>
+      <w:pPr>
+        <w:spacing w:line="240" w:lineRule="auto"/>
+        <w:rPr>
+          <w:rFonts w:ascii="Times New Roman" w:hAnsi="Times New Roman" w:cs="Times New Roman"/>
+        </w:rPr>
+      </w:pPr>
+      <w:r>
+        <w:rPr>
+          <w:rFonts w:ascii="Times New Roman" w:hAnsi="Times New Roman" w:cs="Times New Roman"/>
+        </w:rPr>
+        <w:t>```</w:t>
+      </w:r>
+    </w:p>
+    <w:p>
+      <w:pPr>
+        <w:spacing w:line="240" w:lineRule="auto"/>
+        <w:rPr>
+          <w:rFonts w:ascii="Times New Roman" w:hAnsi="Times New Roman" w:cs="Times New Roman"/>
+        </w:rPr>
+      </w:pPr>
+    </w:p>
+    <w:p>
+      <w:pPr>
+        <w:spacing w:line="240" w:lineRule="auto"/>
+        <w:rPr>
+          <w:rFonts w:ascii="Times New Roman" w:hAnsi="Times New Roman" w:cs="Times New Roman"/>
+        </w:rPr>
+      </w:pPr>
     </w:p>
     <w:sectPr>
       <w:pgSz w:w="11906" w:h="16838"/>

</xml_diff>